<commit_message>
Document hyperparameter sweep of the RAM+aux classifier (10.5.6)
Six configurations (learning rate, weight decay, head width, and full
4x-capacity "long preset") trained on cnn_ram_aux.py, selected by
validation AUC decided before training to avoid picking a winner by
test-set performance. All six land within a 0.0039 validation AUC band
(0.9268-0.9307), inside this dataset's established single-seed noise floor
-- no configuration is a genuine improvement over the existing default.

Notable methodological result: the 4x-larger configuration scored LOWER
on validation than the 310K-parameter default despite scoring higher on
test, directly illustrating why selection was fixed to validation ahead of
time, and reinforcing that this task is information-limited rather than
capacity-limited (Section 8.1). Regenerated report.docx from the updated
report.md.

Co-Authored-By: Claude Sonnet 5 <noreply@anthropic.com>
</commit_message>
<xml_diff>
--- a/report.docx
+++ b/report.docx
@@ -15259,6 +15259,760 @@
         <w:t xml:space="preserve">pairing rather than assumed from this result.</w:t>
       </w:r>
     </w:p>
+    <w:p>
+      <w:pPr>
+        <w:pStyle w:val="BodyText"/>
+      </w:pPr>
+      <w:r>
+        <w:rPr>
+          <w:b/>
+          <w:bCs/>
+        </w:rPr>
+        <w:t xml:space="preserve">10.5.6 A hyperparameter sweep of the RAM-plus-amplitude classifier</w:t>
+      </w:r>
+      <w:r>
+        <w:rPr>
+          <w:b/>
+          <w:bCs/>
+        </w:rPr>
+        <w:t xml:space="preserve"> </w:t>
+      </w:r>
+      <w:r>
+        <w:rPr>
+          <w:b/>
+          <w:bCs/>
+        </w:rPr>
+        <w:t xml:space="preserve">(</w:t>
+      </w:r>
+      <w:r>
+        <w:rPr>
+          <w:rStyle w:val="VerbatimChar"/>
+          <w:b/>
+          <w:bCs/>
+        </w:rPr>
+        <w:t xml:space="preserve">cnn_ram_aux.py</w:t>
+      </w:r>
+      <w:r>
+        <w:rPr>
+          <w:b/>
+          <w:bCs/>
+        </w:rPr>
+        <w:t xml:space="preserve">) produced no distinguishable improvement over the</w:t>
+      </w:r>
+      <w:r>
+        <w:rPr>
+          <w:b/>
+          <w:bCs/>
+        </w:rPr>
+        <w:t xml:space="preserve"> </w:t>
+      </w:r>
+      <w:r>
+        <w:rPr>
+          <w:b/>
+          <w:bCs/>
+        </w:rPr>
+        <w:t xml:space="preserve">established defaults.</w:t>
+      </w:r>
+      <w:r>
+        <w:t xml:space="preserve"> </w:t>
+      </w:r>
+      <w:r>
+        <w:t xml:space="preserve">Six configurations were trained: the established</w:t>
+      </w:r>
+      <w:r>
+        <w:t xml:space="preserve"> </w:t>
+      </w:r>
+      <w:r>
+        <w:t xml:space="preserve">default (learning rate 2e-4, weight decay 3e-2, dropout 0.6/0.4, head width</w:t>
+      </w:r>
+      <w:r>
+        <w:t xml:space="preserve"> </w:t>
+      </w:r>
+      <w:r>
+        <w:t xml:space="preserve">32, three residual stages), two alternative learning rates (1e-4, 3e-4), a</w:t>
+      </w:r>
+      <w:r>
+        <w:t xml:space="preserve"> </w:t>
+      </w:r>
+      <w:r>
+        <w:t xml:space="preserve">lower weight decay (1e-2), a wider head alone (width 64, three stages), and</w:t>
+      </w:r>
+      <w:r>
+        <w:t xml:space="preserve"> </w:t>
+      </w:r>
+      <w:r>
+        <w:t xml:space="preserve">the original</w:t>
+      </w:r>
+      <w:r>
+        <w:t xml:space="preserve"> </w:t>
+      </w:r>
+      <w:r>
+        <w:t xml:space="preserve">“long”</w:t>
+      </w:r>
+      <w:r>
+        <w:t xml:space="preserve"> </w:t>
+      </w:r>
+      <w:r>
+        <w:t xml:space="preserve">preset’s full capacity (four stages, dropout 0.5/0.3,</w:t>
+      </w:r>
+      <w:r>
+        <w:t xml:space="preserve"> </w:t>
+      </w:r>
+      <w:r>
+        <w:t xml:space="preserve">head width 64 — approximately four times the parameter count). Selection</w:t>
+      </w:r>
+      <w:r>
+        <w:t xml:space="preserve"> </w:t>
+      </w:r>
+      <w:r>
+        <w:t xml:space="preserve">was made on validation AUC, decided before training began, specifically to</w:t>
+      </w:r>
+      <w:r>
+        <w:t xml:space="preserve"> </w:t>
+      </w:r>
+      <w:r>
+        <w:t xml:space="preserve">avoid selecting a configuration by its test-set performance across multiple</w:t>
+      </w:r>
+      <w:r>
+        <w:t xml:space="preserve"> </w:t>
+      </w:r>
+      <w:r>
+        <w:t xml:space="preserve">candidates.</w:t>
+      </w:r>
+    </w:p>
+    <w:tbl>
+      <w:tblPr>
+        <w:tblStyle w:val="Table"/>
+        <w:tblW w:type="pct" w:w="5000"/>
+        <w:tblLayout w:type="fixed"/>
+        <w:tblLook w:firstRow="1" w:lastRow="0" w:firstColumn="0" w:lastColumn="0" w:noHBand="0" w:noVBand="0" w:val="0020"/>
+      </w:tblPr>
+      <w:tblGrid>
+        <w:gridCol w:w="1320"/>
+        <w:gridCol w:w="1320"/>
+        <w:gridCol w:w="1320"/>
+        <w:gridCol w:w="1320"/>
+        <w:gridCol w:w="1320"/>
+        <w:gridCol w:w="1320"/>
+      </w:tblGrid>
+      <w:tr>
+        <w:trPr>
+          <w:tblHeader w:val="on"/>
+        </w:trPr>
+        <w:tc>
+          <w:tcPr/>
+          <w:p>
+            <w:pPr>
+              <w:pStyle w:val="Compact"/>
+            </w:pPr>
+            <w:r>
+              <w:t xml:space="preserve">Configuration</w:t>
+            </w:r>
+          </w:p>
+        </w:tc>
+        <w:tc>
+          <w:tcPr/>
+          <w:p>
+            <w:pPr>
+              <w:pStyle w:val="Compact"/>
+            </w:pPr>
+            <w:r>
+              <w:t xml:space="preserve">Parameters</w:t>
+            </w:r>
+          </w:p>
+        </w:tc>
+        <w:tc>
+          <w:tcPr/>
+          <w:p>
+            <w:pPr>
+              <w:pStyle w:val="Compact"/>
+            </w:pPr>
+            <w:r>
+              <w:t xml:space="preserve">Validation AUC</w:t>
+            </w:r>
+          </w:p>
+        </w:tc>
+        <w:tc>
+          <w:tcPr/>
+          <w:p>
+            <w:pPr>
+              <w:pStyle w:val="Compact"/>
+            </w:pPr>
+            <w:r>
+              <w:t xml:space="preserve">Test AUC</w:t>
+            </w:r>
+          </w:p>
+        </w:tc>
+        <w:tc>
+          <w:tcPr/>
+          <w:p>
+            <w:pPr>
+              <w:pStyle w:val="Compact"/>
+            </w:pPr>
+            <w:r>
+              <w:t xml:space="preserve">Test MCC</w:t>
+            </w:r>
+          </w:p>
+        </w:tc>
+        <w:tc>
+          <w:tcPr/>
+          <w:p>
+            <w:pPr>
+              <w:pStyle w:val="Compact"/>
+            </w:pPr>
+            <w:r>
+              <w:t xml:space="preserve">Test accuracy</w:t>
+            </w:r>
+          </w:p>
+        </w:tc>
+      </w:tr>
+      <w:tr>
+        <w:tc>
+          <w:tcPr/>
+          <w:p>
+            <w:pPr>
+              <w:pStyle w:val="Compact"/>
+            </w:pPr>
+            <w:r>
+              <w:t xml:space="preserve">Default</w:t>
+            </w:r>
+          </w:p>
+        </w:tc>
+        <w:tc>
+          <w:tcPr/>
+          <w:p>
+            <w:pPr>
+              <w:pStyle w:val="Compact"/>
+            </w:pPr>
+            <w:r>
+              <w:t xml:space="preserve">309,777</w:t>
+            </w:r>
+          </w:p>
+        </w:tc>
+        <w:tc>
+          <w:tcPr/>
+          <w:p>
+            <w:pPr>
+              <w:pStyle w:val="Compact"/>
+            </w:pPr>
+            <w:r>
+              <w:t xml:space="preserve">0.9302</w:t>
+            </w:r>
+          </w:p>
+        </w:tc>
+        <w:tc>
+          <w:tcPr/>
+          <w:p>
+            <w:pPr>
+              <w:pStyle w:val="Compact"/>
+            </w:pPr>
+            <w:r>
+              <w:t xml:space="preserve">0.9230</w:t>
+            </w:r>
+          </w:p>
+        </w:tc>
+        <w:tc>
+          <w:tcPr/>
+          <w:p>
+            <w:pPr>
+              <w:pStyle w:val="Compact"/>
+            </w:pPr>
+            <w:r>
+              <w:t xml:space="preserve">0.7018</w:t>
+            </w:r>
+          </w:p>
+        </w:tc>
+        <w:tc>
+          <w:tcPr/>
+          <w:p>
+            <w:pPr>
+              <w:pStyle w:val="Compact"/>
+            </w:pPr>
+            <w:r>
+              <w:t xml:space="preserve">84.79 %</w:t>
+            </w:r>
+          </w:p>
+        </w:tc>
+      </w:tr>
+      <w:tr>
+        <w:tc>
+          <w:tcPr/>
+          <w:p>
+            <w:pPr>
+              <w:pStyle w:val="Compact"/>
+            </w:pPr>
+            <w:r>
+              <w:t xml:space="preserve">Learning rate 3e-4</w:t>
+            </w:r>
+          </w:p>
+        </w:tc>
+        <w:tc>
+          <w:tcPr/>
+          <w:p>
+            <w:pPr>
+              <w:pStyle w:val="Compact"/>
+            </w:pPr>
+            <w:r>
+              <w:t xml:space="preserve">309,777</w:t>
+            </w:r>
+          </w:p>
+        </w:tc>
+        <w:tc>
+          <w:tcPr/>
+          <w:p>
+            <w:pPr>
+              <w:pStyle w:val="Compact"/>
+            </w:pPr>
+            <w:r>
+              <w:rPr>
+                <w:b/>
+                <w:bCs/>
+              </w:rPr>
+              <w:t xml:space="preserve">0.9307</w:t>
+            </w:r>
+          </w:p>
+        </w:tc>
+        <w:tc>
+          <w:tcPr/>
+          <w:p>
+            <w:pPr>
+              <w:pStyle w:val="Compact"/>
+            </w:pPr>
+            <w:r>
+              <w:t xml:space="preserve">0.9268</w:t>
+            </w:r>
+          </w:p>
+        </w:tc>
+        <w:tc>
+          <w:tcPr/>
+          <w:p>
+            <w:pPr>
+              <w:pStyle w:val="Compact"/>
+            </w:pPr>
+            <w:r>
+              <w:t xml:space="preserve">0.7137</w:t>
+            </w:r>
+          </w:p>
+        </w:tc>
+        <w:tc>
+          <w:tcPr/>
+          <w:p>
+            <w:pPr>
+              <w:pStyle w:val="Compact"/>
+            </w:pPr>
+            <w:r>
+              <w:t xml:space="preserve">85.28 %</w:t>
+            </w:r>
+          </w:p>
+        </w:tc>
+      </w:tr>
+      <w:tr>
+        <w:tc>
+          <w:tcPr/>
+          <w:p>
+            <w:pPr>
+              <w:pStyle w:val="Compact"/>
+            </w:pPr>
+            <w:r>
+              <w:t xml:space="preserve">Weight decay 1e-2</w:t>
+            </w:r>
+          </w:p>
+        </w:tc>
+        <w:tc>
+          <w:tcPr/>
+          <w:p>
+            <w:pPr>
+              <w:pStyle w:val="Compact"/>
+            </w:pPr>
+            <w:r>
+              <w:t xml:space="preserve">309,777</w:t>
+            </w:r>
+          </w:p>
+        </w:tc>
+        <w:tc>
+          <w:tcPr/>
+          <w:p>
+            <w:pPr>
+              <w:pStyle w:val="Compact"/>
+            </w:pPr>
+            <w:r>
+              <w:t xml:space="preserve">0.9301</w:t>
+            </w:r>
+          </w:p>
+        </w:tc>
+        <w:tc>
+          <w:tcPr/>
+          <w:p>
+            <w:pPr>
+              <w:pStyle w:val="Compact"/>
+            </w:pPr>
+            <w:r>
+              <w:t xml:space="preserve">0.9228</w:t>
+            </w:r>
+          </w:p>
+        </w:tc>
+        <w:tc>
+          <w:tcPr/>
+          <w:p>
+            <w:pPr>
+              <w:pStyle w:val="Compact"/>
+            </w:pPr>
+            <w:r>
+              <w:t xml:space="preserve">0.7013</w:t>
+            </w:r>
+          </w:p>
+        </w:tc>
+        <w:tc>
+          <w:tcPr/>
+          <w:p>
+            <w:pPr>
+              <w:pStyle w:val="Compact"/>
+            </w:pPr>
+            <w:r>
+              <w:t xml:space="preserve">84.77 %</w:t>
+            </w:r>
+          </w:p>
+        </w:tc>
+      </w:tr>
+      <w:tr>
+        <w:tc>
+          <w:tcPr/>
+          <w:p>
+            <w:pPr>
+              <w:pStyle w:val="Compact"/>
+            </w:pPr>
+            <w:r>
+              <w:t xml:space="preserve">Learning rate 1e-4</w:t>
+            </w:r>
+          </w:p>
+        </w:tc>
+        <w:tc>
+          <w:tcPr/>
+          <w:p>
+            <w:pPr>
+              <w:pStyle w:val="Compact"/>
+            </w:pPr>
+            <w:r>
+              <w:t xml:space="preserve">309,777</w:t>
+            </w:r>
+          </w:p>
+        </w:tc>
+        <w:tc>
+          <w:tcPr/>
+          <w:p>
+            <w:pPr>
+              <w:pStyle w:val="Compact"/>
+            </w:pPr>
+            <w:r>
+              <w:t xml:space="preserve">0.9287</w:t>
+            </w:r>
+          </w:p>
+        </w:tc>
+        <w:tc>
+          <w:tcPr/>
+          <w:p>
+            <w:pPr>
+              <w:pStyle w:val="Compact"/>
+            </w:pPr>
+            <w:r>
+              <w:t xml:space="preserve">0.9224</w:t>
+            </w:r>
+          </w:p>
+        </w:tc>
+        <w:tc>
+          <w:tcPr/>
+          <w:p>
+            <w:pPr>
+              <w:pStyle w:val="Compact"/>
+            </w:pPr>
+            <w:r>
+              <w:t xml:space="preserve">0.7040</w:t>
+            </w:r>
+          </w:p>
+        </w:tc>
+        <w:tc>
+          <w:tcPr/>
+          <w:p>
+            <w:pPr>
+              <w:pStyle w:val="Compact"/>
+            </w:pPr>
+            <w:r>
+              <w:t xml:space="preserve">84.96 %</w:t>
+            </w:r>
+          </w:p>
+        </w:tc>
+      </w:tr>
+      <w:tr>
+        <w:tc>
+          <w:tcPr/>
+          <w:p>
+            <w:pPr>
+              <w:pStyle w:val="Compact"/>
+            </w:pPr>
+            <w:r>
+              <w:t xml:space="preserve">Four stages, wider head (4× capacity)</w:t>
+            </w:r>
+          </w:p>
+        </w:tc>
+        <w:tc>
+          <w:tcPr/>
+          <w:p>
+            <w:pPr>
+              <w:pStyle w:val="Compact"/>
+            </w:pPr>
+            <w:r>
+              <w:t xml:space="preserve">1,249,425</w:t>
+            </w:r>
+          </w:p>
+        </w:tc>
+        <w:tc>
+          <w:tcPr/>
+          <w:p>
+            <w:pPr>
+              <w:pStyle w:val="Compact"/>
+            </w:pPr>
+            <w:r>
+              <w:t xml:space="preserve">0.9287</w:t>
+            </w:r>
+          </w:p>
+        </w:tc>
+        <w:tc>
+          <w:tcPr/>
+          <w:p>
+            <w:pPr>
+              <w:pStyle w:val="Compact"/>
+            </w:pPr>
+            <w:r>
+              <w:t xml:space="preserve">0.9302</w:t>
+            </w:r>
+          </w:p>
+        </w:tc>
+        <w:tc>
+          <w:tcPr/>
+          <w:p>
+            <w:pPr>
+              <w:pStyle w:val="Compact"/>
+            </w:pPr>
+            <w:r>
+              <w:t xml:space="preserve">0.7235</w:t>
+            </w:r>
+          </w:p>
+        </w:tc>
+        <w:tc>
+          <w:tcPr/>
+          <w:p>
+            <w:pPr>
+              <w:pStyle w:val="Compact"/>
+            </w:pPr>
+            <w:r>
+              <w:t xml:space="preserve">86.13 %</w:t>
+            </w:r>
+          </w:p>
+        </w:tc>
+      </w:tr>
+      <w:tr>
+        <w:tc>
+          <w:tcPr/>
+          <w:p>
+            <w:pPr>
+              <w:pStyle w:val="Compact"/>
+            </w:pPr>
+            <w:r>
+              <w:t xml:space="preserve">Wider head only (three stages)</w:t>
+            </w:r>
+          </w:p>
+        </w:tc>
+        <w:tc>
+          <w:tcPr/>
+          <w:p>
+            <w:pPr>
+              <w:pStyle w:val="Compact"/>
+            </w:pPr>
+            <w:r>
+              <w:t xml:space="preserve">314,001</w:t>
+            </w:r>
+          </w:p>
+        </w:tc>
+        <w:tc>
+          <w:tcPr/>
+          <w:p>
+            <w:pPr>
+              <w:pStyle w:val="Compact"/>
+            </w:pPr>
+            <w:r>
+              <w:t xml:space="preserve">0.9268</w:t>
+            </w:r>
+          </w:p>
+        </w:tc>
+        <w:tc>
+          <w:tcPr/>
+          <w:p>
+            <w:pPr>
+              <w:pStyle w:val="Compact"/>
+            </w:pPr>
+            <w:r>
+              <w:t xml:space="preserve">0.9270</w:t>
+            </w:r>
+          </w:p>
+        </w:tc>
+        <w:tc>
+          <w:tcPr/>
+          <w:p>
+            <w:pPr>
+              <w:pStyle w:val="Compact"/>
+            </w:pPr>
+            <w:r>
+              <w:t xml:space="preserve">0.7054</w:t>
+            </w:r>
+          </w:p>
+        </w:tc>
+        <w:tc>
+          <w:tcPr/>
+          <w:p>
+            <w:pPr>
+              <w:pStyle w:val="Compact"/>
+            </w:pPr>
+            <w:r>
+              <w:t xml:space="preserve">85.17 %</w:t>
+            </w:r>
+          </w:p>
+        </w:tc>
+      </w:tr>
+    </w:tbl>
+    <w:p>
+      <w:pPr>
+        <w:pStyle w:val="BodyText"/>
+      </w:pPr>
+      <w:r>
+        <w:t xml:space="preserve">All six configurations fall within a validation AUC band of</w:t>
+      </w:r>
+      <w:r>
+        <w:t xml:space="preserve"> </w:t>
+      </w:r>
+      <w:r>
+        <w:t xml:space="preserve">0.9268–0.9307 — a spread of 0.0039, well inside the approximately 1–2 point</w:t>
+      </w:r>
+      <w:r>
+        <w:t xml:space="preserve"> </w:t>
+      </w:r>
+      <w:r>
+        <w:t xml:space="preserve">noise floor already established for single-seed measurements on this</w:t>
+      </w:r>
+      <w:r>
+        <w:t xml:space="preserve"> </w:t>
+      </w:r>
+      <w:r>
+        <w:t xml:space="preserve">dataset (Section 9). The nominal winner by the pre-specified selection rule</w:t>
+      </w:r>
+      <w:r>
+        <w:t xml:space="preserve"> </w:t>
+      </w:r>
+      <w:r>
+        <w:t xml:space="preserve">(learning rate 3e-4, val AUC 0.9307) exceeds the default by 0.0005, which is</w:t>
+      </w:r>
+      <w:r>
+        <w:t xml:space="preserve"> </w:t>
+      </w:r>
+      <w:r>
+        <w:t xml:space="preserve">not distinguishable from noise and should not be reported as a genuine</w:t>
+      </w:r>
+      <w:r>
+        <w:t xml:space="preserve"> </w:t>
+      </w:r>
+      <w:r>
+        <w:t xml:space="preserve">improvement. One result is worth noting for methodological reasons rather</w:t>
+      </w:r>
+      <w:r>
+        <w:t xml:space="preserve"> </w:t>
+      </w:r>
+      <w:r>
+        <w:t xml:space="preserve">than performance: the four-times-larger configuration scored</w:t>
+      </w:r>
+      <w:r>
+        <w:t xml:space="preserve"> </w:t>
+      </w:r>
+      <w:r>
+        <w:rPr>
+          <w:i/>
+          <w:iCs/>
+        </w:rPr>
+        <w:t xml:space="preserve">lower</w:t>
+      </w:r>
+      <w:r>
+        <w:t xml:space="preserve"> </w:t>
+      </w:r>
+      <w:r>
+        <w:t xml:space="preserve">on</w:t>
+      </w:r>
+      <w:r>
+        <w:t xml:space="preserve"> </w:t>
+      </w:r>
+      <w:r>
+        <w:t xml:space="preserve">validation AUC (0.9287) than the 310,000-parameter default despite scoring</w:t>
+      </w:r>
+      <w:r>
+        <w:t xml:space="preserve"> </w:t>
+      </w:r>
+      <w:r>
+        <w:t xml:space="preserve">higher on test AUC (0.9302) — a direct illustration of why selection was</w:t>
+      </w:r>
+      <w:r>
+        <w:t xml:space="preserve"> </w:t>
+      </w:r>
+      <w:r>
+        <w:t xml:space="preserve">fixed to validation performance before training began, and further evidence</w:t>
+      </w:r>
+      <w:r>
+        <w:t xml:space="preserve"> </w:t>
+      </w:r>
+      <w:r>
+        <w:t xml:space="preserve">that this task is limited by available information rather than by model</w:t>
+      </w:r>
+      <w:r>
+        <w:t xml:space="preserve"> </w:t>
+      </w:r>
+      <w:r>
+        <w:t xml:space="preserve">capacity, consistent with the diagnosis in Section 8.1.</w:t>
+      </w:r>
+      <w:r>
+        <w:t xml:space="preserve"> </w:t>
+      </w:r>
+      <w:r>
+        <w:rPr>
+          <w:b/>
+          <w:bCs/>
+        </w:rPr>
+        <w:t xml:space="preserve">On the evidence</w:t>
+      </w:r>
+      <w:r>
+        <w:rPr>
+          <w:b/>
+          <w:bCs/>
+        </w:rPr>
+        <w:t xml:space="preserve"> </w:t>
+      </w:r>
+      <w:r>
+        <w:rPr>
+          <w:b/>
+          <w:bCs/>
+        </w:rPr>
+        <w:t xml:space="preserve">gathered, hyperparameter tuning is not a productive direction for this</w:t>
+      </w:r>
+      <w:r>
+        <w:rPr>
+          <w:b/>
+          <w:bCs/>
+        </w:rPr>
+        <w:t xml:space="preserve"> </w:t>
+      </w:r>
+      <w:r>
+        <w:rPr>
+          <w:b/>
+          <w:bCs/>
+        </w:rPr>
+        <w:t xml:space="preserve">model; the established default configuration should be retained.</w:t>
+      </w:r>
+    </w:p>
     <w:bookmarkEnd w:id="40"/>
     <w:bookmarkStart w:id="41" w:name="updated-limitations-and-recommendations"/>
     <w:p>
@@ -16352,6 +17106,51 @@
           <w:rStyle w:val="AttributeTok"/>
         </w:rPr>
         <w:t xml:space="preserve">--no-aux</w:t>
+      </w:r>
+      <w:r>
+        <w:br/>
+      </w:r>
+      <w:r>
+        <w:rPr>
+          <w:rStyle w:val="ExtensionTok"/>
+        </w:rPr>
+        <w:t xml:space="preserve">python</w:t>
+      </w:r>
+      <w:r>
+        <w:rPr>
+          <w:rStyle w:val="NormalTok"/>
+        </w:rPr>
+        <w:t xml:space="preserve"> cnn_ram_aux.py </w:t>
+      </w:r>
+      <w:r>
+        <w:rPr>
+          <w:rStyle w:val="AttributeTok"/>
+        </w:rPr>
+        <w:t xml:space="preserve">--dataset-dir</w:t>
+      </w:r>
+      <w:r>
+        <w:rPr>
+          <w:rStyle w:val="NormalTok"/>
+        </w:rPr>
+        <w:t xml:space="preserve"> ../../data_downloader/dataset_ramaux_6s </w:t>
+      </w:r>
+      <w:r>
+        <w:rPr>
+          <w:rStyle w:val="AttributeTok"/>
+        </w:rPr>
+        <w:t xml:space="preserve">--lr</w:t>
+      </w:r>
+      <w:r>
+        <w:rPr>
+          <w:rStyle w:val="NormalTok"/>
+        </w:rPr>
+        <w:t xml:space="preserve"> 3e-4   </w:t>
+      </w:r>
+      <w:r>
+        <w:rPr>
+          <w:rStyle w:val="CommentTok"/>
+        </w:rPr>
+        <w:t xml:space="preserve"># hyperparameter sweep (Section 10.5.6)</w:t>
       </w:r>
       <w:r>
         <w:br/>

</xml_diff>

<commit_message>
Regenerate report.docx with the spectrogram+aux section (10.5.7)
Co-Authored-By: Claude Sonnet 5 <noreply@anthropic.com>
</commit_message>
<xml_diff>
--- a/report.docx
+++ b/report.docx
@@ -16013,6 +16013,741 @@
         <w:t xml:space="preserve">model; the established default configuration should be retained.</w:t>
       </w:r>
     </w:p>
+    <w:p>
+      <w:pPr>
+        <w:pStyle w:val="BodyText"/>
+      </w:pPr>
+      <w:r>
+        <w:rPr>
+          <w:b/>
+          <w:bCs/>
+        </w:rPr>
+        <w:t xml:space="preserve">10.5.7 The amplitude auxiliary input, extended to the spectrogram-based</w:t>
+      </w:r>
+      <w:r>
+        <w:rPr>
+          <w:b/>
+          <w:bCs/>
+        </w:rPr>
+        <w:t xml:space="preserve"> </w:t>
+      </w:r>
+      <w:r>
+        <w:rPr>
+          <w:b/>
+          <w:bCs/>
+        </w:rPr>
+        <w:t xml:space="preserve">model, does not repeat its RAM-side effect — and mildly hurts the 2D branch</w:t>
+      </w:r>
+      <w:r>
+        <w:rPr>
+          <w:b/>
+          <w:bCs/>
+        </w:rPr>
+        <w:t xml:space="preserve"> </w:t>
+      </w:r>
+      <w:r>
+        <w:rPr>
+          <w:b/>
+          <w:bCs/>
+        </w:rPr>
+        <w:t xml:space="preserve">in isolation.</w:t>
+      </w:r>
+      <w:r>
+        <w:t xml:space="preserve"> </w:t>
+      </w:r>
+      <w:r>
+        <w:rPr>
+          <w:rStyle w:val="VerbatimChar"/>
+        </w:rPr>
+        <w:t xml:space="preserve">SpectrogramDualAuxEncoder</w:t>
+      </w:r>
+      <w:r>
+        <w:t xml:space="preserve"> </w:t>
+      </w:r>
+      <w:r>
+        <w:t xml:space="preserve">(Section 10.2) pairs the</w:t>
+      </w:r>
+      <w:r>
+        <w:t xml:space="preserve"> </w:t>
+      </w:r>
+      <w:r>
+        <w:t xml:space="preserve">spectrogram-dual dataset with the same</w:t>
+      </w:r>
+      <w:r>
+        <w:t xml:space="preserve"> </w:t>
+      </w:r>
+      <w:r>
+        <w:rPr>
+          <w:rStyle w:val="VerbatimChar"/>
+        </w:rPr>
+        <w:t xml:space="preserve">[log_snr, log_rms]</w:t>
+      </w:r>
+      <w:r>
+        <w:t xml:space="preserve"> </w:t>
+      </w:r>
+      <w:r>
+        <w:t xml:space="preserve">vector used for</w:t>
+      </w:r>
+      <w:r>
+        <w:t xml:space="preserve"> </w:t>
+      </w:r>
+      <w:r>
+        <w:t xml:space="preserve">RAM. Results, alongside the existing no-aux spectrogram figures for</w:t>
+      </w:r>
+      <w:r>
+        <w:t xml:space="preserve"> </w:t>
+      </w:r>
+      <w:r>
+        <w:t xml:space="preserve">comparison:</w:t>
+      </w:r>
+    </w:p>
+    <w:tbl>
+      <w:tblPr>
+        <w:tblStyle w:val="Table"/>
+        <w:tblW w:type="pct" w:w="5000"/>
+        <w:tblLayout w:type="fixed"/>
+        <w:tblLook w:firstRow="1" w:lastRow="0" w:firstColumn="0" w:lastColumn="0" w:noHBand="0" w:noVBand="0" w:val="0020"/>
+      </w:tblPr>
+      <w:tblGrid>
+        <w:gridCol w:w="1980"/>
+        <w:gridCol w:w="1980"/>
+        <w:gridCol w:w="1980"/>
+        <w:gridCol w:w="1980"/>
+      </w:tblGrid>
+      <w:tr>
+        <w:trPr>
+          <w:tblHeader w:val="on"/>
+        </w:trPr>
+        <w:tc>
+          <w:tcPr/>
+          <w:p>
+            <w:pPr>
+              <w:pStyle w:val="Compact"/>
+            </w:pPr>
+            <w:r>
+              <w:t xml:space="preserve">Configuration</w:t>
+            </w:r>
+          </w:p>
+        </w:tc>
+        <w:tc>
+          <w:tcPr/>
+          <w:p>
+            <w:pPr>
+              <w:pStyle w:val="Compact"/>
+            </w:pPr>
+            <w:r>
+              <w:t xml:space="preserve">Test AUC</w:t>
+            </w:r>
+          </w:p>
+        </w:tc>
+        <w:tc>
+          <w:tcPr/>
+          <w:p>
+            <w:pPr>
+              <w:pStyle w:val="Compact"/>
+            </w:pPr>
+            <w:r>
+              <w:t xml:space="preserve">MCC</w:t>
+            </w:r>
+          </w:p>
+        </w:tc>
+        <w:tc>
+          <w:tcPr/>
+          <w:p>
+            <w:pPr>
+              <w:pStyle w:val="Compact"/>
+            </w:pPr>
+            <w:r>
+              <w:t xml:space="preserve">Accuracy</w:t>
+            </w:r>
+          </w:p>
+        </w:tc>
+      </w:tr>
+      <w:tr>
+        <w:tc>
+          <w:tcPr/>
+          <w:p>
+            <w:pPr>
+              <w:pStyle w:val="Compact"/>
+            </w:pPr>
+            <w:r>
+              <w:t xml:space="preserve">Spectrogram 2D only, no aux</w:t>
+            </w:r>
+          </w:p>
+        </w:tc>
+        <w:tc>
+          <w:tcPr/>
+          <w:p>
+            <w:pPr>
+              <w:pStyle w:val="Compact"/>
+            </w:pPr>
+            <w:r>
+              <w:rPr>
+                <w:b/>
+                <w:bCs/>
+              </w:rPr>
+              <w:t xml:space="preserve">0.9793</w:t>
+            </w:r>
+          </w:p>
+        </w:tc>
+        <w:tc>
+          <w:tcPr/>
+          <w:p>
+            <w:pPr>
+              <w:pStyle w:val="Compact"/>
+            </w:pPr>
+            <w:r>
+              <w:rPr>
+                <w:b/>
+                <w:bCs/>
+              </w:rPr>
+              <w:t xml:space="preserve">0.8666</w:t>
+            </w:r>
+          </w:p>
+        </w:tc>
+        <w:tc>
+          <w:tcPr/>
+          <w:p>
+            <w:pPr>
+              <w:pStyle w:val="Compact"/>
+            </w:pPr>
+            <w:r>
+              <w:rPr>
+                <w:b/>
+                <w:bCs/>
+              </w:rPr>
+              <w:t xml:space="preserve">93.28 %</w:t>
+            </w:r>
+          </w:p>
+        </w:tc>
+      </w:tr>
+      <w:tr>
+        <w:tc>
+          <w:tcPr/>
+          <w:p>
+            <w:pPr>
+              <w:pStyle w:val="Compact"/>
+            </w:pPr>
+            <w:r>
+              <w:t xml:space="preserve">Spectrogram + aux, no LSTM branch (</w:t>
+            </w:r>
+            <w:r>
+              <w:rPr>
+                <w:rStyle w:val="VerbatimChar"/>
+              </w:rPr>
+              <w:t xml:space="preserve">2d+aux</w:t>
+            </w:r>
+            <w:r>
+              <w:t xml:space="preserve">)</w:t>
+            </w:r>
+          </w:p>
+        </w:tc>
+        <w:tc>
+          <w:tcPr/>
+          <w:p>
+            <w:pPr>
+              <w:pStyle w:val="Compact"/>
+            </w:pPr>
+            <w:r>
+              <w:t xml:space="preserve">0.9749</w:t>
+            </w:r>
+          </w:p>
+        </w:tc>
+        <w:tc>
+          <w:tcPr/>
+          <w:p>
+            <w:pPr>
+              <w:pStyle w:val="Compact"/>
+            </w:pPr>
+            <w:r>
+              <w:t xml:space="preserve">0.8626</w:t>
+            </w:r>
+          </w:p>
+        </w:tc>
+        <w:tc>
+          <w:tcPr/>
+          <w:p>
+            <w:pPr>
+              <w:pStyle w:val="Compact"/>
+            </w:pPr>
+            <w:r>
+              <w:t xml:space="preserve">93.02 %</w:t>
+            </w:r>
+          </w:p>
+        </w:tc>
+      </w:tr>
+      <w:tr>
+        <w:tc>
+          <w:tcPr/>
+          <w:p>
+            <w:pPr>
+              <w:pStyle w:val="Compact"/>
+            </w:pPr>
+            <w:r>
+              <w:t xml:space="preserve">Spectrogram-dual, no aux, gated fusion</w:t>
+            </w:r>
+          </w:p>
+        </w:tc>
+        <w:tc>
+          <w:tcPr/>
+          <w:p>
+            <w:pPr>
+              <w:pStyle w:val="Compact"/>
+            </w:pPr>
+            <w:r>
+              <w:t xml:space="preserve">0.9761</w:t>
+            </w:r>
+          </w:p>
+        </w:tc>
+        <w:tc>
+          <w:tcPr/>
+          <w:p>
+            <w:pPr>
+              <w:pStyle w:val="Compact"/>
+            </w:pPr>
+            <w:r>
+              <w:t xml:space="preserve">0.8501</w:t>
+            </w:r>
+          </w:p>
+        </w:tc>
+        <w:tc>
+          <w:tcPr/>
+          <w:p>
+            <w:pPr>
+              <w:pStyle w:val="Compact"/>
+            </w:pPr>
+            <w:r>
+              <w:t xml:space="preserve">92.51 %</w:t>
+            </w:r>
+          </w:p>
+        </w:tc>
+      </w:tr>
+      <w:tr>
+        <w:tc>
+          <w:tcPr/>
+          <w:p>
+            <w:pPr>
+              <w:pStyle w:val="Compact"/>
+            </w:pPr>
+            <w:r>
+              <w:t xml:space="preserve">Spectrogram-dual + aux, fused, linear (</w:t>
+            </w:r>
+            <w:r>
+              <w:rPr>
+                <w:rStyle w:val="VerbatimChar"/>
+              </w:rPr>
+              <w:t xml:space="preserve">all</w:t>
+            </w:r>
+            <w:r>
+              <w:t xml:space="preserve">)</w:t>
+            </w:r>
+          </w:p>
+        </w:tc>
+        <w:tc>
+          <w:tcPr/>
+          <w:p>
+            <w:pPr>
+              <w:pStyle w:val="Compact"/>
+            </w:pPr>
+            <w:r>
+              <w:t xml:space="preserve">0.9733</w:t>
+            </w:r>
+          </w:p>
+        </w:tc>
+        <w:tc>
+          <w:tcPr/>
+          <w:p>
+            <w:pPr>
+              <w:pStyle w:val="Compact"/>
+            </w:pPr>
+            <w:r>
+              <w:t xml:space="preserve">0.8465</w:t>
+            </w:r>
+          </w:p>
+        </w:tc>
+        <w:tc>
+          <w:tcPr/>
+          <w:p>
+            <w:pPr>
+              <w:pStyle w:val="Compact"/>
+            </w:pPr>
+            <w:r>
+              <w:t xml:space="preserve">92.31 %</w:t>
+            </w:r>
+          </w:p>
+        </w:tc>
+      </w:tr>
+      <w:tr>
+        <w:tc>
+          <w:tcPr/>
+          <w:p>
+            <w:pPr>
+              <w:pStyle w:val="Compact"/>
+            </w:pPr>
+            <w:r>
+              <w:t xml:space="preserve">Spectrogram-dual, no aux, fused, linear</w:t>
+            </w:r>
+          </w:p>
+        </w:tc>
+        <w:tc>
+          <w:tcPr/>
+          <w:p>
+            <w:pPr>
+              <w:pStyle w:val="Compact"/>
+            </w:pPr>
+            <w:r>
+              <w:t xml:space="preserve">0.9646</w:t>
+            </w:r>
+          </w:p>
+        </w:tc>
+        <w:tc>
+          <w:tcPr/>
+          <w:p>
+            <w:pPr>
+              <w:pStyle w:val="Compact"/>
+            </w:pPr>
+            <w:r>
+              <w:t xml:space="preserve">0.8122</w:t>
+            </w:r>
+          </w:p>
+        </w:tc>
+        <w:tc>
+          <w:tcPr/>
+          <w:p>
+            <w:pPr>
+              <w:pStyle w:val="Compact"/>
+            </w:pPr>
+            <w:r>
+              <w:t xml:space="preserve">90.61 %</w:t>
+            </w:r>
+          </w:p>
+        </w:tc>
+      </w:tr>
+    </w:tbl>
+    <w:p>
+      <w:pPr>
+        <w:pStyle w:val="BodyText"/>
+      </w:pPr>
+      <w:r>
+        <w:t xml:space="preserve">Two results follow directly. First, adding the auxiliary input to the 2D</w:t>
+      </w:r>
+      <w:r>
+        <w:t xml:space="preserve"> </w:t>
+      </w:r>
+      <w:r>
+        <w:t xml:space="preserve">branch alone makes it</w:t>
+      </w:r>
+      <w:r>
+        <w:t xml:space="preserve"> </w:t>
+      </w:r>
+      <w:r>
+        <w:rPr>
+          <w:i/>
+          <w:iCs/>
+        </w:rPr>
+        <w:t xml:space="preserve">worse</w:t>
+      </w:r>
+      <w:r>
+        <w:t xml:space="preserve">, not better:</w:t>
+      </w:r>
+      <w:r>
+        <w:t xml:space="preserve"> </w:t>
+      </w:r>
+      <w:r>
+        <w:rPr>
+          <w:rStyle w:val="VerbatimChar"/>
+        </w:rPr>
+        <w:t xml:space="preserve">2d+aux</w:t>
+      </w:r>
+      <w:r>
+        <w:t xml:space="preserve"> </w:t>
+      </w:r>
+      <w:r>
+        <w:t xml:space="preserve">(0.9749) scores below</w:t>
+      </w:r>
+      <w:r>
+        <w:t xml:space="preserve"> </w:t>
+      </w:r>
+      <w:r>
+        <w:t xml:space="preserve">plain</w:t>
+      </w:r>
+      <w:r>
+        <w:t xml:space="preserve"> </w:t>
+      </w:r>
+      <w:r>
+        <w:rPr>
+          <w:rStyle w:val="VerbatimChar"/>
+        </w:rPr>
+        <w:t xml:space="preserve">2d</w:t>
+      </w:r>
+      <w:r>
+        <w:t xml:space="preserve"> </w:t>
+      </w:r>
+      <w:r>
+        <w:t xml:space="preserve">(0.9793), a decrease of 0.0044. This is the reverse of the RAM</w:t>
+      </w:r>
+      <w:r>
+        <w:t xml:space="preserve"> </w:t>
+      </w:r>
+      <w:r>
+        <w:t xml:space="preserve">result (Section 10.5.3, an increase of 0.0874) and is consistent with the</w:t>
+      </w:r>
+      <w:r>
+        <w:t xml:space="preserve"> </w:t>
+      </w:r>
+      <w:r>
+        <w:t xml:space="preserve">explanation offered in Section 10.5.4: a station-normalized spectrogram</w:t>
+      </w:r>
+      <w:r>
+        <w:t xml:space="preserve"> </w:t>
+      </w:r>
+      <w:r>
+        <w:t xml:space="preserve">already encodes amplitude as a function of time and frequency, so appending</w:t>
+      </w:r>
+      <w:r>
+        <w:t xml:space="preserve"> </w:t>
+      </w:r>
+      <w:r>
+        <w:t xml:space="preserve">two collapsed, redundant scalars adds estimation noise without adding</w:t>
+      </w:r>
+      <w:r>
+        <w:t xml:space="preserve"> </w:t>
+      </w:r>
+      <w:r>
+        <w:t xml:space="preserve">information the model did not already have access to. Where Section 10.5.3</w:t>
+      </w:r>
+      <w:r>
+        <w:t xml:space="preserve"> </w:t>
+      </w:r>
+      <w:r>
+        <w:t xml:space="preserve">demonstrated that the auxiliary input matters when the 2D representation is</w:t>
+      </w:r>
+      <w:r>
+        <w:t xml:space="preserve"> </w:t>
+      </w:r>
+      <w:r>
+        <w:t xml:space="preserve">scale-invariant, this result demonstrates the converse: it does not matter,</w:t>
+      </w:r>
+      <w:r>
+        <w:t xml:space="preserve"> </w:t>
+      </w:r>
+      <w:r>
+        <w:t xml:space="preserve">and can mildly hurt, when the 2D representation already carries the same</w:t>
+      </w:r>
+      <w:r>
+        <w:t xml:space="preserve"> </w:t>
+      </w:r>
+      <w:r>
+        <w:t xml:space="preserve">information in richer form.</w:t>
+      </w:r>
+    </w:p>
+    <w:p>
+      <w:pPr>
+        <w:pStyle w:val="BodyText"/>
+      </w:pPr>
+      <w:r>
+        <w:t xml:space="preserve">Second, the auxiliary input still improves the</w:t>
+      </w:r>
+      <w:r>
+        <w:t xml:space="preserve"> </w:t>
+      </w:r>
+      <w:r>
+        <w:rPr>
+          <w:b/>
+          <w:bCs/>
+        </w:rPr>
+        <w:t xml:space="preserve">fused</w:t>
+      </w:r>
+      <w:r>
+        <w:t xml:space="preserve"> </w:t>
+      </w:r>
+      <w:r>
+        <w:t xml:space="preserve">model relative to</w:t>
+      </w:r>
+      <w:r>
+        <w:t xml:space="preserve"> </w:t>
+      </w:r>
+      <w:r>
+        <w:t xml:space="preserve">its own no-aux baseline (0.9646 → 0.9733, +0.0087), for a reason similar to</w:t>
+      </w:r>
+      <w:r>
+        <w:t xml:space="preserve"> </w:t>
+      </w:r>
+      <w:r>
+        <w:t xml:space="preserve">why gated fusion helped in the same setting (Section 10.5.5): both</w:t>
+      </w:r>
+      <w:r>
+        <w:t xml:space="preserve"> </w:t>
+      </w:r>
+      <w:r>
+        <w:t xml:space="preserve">interventions reduce how much a naive linear combination is dragged down by</w:t>
+      </w:r>
+      <w:r>
+        <w:t xml:space="preserve"> </w:t>
+      </w:r>
+      <w:r>
+        <w:t xml:space="preserve">a comparatively weaker branch, whether by learning to trust the stronger</w:t>
+      </w:r>
+      <w:r>
+        <w:t xml:space="preserve"> </w:t>
+      </w:r>
+      <w:r>
+        <w:t xml:space="preserve">branch more or by handing the weaker branch’s fusion partner information it</w:t>
+      </w:r>
+      <w:r>
+        <w:t xml:space="preserve"> </w:t>
+      </w:r>
+      <w:r>
+        <w:t xml:space="preserve">lacked. Neither intervention, alone or combined, reaches the ceiling</w:t>
+      </w:r>
+      <w:r>
+        <w:t xml:space="preserve"> </w:t>
+      </w:r>
+      <w:r>
+        <w:t xml:space="preserve">established by</w:t>
+      </w:r>
+      <w:r>
+        <w:t xml:space="preserve"> </w:t>
+      </w:r>
+      <w:r>
+        <w:rPr>
+          <w:rStyle w:val="VerbatimChar"/>
+        </w:rPr>
+        <w:t xml:space="preserve">2d</w:t>
+      </w:r>
+      <w:r>
+        <w:t xml:space="preserve"> </w:t>
+      </w:r>
+      <w:r>
+        <w:t xml:space="preserve">alone.</w:t>
+      </w:r>
+    </w:p>
+    <w:p>
+      <w:pPr>
+        <w:pStyle w:val="BodyText"/>
+      </w:pPr>
+      <w:r>
+        <w:rPr>
+          <w:b/>
+          <w:bCs/>
+        </w:rPr>
+        <w:t xml:space="preserve">Considered together with Sections 10.5.1–10.5.6, the single best-performing</w:t>
+      </w:r>
+      <w:r>
+        <w:rPr>
+          <w:b/>
+          <w:bCs/>
+        </w:rPr>
+        <w:t xml:space="preserve"> </w:t>
+      </w:r>
+      <w:r>
+        <w:rPr>
+          <w:b/>
+          <w:bCs/>
+        </w:rPr>
+        <w:t xml:space="preserve">configuration measured in this entire investigation remains the plain</w:t>
+      </w:r>
+      <w:r>
+        <w:rPr>
+          <w:b/>
+          <w:bCs/>
+        </w:rPr>
+        <w:t xml:space="preserve"> </w:t>
+      </w:r>
+      <w:r>
+        <w:rPr>
+          <w:b/>
+          <w:bCs/>
+        </w:rPr>
+        <w:t xml:space="preserve">spectrogram CNN classifier, with no LSTM branch, no auxiliary input, and no</w:t>
+      </w:r>
+      <w:r>
+        <w:rPr>
+          <w:b/>
+          <w:bCs/>
+        </w:rPr>
+        <w:t xml:space="preserve"> </w:t>
+      </w:r>
+      <w:r>
+        <w:rPr>
+          <w:b/>
+          <w:bCs/>
+        </w:rPr>
+        <w:t xml:space="preserve">fusion mechanism (AUC 0.9793).</w:t>
+      </w:r>
+      <w:r>
+        <w:t xml:space="preserve"> </w:t>
+      </w:r>
+      <w:r>
+        <w:t xml:space="preserve">Every structural addition tested — the</w:t>
+      </w:r>
+      <w:r>
+        <w:t xml:space="preserve"> </w:t>
+      </w:r>
+      <w:r>
+        <w:t xml:space="preserve">source paper’s dual-channel architecture, the amplitude auxiliary input,</w:t>
+      </w:r>
+      <w:r>
+        <w:t xml:space="preserve"> </w:t>
+      </w:r>
+      <w:r>
+        <w:t xml:space="preserve">gated fusion, late-fusion stacking — improved on some other configuration</w:t>
+      </w:r>
+      <w:r>
+        <w:t xml:space="preserve"> </w:t>
+      </w:r>
+      <w:r>
+        <w:t xml:space="preserve">along the way, and each produced a genuine, informative finding about why</w:t>
+      </w:r>
+      <w:r>
+        <w:t xml:space="preserve"> </w:t>
+      </w:r>
+      <w:r>
+        <w:t xml:space="preserve">RAM underperforms and how fusion mechanisms behave. None of them, individually</w:t>
+      </w:r>
+      <w:r>
+        <w:t xml:space="preserve"> </w:t>
+      </w:r>
+      <w:r>
+        <w:t xml:space="preserve">or in combination, has yet exceeded the simplest model in this comparison.</w:t>
+      </w:r>
+      <w:r>
+        <w:t xml:space="preserve"> </w:t>
+      </w:r>
+      <w:r>
+        <w:t xml:space="preserve">This should be read as a genuine result rather than a failure of the</w:t>
+      </w:r>
+      <w:r>
+        <w:t xml:space="preserve"> </w:t>
+      </w:r>
+      <w:r>
+        <w:t xml:space="preserve">investigation: it indicates that, for this task and dataset, the highest-value</w:t>
+      </w:r>
+      <w:r>
+        <w:t xml:space="preserve"> </w:t>
+      </w:r>
+      <w:r>
+        <w:t xml:space="preserve">remaining work is more likely to be in feature representation (for example,</w:t>
+      </w:r>
+      <w:r>
+        <w:t xml:space="preserve"> </w:t>
+      </w:r>
+      <w:r>
+        <w:t xml:space="preserve">per-component auxiliary inputs, or spectrogram parameters) than in additional</w:t>
+      </w:r>
+      <w:r>
+        <w:t xml:space="preserve"> </w:t>
+      </w:r>
+      <w:r>
+        <w:t xml:space="preserve">architectural complexity layered on top of an already-strong 2D</w:t>
+      </w:r>
+      <w:r>
+        <w:t xml:space="preserve"> </w:t>
+      </w:r>
+      <w:r>
+        <w:t xml:space="preserve">representation.</w:t>
+      </w:r>
+    </w:p>
     <w:bookmarkEnd w:id="40"/>
     <w:bookmarkStart w:id="41" w:name="updated-limitations-and-recommendations"/>
     <w:p>
@@ -16080,31 +16815,31 @@
         </w:numPr>
       </w:pPr>
       <w:r>
-        <w:t xml:space="preserve">The amplitude correction has not yet been evaluated on the</w:t>
-      </w:r>
-      <w:r>
-        <w:t xml:space="preserve"> </w:t>
-      </w:r>
-      <w:r>
-        <w:t xml:space="preserve">spectrogram-dual model, nor combined with stacking (amplitude-augmented</w:t>
-      </w:r>
-      <w:r>
-        <w:t xml:space="preserve"> </w:t>
-      </w:r>
-      <w:r>
-        <w:t xml:space="preserve">branches, frozen, then stacked). This is a natural next experiment and is</w:t>
-      </w:r>
-      <w:r>
-        <w:t xml:space="preserve"> </w:t>
-      </w:r>
-      <w:r>
-        <w:t xml:space="preserve">inexpensive given that the relevant datasets and checkpoints already</w:t>
-      </w:r>
-      <w:r>
-        <w:t xml:space="preserve"> </w:t>
-      </w:r>
-      <w:r>
-        <w:t xml:space="preserve">exist.</w:t>
+        <w:t xml:space="preserve">The amplitude correction has now been evaluated on the spectrogram-dual</w:t>
+      </w:r>
+      <w:r>
+        <w:t xml:space="preserve"> </w:t>
+      </w:r>
+      <w:r>
+        <w:t xml:space="preserve">model (Section 10.5.7) but has not been combined with stacking</w:t>
+      </w:r>
+      <w:r>
+        <w:t xml:space="preserve"> </w:t>
+      </w:r>
+      <w:r>
+        <w:t xml:space="preserve">(amplitude-augmented branches, frozen, then stacked). This is a natural</w:t>
+      </w:r>
+      <w:r>
+        <w:t xml:space="preserve"> </w:t>
+      </w:r>
+      <w:r>
+        <w:t xml:space="preserve">next experiment and is inexpensive given that the relevant datasets and</w:t>
+      </w:r>
+      <w:r>
+        <w:t xml:space="preserve"> </w:t>
+      </w:r>
+      <w:r>
+        <w:t xml:space="preserve">checkpoints already exist.</w:t>
       </w:r>
     </w:p>
     <w:p>
@@ -16122,25 +16857,46 @@
         <w:t xml:space="preserve"> </w:t>
       </w:r>
       <w:r>
-        <w:t xml:space="preserve">applied to frozen rather than jointly trained branch features). Given</w:t>
-      </w:r>
-      <w:r>
-        <w:t xml:space="preserve"> </w:t>
-      </w:r>
-      <w:r>
-        <w:t xml:space="preserve">that gating already matched most of what stacking achieved on</w:t>
-      </w:r>
-      <w:r>
-        <w:t xml:space="preserve"> </w:t>
-      </w:r>
-      <w:r>
-        <w:t xml:space="preserve">spectrogram-dual, whether combining the two would add further value is</w:t>
-      </w:r>
-      <w:r>
-        <w:t xml:space="preserve"> </w:t>
-      </w:r>
-      <w:r>
-        <w:t xml:space="preserve">unresolved.</w:t>
+        <w:t xml:space="preserve">applied to frozen rather than jointly trained branch features), nor with</w:t>
+      </w:r>
+      <w:r>
+        <w:t xml:space="preserve"> </w:t>
+      </w:r>
+      <w:r>
+        <w:t xml:space="preserve">the amplitude auxiliary input on the spectrogram-dual model specifically</w:t>
+      </w:r>
+      <w:r>
+        <w:t xml:space="preserve"> </w:t>
+      </w:r>
+      <w:r>
+        <w:t xml:space="preserve">(Section 10.5.7 used linear fusion only). Given that gating already</w:t>
+      </w:r>
+      <w:r>
+        <w:t xml:space="preserve"> </w:t>
+      </w:r>
+      <w:r>
+        <w:t xml:space="preserve">matched most of what stacking achieved on spectrogram-dual without aux,</w:t>
+      </w:r>
+      <w:r>
+        <w:t xml:space="preserve"> </w:t>
+      </w:r>
+      <w:r>
+        <w:t xml:space="preserve">whether either combination would move the model past the plain</w:t>
+      </w:r>
+      <w:r>
+        <w:t xml:space="preserve"> </w:t>
+      </w:r>
+      <w:r>
+        <w:rPr>
+          <w:rStyle w:val="VerbatimChar"/>
+        </w:rPr>
+        <w:t xml:space="preserve">2d</w:t>
+      </w:r>
+      <w:r>
+        <w:t xml:space="preserve"> </w:t>
+      </w:r>
+      <w:r>
+        <w:t xml:space="preserve">ceiling (0.9793 AUC) is unresolved.</w:t>
       </w:r>
     </w:p>
     <w:p>
@@ -16791,6 +17547,132 @@
       </w:r>
       <w:r>
         <w:rPr>
+          <w:rStyle w:val="CommentTok"/>
+        </w:rPr>
+        <w:t xml:space="preserve"># Spectrogram-dual model with the amplitude auxiliary input (Section 10.5.7)</w:t>
+      </w:r>
+      <w:r>
+        <w:br/>
+      </w:r>
+      <w:r>
+        <w:rPr>
+          <w:rStyle w:val="ExtensionTok"/>
+        </w:rPr>
+        <w:t xml:space="preserve">seismic-cli</w:t>
+      </w:r>
+      <w:r>
+        <w:rPr>
+          <w:rStyle w:val="NormalTok"/>
+        </w:rPr>
+        <w:t xml:space="preserve"> generate-spec-dual-aux-dataset </w:t>
+      </w:r>
+      <w:r>
+        <w:rPr>
+          <w:rStyle w:val="DataTypeTok"/>
+        </w:rPr>
+        <w:t xml:space="preserve">\</w:t>
+      </w:r>
+      <w:r>
+        <w:br/>
+      </w:r>
+      <w:r>
+        <w:rPr>
+          <w:rStyle w:val="NormalTok"/>
+        </w:rPr>
+        <w:t xml:space="preserve">    </w:t>
+      </w:r>
+      <w:r>
+        <w:rPr>
+          <w:rStyle w:val="AttributeTok"/>
+        </w:rPr>
+        <w:t xml:space="preserve">--eq-dir</w:t>
+      </w:r>
+      <w:r>
+        <w:rPr>
+          <w:rStyle w:val="NormalTok"/>
+        </w:rPr>
+        <w:t xml:space="preserve"> data/batched_waveforms/window_post_6s_anchored </w:t>
+      </w:r>
+      <w:r>
+        <w:rPr>
+          <w:rStyle w:val="DataTypeTok"/>
+        </w:rPr>
+        <w:t xml:space="preserve">\</w:t>
+      </w:r>
+      <w:r>
+        <w:br/>
+      </w:r>
+      <w:r>
+        <w:rPr>
+          <w:rStyle w:val="NormalTok"/>
+        </w:rPr>
+        <w:t xml:space="preserve">    </w:t>
+      </w:r>
+      <w:r>
+        <w:rPr>
+          <w:rStyle w:val="AttributeTok"/>
+        </w:rPr>
+        <w:t xml:space="preserve">--noise-dir</w:t>
+      </w:r>
+      <w:r>
+        <w:rPr>
+          <w:rStyle w:val="NormalTok"/>
+        </w:rPr>
+        <w:t xml:space="preserve"> data/batched_noise_waveforms/noise_pre_3h </w:t>
+      </w:r>
+      <w:r>
+        <w:rPr>
+          <w:rStyle w:val="DataTypeTok"/>
+        </w:rPr>
+        <w:t xml:space="preserve">\</w:t>
+      </w:r>
+      <w:r>
+        <w:br/>
+      </w:r>
+      <w:r>
+        <w:rPr>
+          <w:rStyle w:val="NormalTok"/>
+        </w:rPr>
+        <w:t xml:space="preserve">    </w:t>
+      </w:r>
+      <w:r>
+        <w:rPr>
+          <w:rStyle w:val="AttributeTok"/>
+        </w:rPr>
+        <w:t xml:space="preserve">--output-dir</w:t>
+      </w:r>
+      <w:r>
+        <w:rPr>
+          <w:rStyle w:val="NormalTok"/>
+        </w:rPr>
+        <w:t xml:space="preserve"> dataset_specdualaux_6s </w:t>
+      </w:r>
+      <w:r>
+        <w:rPr>
+          <w:rStyle w:val="AttributeTok"/>
+        </w:rPr>
+        <w:t xml:space="preserve">--window-seconds</w:t>
+      </w:r>
+      <w:r>
+        <w:rPr>
+          <w:rStyle w:val="NormalTok"/>
+        </w:rPr>
+        <w:t xml:space="preserve"> 6 </w:t>
+      </w:r>
+      <w:r>
+        <w:rPr>
+          <w:rStyle w:val="AttributeTok"/>
+        </w:rPr>
+        <w:t xml:space="preserve">--max</w:t>
+      </w:r>
+      <w:r>
+        <w:br/>
+      </w:r>
+      <w:r>
+        <w:br/>
+      </w:r>
+      <w:r>
+        <w:rPr>
           <w:rStyle w:val="BuiltInTok"/>
         </w:rPr>
         <w:t xml:space="preserve">cd</w:t>
@@ -17310,6 +18192,150 @@
           <w:rStyle w:val="CommentTok"/>
         </w:rPr>
         <w:t xml:space="preserve"># gated fusion (Section 10.5.5)</w:t>
+      </w:r>
+      <w:r>
+        <w:br/>
+      </w:r>
+      <w:r>
+        <w:rPr>
+          <w:rStyle w:val="ExtensionTok"/>
+        </w:rPr>
+        <w:t xml:space="preserve">python</w:t>
+      </w:r>
+      <w:r>
+        <w:rPr>
+          <w:rStyle w:val="NormalTok"/>
+        </w:rPr>
+        <w:t xml:space="preserve"> cnn_lstm_classify_aux.py </w:t>
+      </w:r>
+      <w:r>
+        <w:rPr>
+          <w:rStyle w:val="AttributeTok"/>
+        </w:rPr>
+        <w:t xml:space="preserve">--dataset-dir</w:t>
+      </w:r>
+      <w:r>
+        <w:rPr>
+          <w:rStyle w:val="NormalTok"/>
+        </w:rPr>
+        <w:t xml:space="preserve"> ../../data_downloader/dataset_specdualaux_6s </w:t>
+      </w:r>
+      <w:r>
+        <w:rPr>
+          <w:rStyle w:val="DataTypeTok"/>
+        </w:rPr>
+        <w:t xml:space="preserve">\</w:t>
+      </w:r>
+      <w:r>
+        <w:br/>
+      </w:r>
+      <w:r>
+        <w:rPr>
+          <w:rStyle w:val="NormalTok"/>
+        </w:rPr>
+        <w:t xml:space="preserve">    </w:t>
+      </w:r>
+      <w:r>
+        <w:rPr>
+          <w:rStyle w:val="AttributeTok"/>
+        </w:rPr>
+        <w:t xml:space="preserve">--channels</w:t>
+      </w:r>
+      <w:r>
+        <w:rPr>
+          <w:rStyle w:val="NormalTok"/>
+        </w:rPr>
+        <w:t xml:space="preserve"> all </w:t>
+      </w:r>
+      <w:r>
+        <w:rPr>
+          <w:rStyle w:val="AttributeTok"/>
+        </w:rPr>
+        <w:t xml:space="preserve">--batch-size</w:t>
+      </w:r>
+      <w:r>
+        <w:rPr>
+          <w:rStyle w:val="NormalTok"/>
+        </w:rPr>
+        <w:t xml:space="preserve"> 32                 </w:t>
+      </w:r>
+      <w:r>
+        <w:rPr>
+          <w:rStyle w:val="CommentTok"/>
+        </w:rPr>
+        <w:t xml:space="preserve"># spectrogram + aux (Section 10.5.7)</w:t>
+      </w:r>
+      <w:r>
+        <w:br/>
+      </w:r>
+      <w:r>
+        <w:rPr>
+          <w:rStyle w:val="ExtensionTok"/>
+        </w:rPr>
+        <w:t xml:space="preserve">python</w:t>
+      </w:r>
+      <w:r>
+        <w:rPr>
+          <w:rStyle w:val="NormalTok"/>
+        </w:rPr>
+        <w:t xml:space="preserve"> cnn_lstm_classify_aux.py </w:t>
+      </w:r>
+      <w:r>
+        <w:rPr>
+          <w:rStyle w:val="AttributeTok"/>
+        </w:rPr>
+        <w:t xml:space="preserve">--dataset-dir</w:t>
+      </w:r>
+      <w:r>
+        <w:rPr>
+          <w:rStyle w:val="NormalTok"/>
+        </w:rPr>
+        <w:t xml:space="preserve"> ../../data_downloader/dataset_specdualaux_6s </w:t>
+      </w:r>
+      <w:r>
+        <w:rPr>
+          <w:rStyle w:val="DataTypeTok"/>
+        </w:rPr>
+        <w:t xml:space="preserve">\</w:t>
+      </w:r>
+      <w:r>
+        <w:br/>
+      </w:r>
+      <w:r>
+        <w:rPr>
+          <w:rStyle w:val="NormalTok"/>
+        </w:rPr>
+        <w:t xml:space="preserve">    </w:t>
+      </w:r>
+      <w:r>
+        <w:rPr>
+          <w:rStyle w:val="AttributeTok"/>
+        </w:rPr>
+        <w:t xml:space="preserve">--channels</w:t>
+      </w:r>
+      <w:r>
+        <w:rPr>
+          <w:rStyle w:val="NormalTok"/>
+        </w:rPr>
+        <w:t xml:space="preserve"> 2d+aux </w:t>
+      </w:r>
+      <w:r>
+        <w:rPr>
+          <w:rStyle w:val="AttributeTok"/>
+        </w:rPr>
+        <w:t xml:space="preserve">--batch-size</w:t>
+      </w:r>
+      <w:r>
+        <w:rPr>
+          <w:rStyle w:val="NormalTok"/>
+        </w:rPr>
+        <w:t xml:space="preserve"> 32               </w:t>
+      </w:r>
+      <w:r>
+        <w:rPr>
+          <w:rStyle w:val="CommentTok"/>
+        </w:rPr>
+        <w:t xml:space="preserve"># spectrogram + aux, no LSTM (Section 10.5.7)</w:t>
       </w:r>
       <w:r>
         <w:br/>

</xml_diff>

<commit_message>
Regenerate report.docx with 10.5.8/10.5.9
Co-Authored-By: Claude Sonnet 5 <noreply@anthropic.com>
</commit_message>
<xml_diff>
--- a/report.docx
+++ b/report.docx
@@ -16631,7 +16631,1137 @@
           <w:b/>
           <w:bCs/>
         </w:rPr>
-        <w:t xml:space="preserve">Considered together with Sections 10.5.1–10.5.6, the single best-performing</w:t>
+        <w:t xml:space="preserve">10.5.8 The amplitude auxiliary input helps the raw-waveform branch nearly</w:t>
+      </w:r>
+      <w:r>
+        <w:rPr>
+          <w:b/>
+          <w:bCs/>
+        </w:rPr>
+        <w:t xml:space="preserve"> </w:t>
+      </w:r>
+      <w:r>
+        <w:rPr>
+          <w:b/>
+          <w:bCs/>
+        </w:rPr>
+        <w:t xml:space="preserve">as much as it helps the RAM branch.</w:t>
+      </w:r>
+      <w:r>
+        <w:t xml:space="preserve"> </w:t>
+      </w:r>
+      <w:r>
+        <w:rPr>
+          <w:rStyle w:val="VerbatimChar"/>
+        </w:rPr>
+        <w:t xml:space="preserve">--channels 1d+aux</w:t>
+      </w:r>
+      <w:r>
+        <w:t xml:space="preserve"> </w:t>
+      </w:r>
+      <w:r>
+        <w:t xml:space="preserve">(the raw</w:t>
+      </w:r>
+      <w:r>
+        <w:t xml:space="preserve"> </w:t>
+      </w:r>
+      <w:r>
+        <w:t xml:space="preserve">standardized waveform plus</w:t>
+      </w:r>
+      <w:r>
+        <w:t xml:space="preserve"> </w:t>
+      </w:r>
+      <w:r>
+        <w:rPr>
+          <w:rStyle w:val="VerbatimChar"/>
+        </w:rPr>
+        <w:t xml:space="preserve">[log_snr, log_rms]</w:t>
+      </w:r>
+      <w:r>
+        <w:t xml:space="preserve">, with no 2D branch present</w:t>
+      </w:r>
+      <w:r>
+        <w:t xml:space="preserve"> </w:t>
+      </w:r>
+      <w:r>
+        <w:t xml:space="preserve">at all) was trained on the RAM-plus-amplitude dataset:</w:t>
+      </w:r>
+    </w:p>
+    <w:p>
+      <w:pPr>
+        <w:pStyle w:val="BodyText"/>
+      </w:pPr>
+      <m:oMathPara>
+        <m:oMathParaPr>
+          <m:jc m:val="center"/>
+        </m:oMathParaPr>
+        <m:oMath>
+          <m:r>
+            <m:rPr>
+              <m:nor/>
+              <m:sty m:val="p"/>
+            </m:rPr>
+            <m:t>Test AUC: </m:t>
+          </m:r>
+          <m:r>
+            <m:t>0.9216</m:t>
+          </m:r>
+          <m:r>
+            <m:rPr>
+              <m:sty m:val="p"/>
+            </m:rPr>
+            <m:t>→</m:t>
+          </m:r>
+          <m:r>
+            <m:t>0.9501</m:t>
+          </m:r>
+          <m:r>
+            <m:t> </m:t>
+          </m:r>
+          <m:r>
+            <m:rPr>
+              <m:sty m:val="p"/>
+            </m:rPr>
+            <m:t>(</m:t>
+          </m:r>
+          <m:r>
+            <m:rPr>
+              <m:sty m:val="p"/>
+            </m:rPr>
+            <m:t>+</m:t>
+          </m:r>
+          <m:r>
+            <m:t>0.0285</m:t>
+          </m:r>
+          <m:r>
+            <m:rPr>
+              <m:sty m:val="p"/>
+            </m:rPr>
+            <m:t>)</m:t>
+          </m:r>
+          <m:r>
+            <m:t>  </m:t>
+          </m:r>
+          <m:r>
+            <m:rPr>
+              <m:nor/>
+              <m:sty m:val="p"/>
+            </m:rPr>
+            <m:t>MCC: </m:t>
+          </m:r>
+          <m:r>
+            <m:t>0.6849</m:t>
+          </m:r>
+          <m:r>
+            <m:rPr>
+              <m:sty m:val="p"/>
+            </m:rPr>
+            <m:t>→</m:t>
+          </m:r>
+          <m:r>
+            <m:t>0.7675</m:t>
+          </m:r>
+          <m:r>
+            <m:t> </m:t>
+          </m:r>
+          <m:r>
+            <m:rPr>
+              <m:sty m:val="p"/>
+            </m:rPr>
+            <m:t>(</m:t>
+          </m:r>
+          <m:r>
+            <m:rPr>
+              <m:sty m:val="p"/>
+            </m:rPr>
+            <m:t>+</m:t>
+          </m:r>
+          <m:r>
+            <m:t>0.0826</m:t>
+          </m:r>
+          <m:r>
+            <m:rPr>
+              <m:sty m:val="p"/>
+            </m:rPr>
+            <m:t>)</m:t>
+          </m:r>
+          <m:r>
+            <m:t>  </m:t>
+          </m:r>
+          <m:r>
+            <m:rPr>
+              <m:nor/>
+              <m:sty m:val="p"/>
+            </m:rPr>
+            <m:t>Accuracy: </m:t>
+          </m:r>
+          <m:r>
+            <m:t>84.22</m:t>
+          </m:r>
+          <m:r>
+            <m:rPr>
+              <m:sty m:val="p"/>
+            </m:rPr>
+            <m:t>%</m:t>
+          </m:r>
+          <m:r>
+            <m:rPr>
+              <m:sty m:val="p"/>
+            </m:rPr>
+            <m:t>→</m:t>
+          </m:r>
+          <m:r>
+            <m:t>88.37</m:t>
+          </m:r>
+          <m:r>
+            <m:rPr>
+              <m:sty m:val="p"/>
+            </m:rPr>
+            <m:t>%</m:t>
+          </m:r>
+          <m:r>
+            <m:t> </m:t>
+          </m:r>
+          <m:r>
+            <m:rPr>
+              <m:sty m:val="p"/>
+            </m:rPr>
+            <m:t>(</m:t>
+          </m:r>
+          <m:r>
+            <m:rPr>
+              <m:sty m:val="p"/>
+            </m:rPr>
+            <m:t>+</m:t>
+          </m:r>
+          <m:r>
+            <m:t>4.15</m:t>
+          </m:r>
+          <m:r>
+            <m:rPr>
+              <m:nor/>
+              <m:sty m:val="p"/>
+            </m:rPr>
+            <m:t> pp</m:t>
+          </m:r>
+          <m:r>
+            <m:rPr>
+              <m:sty m:val="p"/>
+            </m:rPr>
+            <m:t>)</m:t>
+          </m:r>
+        </m:oMath>
+      </m:oMathPara>
+    </w:p>
+    <w:p>
+      <w:pPr>
+        <w:pStyle w:val="FirstParagraph"/>
+      </w:pPr>
+      <w:r>
+        <w:t xml:space="preserve">comparing against the no-aux</w:t>
+      </w:r>
+      <w:r>
+        <w:t xml:space="preserve"> </w:t>
+      </w:r>
+      <w:r>
+        <w:rPr>
+          <w:rStyle w:val="VerbatimChar"/>
+        </w:rPr>
+        <w:t xml:space="preserve">1d</w:t>
+      </w:r>
+      <w:r>
+        <w:t xml:space="preserve">-alone figure from Section 10.4. This is</w:t>
+      </w:r>
+      <w:r>
+        <w:t xml:space="preserve"> </w:t>
+      </w:r>
+      <w:r>
+        <w:t xml:space="preserve">consistent with the same underlying mechanism identified in Section 8.2: the</w:t>
+      </w:r>
+      <w:r>
+        <w:t xml:space="preserve"> </w:t>
+      </w:r>
+      <w:r>
+        <w:t xml:space="preserve">raw waveform is standardized before entering the LSTM (Section 10.1), which</w:t>
+      </w:r>
+      <w:r>
+        <w:t xml:space="preserve"> </w:t>
+      </w:r>
+      <w:r>
+        <w:t xml:space="preserve">removes absolute amplitude exactly as RAM’s own internal standardization</w:t>
+      </w:r>
+      <w:r>
+        <w:t xml:space="preserve"> </w:t>
+      </w:r>
+      <w:r>
+        <w:t xml:space="preserve">does, so the raw-waveform branch is scale-blind for the same structural</w:t>
+      </w:r>
+      <w:r>
+        <w:t xml:space="preserve"> </w:t>
+      </w:r>
+      <w:r>
+        <w:t xml:space="preserve">reason the RAM image is, and benefits from the same correction. With the</w:t>
+      </w:r>
+      <w:r>
+        <w:t xml:space="preserve"> </w:t>
+      </w:r>
+      <w:r>
+        <w:t xml:space="preserve">auxiliary input present,</w:t>
+      </w:r>
+      <w:r>
+        <w:t xml:space="preserve"> </w:t>
+      </w:r>
+      <w:r>
+        <w:rPr>
+          <w:rStyle w:val="VerbatimChar"/>
+        </w:rPr>
+        <w:t xml:space="preserve">1d+aux</w:t>
+      </w:r>
+      <w:r>
+        <w:t xml:space="preserve"> </w:t>
+      </w:r>
+      <w:r>
+        <w:t xml:space="preserve">(0.9501 AUC) is closer to the full fused</w:t>
+      </w:r>
+      <w:r>
+        <w:t xml:space="preserve"> </w:t>
+      </w:r>
+      <w:r>
+        <w:t xml:space="preserve">model (0.9514, Section 10.4) than</w:t>
+      </w:r>
+      <w:r>
+        <w:t xml:space="preserve"> </w:t>
+      </w:r>
+      <w:r>
+        <w:rPr>
+          <w:rStyle w:val="VerbatimChar"/>
+        </w:rPr>
+        <w:t xml:space="preserve">2d+aux</w:t>
+      </w:r>
+      <w:r>
+        <w:t xml:space="preserve"> </w:t>
+      </w:r>
+      <w:r>
+        <w:t xml:space="preserve">is (0.9468), and closer than</w:t>
+      </w:r>
+      <w:r>
+        <w:t xml:space="preserve"> </w:t>
+      </w:r>
+      <w:r>
+        <w:t xml:space="preserve">either branch was to the fused model without the auxiliary input (Section</w:t>
+      </w:r>
+      <w:r>
+        <w:t xml:space="preserve"> </w:t>
+      </w:r>
+      <w:r>
+        <w:t xml:space="preserve">10.5.1). One data point confirms this is dataset-independent by</w:t>
+      </w:r>
+      <w:r>
+        <w:t xml:space="preserve"> </w:t>
+      </w:r>
+      <w:r>
+        <w:t xml:space="preserve">construction rather than by measurement: running the identical</w:t>
+      </w:r>
+      <w:r>
+        <w:t xml:space="preserve"> </w:t>
+      </w:r>
+      <w:r>
+        <w:rPr>
+          <w:rStyle w:val="VerbatimChar"/>
+        </w:rPr>
+        <w:t xml:space="preserve">1d+aux</w:t>
+      </w:r>
+      <w:r>
+        <w:t xml:space="preserve"> </w:t>
+      </w:r>
+      <w:r>
+        <w:t xml:space="preserve">configuration against the spectrogram-plus-amplitude dataset produced</w:t>
+      </w:r>
+      <w:r>
+        <w:t xml:space="preserve"> </w:t>
+      </w:r>
+      <w:r>
+        <w:t xml:space="preserve">test figures identical to four decimal places (accuracy 88.37%, AUC 0.9501,</w:t>
+      </w:r>
+      <w:r>
+        <w:t xml:space="preserve"> </w:t>
+      </w:r>
+      <w:r>
+        <w:t xml:space="preserve">MCC 0.7675), because that ablation never reads the</w:t>
+      </w:r>
+      <w:r>
+        <w:t xml:space="preserve"> </w:t>
+      </w:r>
+      <w:r>
+        <w:rPr>
+          <w:rStyle w:val="VerbatimChar"/>
+        </w:rPr>
+        <w:t xml:space="preserve">img</w:t>
+      </w:r>
+      <w:r>
+        <w:t xml:space="preserve"> </w:t>
+      </w:r>
+      <w:r>
+        <w:t xml:space="preserve">tensor and both</w:t>
+      </w:r>
+      <w:r>
+        <w:t xml:space="preserve"> </w:t>
+      </w:r>
+      <w:r>
+        <w:t xml:space="preserve">encoders compute</w:t>
+      </w:r>
+      <w:r>
+        <w:t xml:space="preserve"> </w:t>
+      </w:r>
+      <w:r>
+        <w:rPr>
+          <w:rStyle w:val="VerbatimChar"/>
+        </w:rPr>
+        <w:t xml:space="preserve">seq</w:t>
+      </w:r>
+      <w:r>
+        <w:t xml:space="preserve"> </w:t>
+      </w:r>
+      <w:r>
+        <w:t xml:space="preserve">and</w:t>
+      </w:r>
+      <w:r>
+        <w:t xml:space="preserve"> </w:t>
+      </w:r>
+      <w:r>
+        <w:rPr>
+          <w:rStyle w:val="VerbatimChar"/>
+        </w:rPr>
+        <w:t xml:space="preserve">aux</w:t>
+      </w:r>
+      <w:r>
+        <w:t xml:space="preserve"> </w:t>
+      </w:r>
+      <w:r>
+        <w:t xml:space="preserve">with the same formula — a useful check on</w:t>
+      </w:r>
+      <w:r>
+        <w:t xml:space="preserve"> </w:t>
+      </w:r>
+      <w:r>
+        <w:t xml:space="preserve">the pipeline’s correctness, not a second independent measurement.</w:t>
+      </w:r>
+    </w:p>
+    <w:p>
+      <w:pPr>
+        <w:pStyle w:val="BodyText"/>
+      </w:pPr>
+      <w:r>
+        <w:rPr>
+          <w:b/>
+          <w:bCs/>
+        </w:rPr>
+        <w:t xml:space="preserve">10.5.9 A hyperparameter sweep of</w:t>
+      </w:r>
+      <w:r>
+        <w:rPr>
+          <w:b/>
+          <w:bCs/>
+        </w:rPr>
+        <w:t xml:space="preserve"> </w:t>
+      </w:r>
+      <w:r>
+        <w:rPr>
+          <w:rStyle w:val="VerbatimChar"/>
+          <w:b/>
+          <w:bCs/>
+        </w:rPr>
+        <w:t xml:space="preserve">LSTMAttentionBranch</w:t>
+      </w:r>
+      <w:r>
+        <w:rPr>
+          <w:b/>
+          <w:bCs/>
+        </w:rPr>
+        <w:t xml:space="preserve"> </w:t>
+      </w:r>
+      <w:r>
+        <w:rPr>
+          <w:b/>
+          <w:bCs/>
+        </w:rPr>
+        <w:t xml:space="preserve">itself (depth,</w:t>
+      </w:r>
+      <w:r>
+        <w:rPr>
+          <w:b/>
+          <w:bCs/>
+        </w:rPr>
+        <w:t xml:space="preserve"> </w:t>
+      </w:r>
+      <w:r>
+        <w:rPr>
+          <w:b/>
+          <w:bCs/>
+        </w:rPr>
+        <w:t xml:space="preserve">attention heads, hidden width) produced no distinguishable improvement,</w:t>
+      </w:r>
+      <w:r>
+        <w:rPr>
+          <w:b/>
+          <w:bCs/>
+        </w:rPr>
+        <w:t xml:space="preserve"> </w:t>
+      </w:r>
+      <w:r>
+        <w:rPr>
+          <w:b/>
+          <w:bCs/>
+        </w:rPr>
+        <w:t xml:space="preserve">and illustrates the validation-versus-test divergence risk more sharply</w:t>
+      </w:r>
+      <w:r>
+        <w:rPr>
+          <w:b/>
+          <w:bCs/>
+        </w:rPr>
+        <w:t xml:space="preserve"> </w:t>
+      </w:r>
+      <w:r>
+        <w:rPr>
+          <w:b/>
+          <w:bCs/>
+        </w:rPr>
+        <w:t xml:space="preserve">than the RAM CNN sweep did.</w:t>
+      </w:r>
+      <w:r>
+        <w:t xml:space="preserve"> </w:t>
+      </w:r>
+      <w:r>
+        <w:t xml:space="preserve">Five configurations were trained on</w:t>
+      </w:r>
+      <w:r>
+        <w:t xml:space="preserve"> </w:t>
+      </w:r>
+      <w:r>
+        <w:rPr>
+          <w:rStyle w:val="VerbatimChar"/>
+        </w:rPr>
+        <w:t xml:space="preserve">1d+aux</w:t>
+      </w:r>
+      <w:r>
+        <w:t xml:space="preserve"> </w:t>
+      </w:r>
+      <w:r>
+        <w:t xml:space="preserve">(isolating the LSTM branch, since the 2D branch is absent and the</w:t>
+      </w:r>
+      <w:r>
+        <w:t xml:space="preserve"> </w:t>
+      </w:r>
+      <w:r>
+        <w:t xml:space="preserve">auxiliary input is held fixed): the established default (one LSTM layer,</w:t>
+      </w:r>
+      <w:r>
+        <w:t xml:space="preserve"> </w:t>
+      </w:r>
+      <w:r>
+        <w:t xml:space="preserve">four attention heads, hidden width 48), two head counts (2, 8), a deeper</w:t>
+      </w:r>
+      <w:r>
+        <w:t xml:space="preserve"> </w:t>
+      </w:r>
+      <w:r>
+        <w:t xml:space="preserve">LSTM (two layers), and a wider hidden state (64). Selection was fixed to</w:t>
+      </w:r>
+      <w:r>
+        <w:t xml:space="preserve"> </w:t>
+      </w:r>
+      <w:r>
+        <w:t xml:space="preserve">validation AUC before training, as in Section 10.5.6.</w:t>
+      </w:r>
+    </w:p>
+    <w:tbl>
+      <w:tblPr>
+        <w:tblStyle w:val="Table"/>
+        <w:tblW w:type="pct" w:w="5000"/>
+        <w:tblLayout w:type="fixed"/>
+        <w:tblLook w:firstRow="1" w:lastRow="0" w:firstColumn="0" w:lastColumn="0" w:noHBand="0" w:noVBand="0" w:val="0020"/>
+      </w:tblPr>
+      <w:tblGrid>
+        <w:gridCol w:w="1320"/>
+        <w:gridCol w:w="1320"/>
+        <w:gridCol w:w="1320"/>
+        <w:gridCol w:w="1320"/>
+        <w:gridCol w:w="1320"/>
+        <w:gridCol w:w="1320"/>
+      </w:tblGrid>
+      <w:tr>
+        <w:trPr>
+          <w:tblHeader w:val="on"/>
+        </w:trPr>
+        <w:tc>
+          <w:tcPr/>
+          <w:p>
+            <w:pPr>
+              <w:pStyle w:val="Compact"/>
+            </w:pPr>
+            <w:r>
+              <w:t xml:space="preserve">Configuration</w:t>
+            </w:r>
+          </w:p>
+        </w:tc>
+        <w:tc>
+          <w:tcPr/>
+          <w:p>
+            <w:pPr>
+              <w:pStyle w:val="Compact"/>
+            </w:pPr>
+            <w:r>
+              <w:t xml:space="preserve">Parameters</w:t>
+            </w:r>
+          </w:p>
+        </w:tc>
+        <w:tc>
+          <w:tcPr/>
+          <w:p>
+            <w:pPr>
+              <w:pStyle w:val="Compact"/>
+            </w:pPr>
+            <w:r>
+              <w:t xml:space="preserve">Validation AUC</w:t>
+            </w:r>
+          </w:p>
+        </w:tc>
+        <w:tc>
+          <w:tcPr/>
+          <w:p>
+            <w:pPr>
+              <w:pStyle w:val="Compact"/>
+            </w:pPr>
+            <w:r>
+              <w:t xml:space="preserve">Test AUC</w:t>
+            </w:r>
+          </w:p>
+        </w:tc>
+        <w:tc>
+          <w:tcPr/>
+          <w:p>
+            <w:pPr>
+              <w:pStyle w:val="Compact"/>
+            </w:pPr>
+            <w:r>
+              <w:t xml:space="preserve">Test MCC</w:t>
+            </w:r>
+          </w:p>
+        </w:tc>
+        <w:tc>
+          <w:tcPr/>
+          <w:p>
+            <w:pPr>
+              <w:pStyle w:val="Compact"/>
+            </w:pPr>
+            <w:r>
+              <w:t xml:space="preserve">Test accuracy</w:t>
+            </w:r>
+          </w:p>
+        </w:tc>
+      </w:tr>
+      <w:tr>
+        <w:tc>
+          <w:tcPr/>
+          <w:p>
+            <w:pPr>
+              <w:pStyle w:val="Compact"/>
+            </w:pPr>
+            <w:r>
+              <w:t xml:space="preserve">Default (1 layer, 4 heads, hidden 48)</w:t>
+            </w:r>
+          </w:p>
+        </w:tc>
+        <w:tc>
+          <w:tcPr/>
+          <w:p>
+            <w:pPr>
+              <w:pStyle w:val="Compact"/>
+            </w:pPr>
+            <w:r>
+              <w:t xml:space="preserve">76,903</w:t>
+            </w:r>
+          </w:p>
+        </w:tc>
+        <w:tc>
+          <w:tcPr/>
+          <w:p>
+            <w:pPr>
+              <w:pStyle w:val="Compact"/>
+            </w:pPr>
+            <w:r>
+              <w:t xml:space="preserve">0.9574</w:t>
+            </w:r>
+          </w:p>
+        </w:tc>
+        <w:tc>
+          <w:tcPr/>
+          <w:p>
+            <w:pPr>
+              <w:pStyle w:val="Compact"/>
+            </w:pPr>
+            <w:r>
+              <w:rPr>
+                <w:b/>
+                <w:bCs/>
+              </w:rPr>
+              <w:t xml:space="preserve">0.9501</w:t>
+            </w:r>
+          </w:p>
+        </w:tc>
+        <w:tc>
+          <w:tcPr/>
+          <w:p>
+            <w:pPr>
+              <w:pStyle w:val="Compact"/>
+            </w:pPr>
+            <w:r>
+              <w:rPr>
+                <w:b/>
+                <w:bCs/>
+              </w:rPr>
+              <w:t xml:space="preserve">0.7675</w:t>
+            </w:r>
+          </w:p>
+        </w:tc>
+        <w:tc>
+          <w:tcPr/>
+          <w:p>
+            <w:pPr>
+              <w:pStyle w:val="Compact"/>
+            </w:pPr>
+            <w:r>
+              <w:rPr>
+                <w:b/>
+                <w:bCs/>
+              </w:rPr>
+              <w:t xml:space="preserve">88.37 %</w:t>
+            </w:r>
+          </w:p>
+        </w:tc>
+      </w:tr>
+      <w:tr>
+        <w:tc>
+          <w:tcPr/>
+          <w:p>
+            <w:pPr>
+              <w:pStyle w:val="Compact"/>
+            </w:pPr>
+            <w:r>
+              <w:t xml:space="preserve">2 attention heads</w:t>
+            </w:r>
+          </w:p>
+        </w:tc>
+        <w:tc>
+          <w:tcPr/>
+          <w:p>
+            <w:pPr>
+              <w:pStyle w:val="Compact"/>
+            </w:pPr>
+            <w:r>
+              <w:t xml:space="preserve">76,903</w:t>
+            </w:r>
+          </w:p>
+        </w:tc>
+        <w:tc>
+          <w:tcPr/>
+          <w:p>
+            <w:pPr>
+              <w:pStyle w:val="Compact"/>
+            </w:pPr>
+            <w:r>
+              <w:t xml:space="preserve">0.9576</w:t>
+            </w:r>
+          </w:p>
+        </w:tc>
+        <w:tc>
+          <w:tcPr/>
+          <w:p>
+            <w:pPr>
+              <w:pStyle w:val="Compact"/>
+            </w:pPr>
+            <w:r>
+              <w:t xml:space="preserve">0.9485</w:t>
+            </w:r>
+          </w:p>
+        </w:tc>
+        <w:tc>
+          <w:tcPr/>
+          <w:p>
+            <w:pPr>
+              <w:pStyle w:val="Compact"/>
+            </w:pPr>
+            <w:r>
+              <w:t xml:space="preserve">0.7520</w:t>
+            </w:r>
+          </w:p>
+        </w:tc>
+        <w:tc>
+          <w:tcPr/>
+          <w:p>
+            <w:pPr>
+              <w:pStyle w:val="Compact"/>
+            </w:pPr>
+            <w:r>
+              <w:t xml:space="preserve">87.59 %</w:t>
+            </w:r>
+          </w:p>
+        </w:tc>
+      </w:tr>
+      <w:tr>
+        <w:tc>
+          <w:tcPr/>
+          <w:p>
+            <w:pPr>
+              <w:pStyle w:val="Compact"/>
+            </w:pPr>
+            <w:r>
+              <w:t xml:space="preserve">8 attention heads</w:t>
+            </w:r>
+          </w:p>
+        </w:tc>
+        <w:tc>
+          <w:tcPr/>
+          <w:p>
+            <w:pPr>
+              <w:pStyle w:val="Compact"/>
+            </w:pPr>
+            <w:r>
+              <w:t xml:space="preserve">76,903</w:t>
+            </w:r>
+          </w:p>
+        </w:tc>
+        <w:tc>
+          <w:tcPr/>
+          <w:p>
+            <w:pPr>
+              <w:pStyle w:val="Compact"/>
+            </w:pPr>
+            <w:r>
+              <w:t xml:space="preserve">0.9586</w:t>
+            </w:r>
+          </w:p>
+        </w:tc>
+        <w:tc>
+          <w:tcPr/>
+          <w:p>
+            <w:pPr>
+              <w:pStyle w:val="Compact"/>
+            </w:pPr>
+            <w:r>
+              <w:t xml:space="preserve">0.9495</w:t>
+            </w:r>
+          </w:p>
+        </w:tc>
+        <w:tc>
+          <w:tcPr/>
+          <w:p>
+            <w:pPr>
+              <w:pStyle w:val="Compact"/>
+            </w:pPr>
+            <w:r>
+              <w:t xml:space="preserve">0.7513</w:t>
+            </w:r>
+          </w:p>
+        </w:tc>
+        <w:tc>
+          <w:tcPr/>
+          <w:p>
+            <w:pPr>
+              <w:pStyle w:val="Compact"/>
+            </w:pPr>
+            <w:r>
+              <w:t xml:space="preserve">87.53 %</w:t>
+            </w:r>
+          </w:p>
+        </w:tc>
+      </w:tr>
+      <w:tr>
+        <w:tc>
+          <w:tcPr/>
+          <w:p>
+            <w:pPr>
+              <w:pStyle w:val="Compact"/>
+            </w:pPr>
+            <w:r>
+              <w:t xml:space="preserve">Hidden width 64</w:t>
+            </w:r>
+          </w:p>
+        </w:tc>
+        <w:tc>
+          <w:tcPr/>
+          <w:p>
+            <w:pPr>
+              <w:pStyle w:val="Compact"/>
+            </w:pPr>
+            <w:r>
+              <w:t xml:space="preserve">123,815</w:t>
+            </w:r>
+          </w:p>
+        </w:tc>
+        <w:tc>
+          <w:tcPr/>
+          <w:p>
+            <w:pPr>
+              <w:pStyle w:val="Compact"/>
+            </w:pPr>
+            <w:r>
+              <w:rPr>
+                <w:b/>
+                <w:bCs/>
+              </w:rPr>
+              <w:t xml:space="preserve">0.9588</w:t>
+            </w:r>
+          </w:p>
+        </w:tc>
+        <w:tc>
+          <w:tcPr/>
+          <w:p>
+            <w:pPr>
+              <w:pStyle w:val="Compact"/>
+            </w:pPr>
+            <w:r>
+              <w:t xml:space="preserve">0.9488</w:t>
+            </w:r>
+          </w:p>
+        </w:tc>
+        <w:tc>
+          <w:tcPr/>
+          <w:p>
+            <w:pPr>
+              <w:pStyle w:val="Compact"/>
+            </w:pPr>
+            <w:r>
+              <w:t xml:space="preserve">0.7508</w:t>
+            </w:r>
+          </w:p>
+        </w:tc>
+        <w:tc>
+          <w:tcPr/>
+          <w:p>
+            <w:pPr>
+              <w:pStyle w:val="Compact"/>
+            </w:pPr>
+            <w:r>
+              <w:t xml:space="preserve">87.52 %</w:t>
+            </w:r>
+          </w:p>
+        </w:tc>
+      </w:tr>
+      <w:tr>
+        <w:tc>
+          <w:tcPr/>
+          <w:p>
+            <w:pPr>
+              <w:pStyle w:val="Compact"/>
+            </w:pPr>
+            <w:r>
+              <w:t xml:space="preserve">2 LSTM layers</w:t>
+            </w:r>
+          </w:p>
+        </w:tc>
+        <w:tc>
+          <w:tcPr/>
+          <w:p>
+            <w:pPr>
+              <w:pStyle w:val="Compact"/>
+            </w:pPr>
+            <w:r>
+              <w:t xml:space="preserve">132,967</w:t>
+            </w:r>
+          </w:p>
+        </w:tc>
+        <w:tc>
+          <w:tcPr/>
+          <w:p>
+            <w:pPr>
+              <w:pStyle w:val="Compact"/>
+            </w:pPr>
+            <w:r>
+              <w:t xml:space="preserve">0.9565</w:t>
+            </w:r>
+          </w:p>
+        </w:tc>
+        <w:tc>
+          <w:tcPr/>
+          <w:p>
+            <w:pPr>
+              <w:pStyle w:val="Compact"/>
+            </w:pPr>
+            <w:r>
+              <w:t xml:space="preserve">0.9484</w:t>
+            </w:r>
+          </w:p>
+        </w:tc>
+        <w:tc>
+          <w:tcPr/>
+          <w:p>
+            <w:pPr>
+              <w:pStyle w:val="Compact"/>
+            </w:pPr>
+            <w:r>
+              <w:t xml:space="preserve">0.7486</w:t>
+            </w:r>
+          </w:p>
+        </w:tc>
+        <w:tc>
+          <w:tcPr/>
+          <w:p>
+            <w:pPr>
+              <w:pStyle w:val="Compact"/>
+            </w:pPr>
+            <w:r>
+              <w:t xml:space="preserve">87.33 %</w:t>
+            </w:r>
+          </w:p>
+        </w:tc>
+      </w:tr>
+    </w:tbl>
+    <w:p>
+      <w:pPr>
+        <w:pStyle w:val="BodyText"/>
+      </w:pPr>
+      <w:r>
+        <w:t xml:space="preserve">All five configurations fall within a validation AUC band of 0.9565–0.9588</w:t>
+      </w:r>
+      <w:r>
+        <w:t xml:space="preserve"> </w:t>
+      </w:r>
+      <w:r>
+        <w:t xml:space="preserve">(a spread of 0.0023, tighter even than Section 10.5.6’s RAM CNN sweep), again</w:t>
+      </w:r>
+      <w:r>
+        <w:t xml:space="preserve"> </w:t>
+      </w:r>
+      <w:r>
+        <w:t xml:space="preserve">well inside the established single-seed noise floor. The nominal winner by</w:t>
+      </w:r>
+      <w:r>
+        <w:t xml:space="preserve"> </w:t>
+      </w:r>
+      <w:r>
+        <w:t xml:space="preserve">the pre-specified rule (hidden width 64, val AUC 0.9588) is not a</w:t>
+      </w:r>
+      <w:r>
+        <w:t xml:space="preserve"> </w:t>
+      </w:r>
+      <w:r>
+        <w:t xml:space="preserve">meaningful improvement over the default. More notably, the default</w:t>
+      </w:r>
+      <w:r>
+        <w:t xml:space="preserve"> </w:t>
+      </w:r>
+      <w:r>
+        <w:t xml:space="preserve">configuration has the</w:t>
+      </w:r>
+      <w:r>
+        <w:t xml:space="preserve"> </w:t>
+      </w:r>
+      <w:r>
+        <w:rPr>
+          <w:i/>
+          <w:iCs/>
+        </w:rPr>
+        <w:t xml:space="preserve">best</w:t>
+      </w:r>
+      <w:r>
+        <w:t xml:space="preserve"> </w:t>
+      </w:r>
+      <w:r>
+        <w:t xml:space="preserve">test-set MCC and accuracy of all five</w:t>
+      </w:r>
+      <w:r>
+        <w:t xml:space="preserve"> </w:t>
+      </w:r>
+      <w:r>
+        <w:t xml:space="preserve">candidates despite ranking fourth of five on validation AUC — every</w:t>
+      </w:r>
+      <w:r>
+        <w:t xml:space="preserve"> </w:t>
+      </w:r>
+      <w:r>
+        <w:t xml:space="preserve">configuration the sweep would have nominally preferred by its own selection</w:t>
+      </w:r>
+      <w:r>
+        <w:t xml:space="preserve"> </w:t>
+      </w:r>
+      <w:r>
+        <w:t xml:space="preserve">rule scores worse on held-out test than the untouched default across MCC</w:t>
+      </w:r>
+      <w:r>
+        <w:t xml:space="preserve"> </w:t>
+      </w:r>
+      <w:r>
+        <w:t xml:space="preserve">and accuracy. This is a sharper illustration of the same point Section</w:t>
+      </w:r>
+      <w:r>
+        <w:t xml:space="preserve"> </w:t>
+      </w:r>
+      <w:r>
+        <w:t xml:space="preserve">10.5.6 made with the RAM CNN sweep: validation-based selection is not a</w:t>
+      </w:r>
+      <w:r>
+        <w:t xml:space="preserve"> </w:t>
+      </w:r>
+      <w:r>
+        <w:t xml:space="preserve">guarantee against picking a configuration that generalizes worse, only a</w:t>
+      </w:r>
+      <w:r>
+        <w:t xml:space="preserve"> </w:t>
+      </w:r>
+      <w:r>
+        <w:t xml:space="preserve">discipline against choosing one by looking at test results directly.</w:t>
+      </w:r>
+      <w:r>
+        <w:t xml:space="preserve"> </w:t>
+      </w:r>
+      <w:r>
+        <w:rPr>
+          <w:b/>
+          <w:bCs/>
+        </w:rPr>
+        <w:t xml:space="preserve">Neither the RAM CNN’s hyperparameters (Section 10.5.6) nor the LSTM</w:t>
+      </w:r>
+      <w:r>
+        <w:rPr>
+          <w:b/>
+          <w:bCs/>
+        </w:rPr>
+        <w:t xml:space="preserve"> </w:t>
+      </w:r>
+      <w:r>
+        <w:rPr>
+          <w:b/>
+          <w:bCs/>
+        </w:rPr>
+        <w:t xml:space="preserve">branch’s own hyperparameters reward tuning on this dataset; the established</w:t>
+      </w:r>
+      <w:r>
+        <w:rPr>
+          <w:b/>
+          <w:bCs/>
+        </w:rPr>
+        <w:t xml:space="preserve"> </w:t>
+      </w:r>
+      <w:r>
+        <w:rPr>
+          <w:b/>
+          <w:bCs/>
+        </w:rPr>
+        <w:t xml:space="preserve">defaults should be retained in both cases.</w:t>
+      </w:r>
+    </w:p>
+    <w:p>
+      <w:pPr>
+        <w:pStyle w:val="BodyText"/>
+      </w:pPr>
+      <w:r>
+        <w:rPr>
+          <w:b/>
+          <w:bCs/>
+        </w:rPr>
+        <w:t xml:space="preserve">Considered together with Sections 10.5.1–10.5.9, the single best-performing</w:t>
       </w:r>
       <w:r>
         <w:rPr>
@@ -17020,6 +18150,51 @@
       </w:r>
     </w:p>
     <w:p>
+      <w:pPr>
+        <w:pStyle w:val="Compact"/>
+        <w:numPr>
+          <w:ilvl w:val="0"/>
+          <w:numId w:val="1010"/>
+        </w:numPr>
+      </w:pPr>
+      <w:r>
+        <w:rPr>
+          <w:rStyle w:val="VerbatimChar"/>
+        </w:rPr>
+        <w:t xml:space="preserve">1d+aux</w:t>
+      </w:r>
+      <w:r>
+        <w:t xml:space="preserve"> </w:t>
+      </w:r>
+      <w:r>
+        <w:t xml:space="preserve">(Section 10.5.8) and the LSTM branch’s own hyperparameters</w:t>
+      </w:r>
+      <w:r>
+        <w:t xml:space="preserve"> </w:t>
+      </w:r>
+      <w:r>
+        <w:t xml:space="preserve">(Section 10.5.9) have now been evaluated; neither the CNN’s hyperparameters</w:t>
+      </w:r>
+      <w:r>
+        <w:t xml:space="preserve"> </w:t>
+      </w:r>
+      <w:r>
+        <w:t xml:space="preserve">(Section 10.5.6) nor the LSTM’s reward tuning on this dataset. This</w:t>
+      </w:r>
+      <w:r>
+        <w:t xml:space="preserve"> </w:t>
+      </w:r>
+      <w:r>
+        <w:t xml:space="preserve">narrows the plausible location of any remaining gap toward feature</w:t>
+      </w:r>
+      <w:r>
+        <w:t xml:space="preserve"> </w:t>
+      </w:r>
+      <w:r>
+        <w:t xml:space="preserve">representation rather than architecture search on either existing branch.</w:t>
+      </w:r>
+    </w:p>
+    <w:p>
       <w:r>
         <w:pict>
           <v:rect style="width:0;height:1.5pt" o:hralign="center" o:hrstd="t" o:hr="t"/>
@@ -18336,6 +19511,177 @@
           <w:rStyle w:val="CommentTok"/>
         </w:rPr>
         <w:t xml:space="preserve"># spectrogram + aux, no LSTM (Section 10.5.7)</w:t>
+      </w:r>
+      <w:r>
+        <w:br/>
+      </w:r>
+      <w:r>
+        <w:br/>
+      </w:r>
+      <w:r>
+        <w:rPr>
+          <w:rStyle w:val="ExtensionTok"/>
+        </w:rPr>
+        <w:t xml:space="preserve">python</w:t>
+      </w:r>
+      <w:r>
+        <w:rPr>
+          <w:rStyle w:val="NormalTok"/>
+        </w:rPr>
+        <w:t xml:space="preserve"> cnn_lstm_classify_aux.py </w:t>
+      </w:r>
+      <w:r>
+        <w:rPr>
+          <w:rStyle w:val="AttributeTok"/>
+        </w:rPr>
+        <w:t xml:space="preserve">--dataset-dir</w:t>
+      </w:r>
+      <w:r>
+        <w:rPr>
+          <w:rStyle w:val="NormalTok"/>
+        </w:rPr>
+        <w:t xml:space="preserve"> ../../data_downloader/dataset_dualaux_6s </w:t>
+      </w:r>
+      <w:r>
+        <w:rPr>
+          <w:rStyle w:val="DataTypeTok"/>
+        </w:rPr>
+        <w:t xml:space="preserve">\</w:t>
+      </w:r>
+      <w:r>
+        <w:br/>
+      </w:r>
+      <w:r>
+        <w:rPr>
+          <w:rStyle w:val="NormalTok"/>
+        </w:rPr>
+        <w:t xml:space="preserve">    </w:t>
+      </w:r>
+      <w:r>
+        <w:rPr>
+          <w:rStyle w:val="AttributeTok"/>
+        </w:rPr>
+        <w:t xml:space="preserve">--channels</w:t>
+      </w:r>
+      <w:r>
+        <w:rPr>
+          <w:rStyle w:val="NormalTok"/>
+        </w:rPr>
+        <w:t xml:space="preserve"> 1d+aux </w:t>
+      </w:r>
+      <w:r>
+        <w:rPr>
+          <w:rStyle w:val="AttributeTok"/>
+        </w:rPr>
+        <w:t xml:space="preserve">--batch-size</w:t>
+      </w:r>
+      <w:r>
+        <w:rPr>
+          <w:rStyle w:val="NormalTok"/>
+        </w:rPr>
+        <w:t xml:space="preserve"> 32               </w:t>
+      </w:r>
+      <w:r>
+        <w:rPr>
+          <w:rStyle w:val="CommentTok"/>
+        </w:rPr>
+        <w:t xml:space="preserve"># raw waveform + aux, no 2D branch (Section 10.5.8)</w:t>
+      </w:r>
+      <w:r>
+        <w:br/>
+      </w:r>
+      <w:r>
+        <w:br/>
+      </w:r>
+      <w:r>
+        <w:rPr>
+          <w:rStyle w:val="CommentTok"/>
+        </w:rPr>
+        <w:t xml:space="preserve"># LSTM branch hyperparameter sweep, isolated via --channels 1d+aux (Section 10.5.9)</w:t>
+      </w:r>
+      <w:r>
+        <w:br/>
+      </w:r>
+      <w:r>
+        <w:rPr>
+          <w:rStyle w:val="ExtensionTok"/>
+        </w:rPr>
+        <w:t xml:space="preserve">python</w:t>
+      </w:r>
+      <w:r>
+        <w:rPr>
+          <w:rStyle w:val="NormalTok"/>
+        </w:rPr>
+        <w:t xml:space="preserve"> cnn_lstm_classify_aux.py </w:t>
+      </w:r>
+      <w:r>
+        <w:rPr>
+          <w:rStyle w:val="AttributeTok"/>
+        </w:rPr>
+        <w:t xml:space="preserve">--dataset-dir</w:t>
+      </w:r>
+      <w:r>
+        <w:rPr>
+          <w:rStyle w:val="NormalTok"/>
+        </w:rPr>
+        <w:t xml:space="preserve"> ../../data_downloader/dataset_dualaux_6s </w:t>
+      </w:r>
+      <w:r>
+        <w:rPr>
+          <w:rStyle w:val="DataTypeTok"/>
+        </w:rPr>
+        <w:t xml:space="preserve">\</w:t>
+      </w:r>
+      <w:r>
+        <w:br/>
+      </w:r>
+      <w:r>
+        <w:rPr>
+          <w:rStyle w:val="NormalTok"/>
+        </w:rPr>
+        <w:t xml:space="preserve">    </w:t>
+      </w:r>
+      <w:r>
+        <w:rPr>
+          <w:rStyle w:val="AttributeTok"/>
+        </w:rPr>
+        <w:t xml:space="preserve">--channels</w:t>
+      </w:r>
+      <w:r>
+        <w:rPr>
+          <w:rStyle w:val="NormalTok"/>
+        </w:rPr>
+        <w:t xml:space="preserve"> 1d+aux </w:t>
+      </w:r>
+      <w:r>
+        <w:rPr>
+          <w:rStyle w:val="AttributeTok"/>
+        </w:rPr>
+        <w:t xml:space="preserve">--batch-size</w:t>
+      </w:r>
+      <w:r>
+        <w:rPr>
+          <w:rStyle w:val="NormalTok"/>
+        </w:rPr>
+        <w:t xml:space="preserve"> 32 </w:t>
+      </w:r>
+      <w:r>
+        <w:rPr>
+          <w:rStyle w:val="AttributeTok"/>
+        </w:rPr>
+        <w:t xml:space="preserve">--lstm-heads</w:t>
+      </w:r>
+      <w:r>
+        <w:rPr>
+          <w:rStyle w:val="NormalTok"/>
+        </w:rPr>
+        <w:t xml:space="preserve"> 2      </w:t>
+      </w:r>
+      <w:r>
+        <w:rPr>
+          <w:rStyle w:val="CommentTok"/>
+        </w:rPr>
+        <w:t xml:space="preserve"># or --lstm-heads 8 / --lstm-layers 2 / --hidden 64</w:t>
       </w:r>
       <w:r>
         <w:br/>

</xml_diff>

<commit_message>
Regenerate report.docx with 10.5.10-12
Co-Authored-By: Claude Sonnet 5 <noreply@anthropic.com>
</commit_message>
<xml_diff>
--- a/report.docx
+++ b/report.docx
@@ -17761,7 +17761,7 @@
           <w:b/>
           <w:bCs/>
         </w:rPr>
-        <w:t xml:space="preserve">Considered together with Sections 10.5.1–10.5.9, the single best-performing</w:t>
+        <w:t xml:space="preserve">10.5.10 Late-fusion stacking of the amplitude-augmented branches beats</w:t>
       </w:r>
       <w:r>
         <w:rPr>
@@ -17775,71 +17775,1518 @@
           <w:b/>
           <w:bCs/>
         </w:rPr>
-        <w:t xml:space="preserve">configuration measured in this entire investigation remains the plain</w:t>
-      </w:r>
+        <w:t xml:space="preserve">both linear and gated joint fusion, on both datasets.</w:t>
+      </w:r>
+      <w:r>
+        <w:t xml:space="preserve"> </w:t>
+      </w:r>
+      <w:r>
+        <w:rPr>
+          <w:rStyle w:val="VerbatimChar"/>
+        </w:rPr>
+        <w:t xml:space="preserve">cnn_lstm_stack_aux.py</w:t>
+      </w:r>
+      <w:r>
+        <w:t xml:space="preserve"> </w:t>
+      </w:r>
+      <w:r>
+        <w:t xml:space="preserve">(Section 10.3) applies the Section 10.4 stacking procedure to frozen</w:t>
+      </w:r>
+      <w:r>
+        <w:t xml:space="preserve"> </w:t>
+      </w:r>
+      <w:r>
+        <w:rPr>
+          <w:rStyle w:val="VerbatimChar"/>
+        </w:rPr>
+        <w:t xml:space="preserve">1d+aux</w:t>
+      </w:r>
+      <w:r>
+        <w:t xml:space="preserve">/</w:t>
+      </w:r>
+      <w:r>
+        <w:rPr>
+          <w:rStyle w:val="VerbatimChar"/>
+        </w:rPr>
+        <w:t xml:space="preserve">2d+aux</w:t>
+      </w:r>
+      <w:r>
+        <w:t xml:space="preserve"> </w:t>
+      </w:r>
+      <w:r>
+        <w:t xml:space="preserve">checkpoints instead of the plain ones:</w:t>
+      </w:r>
+    </w:p>
+    <w:tbl>
+      <w:tblPr>
+        <w:tblStyle w:val="Table"/>
+        <w:tblW w:type="pct" w:w="5000"/>
+        <w:tblLayout w:type="fixed"/>
+        <w:tblLook w:firstRow="1" w:lastRow="0" w:firstColumn="0" w:lastColumn="0" w:noHBand="0" w:noVBand="0" w:val="0020"/>
+      </w:tblPr>
+      <w:tblGrid>
+        <w:gridCol w:w="1320"/>
+        <w:gridCol w:w="1320"/>
+        <w:gridCol w:w="1320"/>
+        <w:gridCol w:w="1320"/>
+        <w:gridCol w:w="1320"/>
+        <w:gridCol w:w="1320"/>
+      </w:tblGrid>
+      <w:tr>
+        <w:trPr>
+          <w:tblHeader w:val="on"/>
+        </w:trPr>
+        <w:tc>
+          <w:tcPr/>
+          <w:p>
+            <w:pPr>
+              <w:pStyle w:val="Compact"/>
+            </w:pPr>
+            <w:r>
+              <w:t xml:space="preserve">Dataset</w:t>
+            </w:r>
+          </w:p>
+        </w:tc>
+        <w:tc>
+          <w:tcPr/>
+          <w:p>
+            <w:pPr>
+              <w:pStyle w:val="Compact"/>
+            </w:pPr>
+            <w:r>
+              <w:t xml:space="preserve">1d+aux alone</w:t>
+            </w:r>
+          </w:p>
+        </w:tc>
+        <w:tc>
+          <w:tcPr/>
+          <w:p>
+            <w:pPr>
+              <w:pStyle w:val="Compact"/>
+            </w:pPr>
+            <w:r>
+              <w:t xml:space="preserve">2d+aux alone</w:t>
+            </w:r>
+          </w:p>
+        </w:tc>
+        <w:tc>
+          <w:tcPr/>
+          <w:p>
+            <w:pPr>
+              <w:pStyle w:val="Compact"/>
+            </w:pPr>
+            <w:r>
+              <w:t xml:space="preserve">Stacked</w:t>
+            </w:r>
+          </w:p>
+        </w:tc>
+        <w:tc>
+          <w:tcPr/>
+          <w:p>
+            <w:pPr>
+              <w:pStyle w:val="Compact"/>
+            </w:pPr>
+            <w:r>
+              <w:t xml:space="preserve">Linear fusion (</w:t>
+            </w:r>
+            <w:r>
+              <w:rPr>
+                <w:rStyle w:val="VerbatimChar"/>
+              </w:rPr>
+              <w:t xml:space="preserve">all</w:t>
+            </w:r>
+            <w:r>
+              <w:t xml:space="preserve">)</w:t>
+            </w:r>
+          </w:p>
+        </w:tc>
+        <w:tc>
+          <w:tcPr/>
+          <w:p>
+            <w:pPr>
+              <w:pStyle w:val="Compact"/>
+            </w:pPr>
+            <w:r>
+              <w:t xml:space="preserve">Gated fusion (</w:t>
+            </w:r>
+            <w:r>
+              <w:rPr>
+                <w:rStyle w:val="VerbatimChar"/>
+              </w:rPr>
+              <w:t xml:space="preserve">all</w:t>
+            </w:r>
+            <w:r>
+              <w:t xml:space="preserve">)</w:t>
+            </w:r>
+          </w:p>
+        </w:tc>
+      </w:tr>
+      <w:tr>
+        <w:tc>
+          <w:tcPr/>
+          <w:p>
+            <w:pPr>
+              <w:pStyle w:val="Compact"/>
+            </w:pPr>
+            <w:r>
+              <w:t xml:space="preserve">RAM+aux</w:t>
+            </w:r>
+          </w:p>
+        </w:tc>
+        <w:tc>
+          <w:tcPr/>
+          <w:p>
+            <w:pPr>
+              <w:pStyle w:val="Compact"/>
+            </w:pPr>
+            <w:r>
+              <w:t xml:space="preserve">AUC 0.9505, MCC 0.768, 88.39 %</w:t>
+            </w:r>
+          </w:p>
+        </w:tc>
+        <w:tc>
+          <w:tcPr/>
+          <w:p>
+            <w:pPr>
+              <w:pStyle w:val="Compact"/>
+            </w:pPr>
+            <w:r>
+              <w:t xml:space="preserve">AUC 0.9468, MCC 0.778, 88.84 %</w:t>
+            </w:r>
+          </w:p>
+        </w:tc>
+        <w:tc>
+          <w:tcPr/>
+          <w:p>
+            <w:pPr>
+              <w:pStyle w:val="Compact"/>
+            </w:pPr>
+            <w:r>
+              <w:rPr>
+                <w:b/>
+                <w:bCs/>
+              </w:rPr>
+              <w:t xml:space="preserve">AUC 0.9557, MCC 0.781, 89.07 %</w:t>
+            </w:r>
+          </w:p>
+        </w:tc>
+        <w:tc>
+          <w:tcPr/>
+          <w:p>
+            <w:pPr>
+              <w:pStyle w:val="Compact"/>
+            </w:pPr>
+            <w:r>
+              <w:t xml:space="preserve">AUC 0.9514, MCC 0.779, 88.95 %</w:t>
+            </w:r>
+          </w:p>
+        </w:tc>
+        <w:tc>
+          <w:tcPr/>
+          <w:p>
+            <w:pPr>
+              <w:pStyle w:val="Compact"/>
+            </w:pPr>
+            <w:r>
+              <w:t xml:space="preserve">AUC 0.9487, MCC 0.744, 87.12 %</w:t>
+            </w:r>
+          </w:p>
+        </w:tc>
+      </w:tr>
+      <w:tr>
+        <w:tc>
+          <w:tcPr/>
+          <w:p>
+            <w:pPr>
+              <w:pStyle w:val="Compact"/>
+            </w:pPr>
+            <w:r>
+              <w:t xml:space="preserve">Spectrogram+aux</w:t>
+            </w:r>
+          </w:p>
+        </w:tc>
+        <w:tc>
+          <w:tcPr/>
+          <w:p>
+            <w:pPr>
+              <w:pStyle w:val="Compact"/>
+            </w:pPr>
+            <w:r>
+              <w:t xml:space="preserve">AUC 0.9505, MCC 0.768, 88.39 %</w:t>
+            </w:r>
+          </w:p>
+        </w:tc>
+        <w:tc>
+          <w:tcPr/>
+          <w:p>
+            <w:pPr>
+              <w:pStyle w:val="Compact"/>
+            </w:pPr>
+            <w:r>
+              <w:t xml:space="preserve">AUC 0.9749, MCC 0.863, 93.02 %</w:t>
+            </w:r>
+          </w:p>
+        </w:tc>
+        <w:tc>
+          <w:tcPr/>
+          <w:p>
+            <w:pPr>
+              <w:pStyle w:val="Compact"/>
+            </w:pPr>
+            <w:r>
+              <w:rPr>
+                <w:b/>
+                <w:bCs/>
+              </w:rPr>
+              <w:t xml:space="preserve">AUC 0.9758, MCC 0.868, 93.37 %</w:t>
+            </w:r>
+          </w:p>
+        </w:tc>
+        <w:tc>
+          <w:tcPr/>
+          <w:p>
+            <w:pPr>
+              <w:pStyle w:val="Compact"/>
+            </w:pPr>
+            <w:r>
+              <w:t xml:space="preserve">AUC 0.9733, MCC 0.847, 92.31 %</w:t>
+            </w:r>
+          </w:p>
+        </w:tc>
+        <w:tc>
+          <w:tcPr/>
+          <w:p>
+            <w:pPr>
+              <w:pStyle w:val="Compact"/>
+            </w:pPr>
+            <w:r>
+              <w:t xml:space="preserve">AUC 0.9716, MCC 0.836, 91.80 %</w:t>
+            </w:r>
+          </w:p>
+        </w:tc>
+      </w:tr>
+    </w:tbl>
+    <w:p>
+      <w:pPr>
+        <w:pStyle w:val="BodyText"/>
+      </w:pPr>
+      <w:r>
+        <w:t xml:space="preserve">On both datasets, stacking is the best fusion mechanism tested among the</w:t>
+      </w:r>
+      <w:r>
+        <w:t xml:space="preserve"> </w:t>
+      </w:r>
+      <w:r>
+        <w:t xml:space="preserve">three (linear, gated, stacked) once the amplitude input is present —</w:t>
+      </w:r>
+      <w:r>
+        <w:t xml:space="preserve"> </w:t>
+      </w:r>
+      <w:r>
+        <w:t xml:space="preserve">consistent with Section 10.5.2’s finding on the non-aux branches, where</w:t>
+      </w:r>
+      <w:r>
+        <w:t xml:space="preserve"> </w:t>
+      </w:r>
+      <w:r>
+        <w:t xml:space="preserve">stacking also matched or beat joint fusion. Stacking on RAM+aux is a clear</w:t>
+      </w:r>
+      <w:r>
+        <w:t xml:space="preserve"> </w:t>
+      </w:r>
+      <w:r>
+        <w:t xml:space="preserve">win over every alternative on every metric. Stacking on spectrogram+aux is</w:t>
+      </w:r>
+      <w:r>
+        <w:t xml:space="preserve"> </w:t>
+      </w:r>
+      <w:r>
+        <w:t xml:space="preserve">the best fusion mechanism but does not surpass the plain</w:t>
+      </w:r>
+      <w:r>
+        <w:t xml:space="preserve"> </w:t>
+      </w:r>
+      <w:r>
+        <w:rPr>
+          <w:rStyle w:val="VerbatimChar"/>
+        </w:rPr>
+        <w:t xml:space="preserve">2d</w:t>
+      </w:r>
+      <w:r>
+        <w:t xml:space="preserve">-alone,</w:t>
+      </w:r>
+      <w:r>
+        <w:t xml:space="preserve"> </w:t>
+      </w:r>
+      <w:r>
+        <w:t xml:space="preserve">no-aux ceiling (0.9793 AUC, Section 10.4) — no fusion mechanism has yet</w:t>
+      </w:r>
+      <w:r>
+        <w:t xml:space="preserve"> </w:t>
+      </w:r>
+      <w:r>
+        <w:t xml:space="preserve">closed that gap.</w:t>
+      </w:r>
+    </w:p>
+    <w:p>
+      <w:pPr>
+        <w:pStyle w:val="BodyText"/>
+      </w:pPr>
       <w:r>
         <w:rPr>
           <w:b/>
           <w:bCs/>
         </w:rPr>
-        <w:t xml:space="preserve"> </w:t>
+        <w:t xml:space="preserve">10.5.11 Combining two independently helpful interventions does not</w:t>
       </w:r>
       <w:r>
         <w:rPr>
           <w:b/>
           <w:bCs/>
         </w:rPr>
-        <w:t xml:space="preserve">spectrogram CNN classifier, with no LSTM branch, no auxiliary input, and no</w:t>
+        <w:t xml:space="preserve"> </w:t>
       </w:r>
       <w:r>
         <w:rPr>
           <w:b/>
           <w:bCs/>
         </w:rPr>
-        <w:t xml:space="preserve"> </w:t>
-      </w:r>
+        <w:t xml:space="preserve">compound, and mildly hurts.</w:t>
+      </w:r>
+      <w:r>
+        <w:t xml:space="preserve"> </w:t>
+      </w:r>
+      <w:r>
+        <w:t xml:space="preserve">Gated fusion (Section 10.5.5) and the</w:t>
+      </w:r>
+      <w:r>
+        <w:t xml:space="preserve"> </w:t>
+      </w:r>
+      <w:r>
+        <w:t xml:space="preserve">amplitude auxiliary input (Section 10.5.3) each measurably improved</w:t>
+      </w:r>
+      <w:r>
+        <w:t xml:space="preserve"> </w:t>
+      </w:r>
+      <w:r>
+        <w:t xml:space="preserve">results on their own. Combined — gated fusion applied to the</w:t>
+      </w:r>
+      <w:r>
+        <w:t xml:space="preserve"> </w:t>
+      </w:r>
+      <w:r>
+        <w:t xml:space="preserve">amplitude-augmented spectrogram-dual model — the result is worse than</w:t>
+      </w:r>
+      <w:r>
+        <w:t xml:space="preserve"> </w:t>
+      </w:r>
+      <w:r>
+        <w:t xml:space="preserve">either intervention alone: AUC 0.9716, versus gated-fusion-without-aux’s</w:t>
+      </w:r>
+      <w:r>
+        <w:t xml:space="preserve"> </w:t>
+      </w:r>
+      <w:r>
+        <w:t xml:space="preserve">0.9761 and linear-fusion-with-aux’s 0.9733. This is a useful negative</w:t>
+      </w:r>
+      <w:r>
+        <w:t xml:space="preserve"> </w:t>
+      </w:r>
+      <w:r>
+        <w:t xml:space="preserve">result: independently validated improvements do not automatically compose,</w:t>
+      </w:r>
+      <w:r>
+        <w:t xml:space="preserve"> </w:t>
+      </w:r>
+      <w:r>
+        <w:t xml:space="preserve">and each combination has to be measured rather than assumed. The three</w:t>
+      </w:r>
+      <w:r>
+        <w:t xml:space="preserve"> </w:t>
+      </w:r>
+      <w:r>
+        <w:t xml:space="preserve">fusion mechanisms tested on the amplitude-augmented spectrogram-dual model</w:t>
+      </w:r>
+      <w:r>
+        <w:t xml:space="preserve"> </w:t>
+      </w:r>
+      <w:r>
+        <w:t xml:space="preserve">now rank, by AUC: stacked (0.9758) &gt; linear (0.9733) &gt; gated (0.9716) — the</w:t>
+      </w:r>
+      <w:r>
+        <w:t xml:space="preserve"> </w:t>
+      </w:r>
+      <w:r>
+        <w:t xml:space="preserve">reverse of gated fusion’s ranking on the same 2D representation without</w:t>
+      </w:r>
+      <w:r>
+        <w:t xml:space="preserve"> </w:t>
+      </w:r>
+      <w:r>
+        <w:t xml:space="preserve">aux (Section 10.5.5), where gated fusion was the best of the three.</w:t>
+      </w:r>
+    </w:p>
+    <w:p>
+      <w:pPr>
+        <w:pStyle w:val="BodyText"/>
+      </w:pPr>
       <w:r>
         <w:rPr>
           <w:b/>
           <w:bCs/>
         </w:rPr>
-        <w:t xml:space="preserve">fusion mechanism (AUC 0.9793).</w:t>
-      </w:r>
-      <w:r>
-        <w:t xml:space="preserve"> </w:t>
-      </w:r>
-      <w:r>
-        <w:t xml:space="preserve">Every structural addition tested — the</w:t>
-      </w:r>
-      <w:r>
-        <w:t xml:space="preserve"> </w:t>
-      </w:r>
-      <w:r>
-        <w:t xml:space="preserve">source paper’s dual-channel architecture, the amplitude auxiliary input,</w:t>
-      </w:r>
-      <w:r>
-        <w:t xml:space="preserve"> </w:t>
-      </w:r>
-      <w:r>
-        <w:t xml:space="preserve">gated fusion, late-fusion stacking — improved on some other configuration</w:t>
-      </w:r>
-      <w:r>
-        <w:t xml:space="preserve"> </w:t>
-      </w:r>
-      <w:r>
-        <w:t xml:space="preserve">along the way, and each produced a genuine, informative finding about why</w:t>
-      </w:r>
-      <w:r>
-        <w:t xml:space="preserve"> </w:t>
-      </w:r>
-      <w:r>
-        <w:t xml:space="preserve">RAM underperforms and how fusion mechanisms behave. None of them, individually</w:t>
-      </w:r>
-      <w:r>
-        <w:t xml:space="preserve"> </w:t>
-      </w:r>
-      <w:r>
-        <w:t xml:space="preserve">or in combination, has yet exceeded the simplest model in this comparison.</w:t>
+        <w:t xml:space="preserve">10.5.12 Seed-repeated verification of the two closest single-seed</w:t>
+      </w:r>
+      <w:r>
+        <w:rPr>
+          <w:b/>
+          <w:bCs/>
+        </w:rPr>
+        <w:t xml:space="preserve"> </w:t>
+      </w:r>
+      <w:r>
+        <w:rPr>
+          <w:b/>
+          <w:bCs/>
+        </w:rPr>
+        <w:t xml:space="preserve">claims changes the reported conclusion for one of them.</w:t>
+      </w:r>
+      <w:r>
+        <w:t xml:space="preserve"> </w:t>
+      </w:r>
+      <w:r>
+        <w:t xml:space="preserve">Sections 10.5.5</w:t>
+      </w:r>
+      <w:r>
+        <w:t xml:space="preserve"> </w:t>
+      </w:r>
+      <w:r>
+        <w:t xml:space="preserve">and 10.5.7 each rested on a single train/validation/test split. Both were</w:t>
+      </w:r>
+      <w:r>
+        <w:t xml:space="preserve"> </w:t>
+      </w:r>
+      <w:r>
+        <w:t xml:space="preserve">re-run at two additional seeds (1 and 2, alongside the original 42) to</w:t>
+      </w:r>
+      <w:r>
+        <w:t xml:space="preserve"> </w:t>
+      </w:r>
+      <w:r>
+        <w:t xml:space="preserve">check whether the claimed improvements survive repetition.</w:t>
+      </w:r>
+    </w:p>
+    <w:p>
+      <w:pPr>
+        <w:pStyle w:val="BodyText"/>
+      </w:pPr>
+      <w:r>
+        <w:rPr>
+          <w:i/>
+          <w:iCs/>
+        </w:rPr>
+        <w:t xml:space="preserve">Gated vs. linear fusion, spectrogram-dual, no aux (Section 10.5.5):</w:t>
+      </w:r>
+    </w:p>
+    <w:tbl>
+      <w:tblPr>
+        <w:tblStyle w:val="Table"/>
+        <w:tblW w:type="pct" w:w="5000"/>
+        <w:tblLayout w:type="fixed"/>
+        <w:tblLook w:firstRow="1" w:lastRow="0" w:firstColumn="0" w:lastColumn="0" w:noHBand="0" w:noVBand="0" w:val="0020"/>
+      </w:tblPr>
+      <w:tblGrid>
+        <w:gridCol w:w="1980"/>
+        <w:gridCol w:w="1980"/>
+        <w:gridCol w:w="1980"/>
+        <w:gridCol w:w="1980"/>
+      </w:tblGrid>
+      <w:tr>
+        <w:trPr>
+          <w:tblHeader w:val="on"/>
+        </w:trPr>
+        <w:tc>
+          <w:tcPr/>
+          <w:p>
+            <w:pPr>
+              <w:pStyle w:val="Compact"/>
+            </w:pPr>
+            <w:r>
+              <w:t xml:space="preserve">Seed</w:t>
+            </w:r>
+          </w:p>
+        </w:tc>
+        <w:tc>
+          <w:tcPr/>
+          <w:p>
+            <w:pPr>
+              <w:pStyle w:val="Compact"/>
+            </w:pPr>
+            <w:r>
+              <w:t xml:space="preserve">Linear AUC / MCC / Acc</w:t>
+            </w:r>
+          </w:p>
+        </w:tc>
+        <w:tc>
+          <w:tcPr/>
+          <w:p>
+            <w:pPr>
+              <w:pStyle w:val="Compact"/>
+            </w:pPr>
+            <w:r>
+              <w:t xml:space="preserve">Gated AUC / MCC / Acc</w:t>
+            </w:r>
+          </w:p>
+        </w:tc>
+        <w:tc>
+          <w:tcPr/>
+          <w:p>
+            <w:pPr>
+              <w:pStyle w:val="Compact"/>
+            </w:pPr>
+            <w:r>
+              <w:t xml:space="preserve">Gated − Linear (AUC)</w:t>
+            </w:r>
+          </w:p>
+        </w:tc>
+      </w:tr>
+      <w:tr>
+        <w:tc>
+          <w:tcPr/>
+          <w:p>
+            <w:pPr>
+              <w:pStyle w:val="Compact"/>
+            </w:pPr>
+            <w:r>
+              <w:t xml:space="preserve">42</w:t>
+            </w:r>
+          </w:p>
+        </w:tc>
+        <w:tc>
+          <w:tcPr/>
+          <w:p>
+            <w:pPr>
+              <w:pStyle w:val="Compact"/>
+            </w:pPr>
+            <w:r>
+              <w:t xml:space="preserve">0.9646 / 0.812 / 90.61 %</w:t>
+            </w:r>
+          </w:p>
+        </w:tc>
+        <w:tc>
+          <w:tcPr/>
+          <w:p>
+            <w:pPr>
+              <w:pStyle w:val="Compact"/>
+            </w:pPr>
+            <w:r>
+              <w:t xml:space="preserve">0.9761 / 0.850 / 92.51 %</w:t>
+            </w:r>
+          </w:p>
+        </w:tc>
+        <w:tc>
+          <w:tcPr/>
+          <w:p>
+            <w:pPr>
+              <w:pStyle w:val="Compact"/>
+            </w:pPr>
+            <w:r>
+              <w:t xml:space="preserve">+0.0115</w:t>
+            </w:r>
+          </w:p>
+        </w:tc>
+      </w:tr>
+      <w:tr>
+        <w:tc>
+          <w:tcPr/>
+          <w:p>
+            <w:pPr>
+              <w:pStyle w:val="Compact"/>
+            </w:pPr>
+            <w:r>
+              <w:t xml:space="preserve">1</w:t>
+            </w:r>
+          </w:p>
+        </w:tc>
+        <w:tc>
+          <w:tcPr/>
+          <w:p>
+            <w:pPr>
+              <w:pStyle w:val="Compact"/>
+            </w:pPr>
+            <w:r>
+              <w:t xml:space="preserve">0.9719 / 0.848 / 92.32 %</w:t>
+            </w:r>
+          </w:p>
+        </w:tc>
+        <w:tc>
+          <w:tcPr/>
+          <w:p>
+            <w:pPr>
+              <w:pStyle w:val="Compact"/>
+            </w:pPr>
+            <w:r>
+              <w:t xml:space="preserve">0.9753 / 0.851 / 92.53 %</w:t>
+            </w:r>
+          </w:p>
+        </w:tc>
+        <w:tc>
+          <w:tcPr/>
+          <w:p>
+            <w:pPr>
+              <w:pStyle w:val="Compact"/>
+            </w:pPr>
+            <w:r>
+              <w:t xml:space="preserve">+0.0034</w:t>
+            </w:r>
+          </w:p>
+        </w:tc>
+      </w:tr>
+      <w:tr>
+        <w:tc>
+          <w:tcPr/>
+          <w:p>
+            <w:pPr>
+              <w:pStyle w:val="Compact"/>
+            </w:pPr>
+            <w:r>
+              <w:t xml:space="preserve">2</w:t>
+            </w:r>
+          </w:p>
+        </w:tc>
+        <w:tc>
+          <w:tcPr/>
+          <w:p>
+            <w:pPr>
+              <w:pStyle w:val="Compact"/>
+            </w:pPr>
+            <w:r>
+              <w:t xml:space="preserve">0.9746 / 0.834 / 91.68 %</w:t>
+            </w:r>
+          </w:p>
+        </w:tc>
+        <w:tc>
+          <w:tcPr/>
+          <w:p>
+            <w:pPr>
+              <w:pStyle w:val="Compact"/>
+            </w:pPr>
+            <w:r>
+              <w:t xml:space="preserve">0.9720 / 0.849 / 92.36 %</w:t>
+            </w:r>
+          </w:p>
+        </w:tc>
+        <w:tc>
+          <w:tcPr/>
+          <w:p>
+            <w:pPr>
+              <w:pStyle w:val="Compact"/>
+            </w:pPr>
+            <w:r>
+              <w:rPr>
+                <w:b/>
+                <w:bCs/>
+              </w:rPr>
+              <w:t xml:space="preserve">−0.0026</w:t>
+            </w:r>
+          </w:p>
+        </w:tc>
+      </w:tr>
+    </w:tbl>
+    <w:p>
+      <w:pPr>
+        <w:pStyle w:val="BodyText"/>
+      </w:pPr>
+      <w:r>
+        <w:t xml:space="preserve">The AUC advantage is not robust — it reverses sign at seed 2, and its</w:t>
+      </w:r>
+      <w:r>
+        <w:t xml:space="preserve"> </w:t>
+      </w:r>
+      <w:r>
+        <w:t xml:space="preserve">magnitude at seed 1 is roughly a third of the original single-seed figure.</w:t>
+      </w:r>
+      <w:r>
+        <w:t xml:space="preserve"> </w:t>
+      </w:r>
+      <w:r>
+        <w:t xml:space="preserve">Averaged across the three seeds, gated fusion still leads on AUC (mean</w:t>
+      </w:r>
+      <w:r>
+        <w:t xml:space="preserve"> </w:t>
+      </w:r>
+      <w:r>
+        <w:t xml:space="preserve">0.9745 vs. 0.9704), but the effect is smaller and noisier than Section</w:t>
+      </w:r>
+      <w:r>
+        <w:t xml:space="preserve"> </w:t>
+      </w:r>
+      <w:r>
+        <w:t xml:space="preserve">10.5.5 reported. Accuracy and MCC tell a more consistent story: gated</w:t>
+      </w:r>
+      <w:r>
+        <w:t xml:space="preserve"> </w:t>
+      </w:r>
+      <w:r>
+        <w:t xml:space="preserve">fusion wins on</w:t>
+      </w:r>
+      <w:r>
+        <w:t xml:space="preserve"> </w:t>
+      </w:r>
+      <w:r>
+        <w:rPr>
+          <w:b/>
+          <w:bCs/>
+        </w:rPr>
+        <w:t xml:space="preserve">both</w:t>
+      </w:r>
+      <w:r>
+        <w:t xml:space="preserve"> </w:t>
+      </w:r>
+      <w:r>
+        <w:t xml:space="preserve">metrics at</w:t>
+      </w:r>
+      <w:r>
+        <w:t xml:space="preserve"> </w:t>
+      </w:r>
+      <w:r>
+        <w:rPr>
+          <w:b/>
+          <w:bCs/>
+        </w:rPr>
+        <w:t xml:space="preserve">all three</w:t>
+      </w:r>
+      <w:r>
+        <w:t xml:space="preserve"> </w:t>
+      </w:r>
+      <w:r>
+        <w:t xml:space="preserve">seeds, and does so with</w:t>
+      </w:r>
+      <w:r>
+        <w:t xml:space="preserve"> </w:t>
+      </w:r>
+      <w:r>
+        <w:t xml:space="preserve">much lower run-to-run spread (accuracy range 92.36–92.53 %, a spread of</w:t>
+      </w:r>
+      <w:r>
+        <w:t xml:space="preserve"> </w:t>
+      </w:r>
+      <w:r>
+        <w:t xml:space="preserve">0.17 points, versus linear fusion’s 90.61–92.32 %, a spread of 1.71</w:t>
+      </w:r>
+      <w:r>
+        <w:t xml:space="preserve"> </w:t>
+      </w:r>
+      <w:r>
+        <w:t xml:space="preserve">points; MCC spread 0.002 vs. 0.036). The corrected finding is therefore</w:t>
+      </w:r>
+      <w:r>
+        <w:t xml:space="preserve"> </w:t>
+      </w:r>
+      <w:r>
+        <w:t xml:space="preserve">not</w:t>
+      </w:r>
+      <w:r>
+        <w:t xml:space="preserve"> </w:t>
+      </w:r>
+      <w:r>
+        <w:t xml:space="preserve">“gated fusion is a clear AUC win”</w:t>
+      </w:r>
+      <w:r>
+        <w:t xml:space="preserve"> </w:t>
+      </w:r>
+      <w:r>
+        <w:t xml:space="preserve">but</w:t>
+      </w:r>
+      <w:r>
+        <w:t xml:space="preserve"> </w:t>
+      </w:r>
+      <w:r>
+        <w:rPr>
+          <w:b/>
+          <w:bCs/>
+        </w:rPr>
+        <w:t xml:space="preserve">“gated fusion gives more</w:t>
+      </w:r>
+      <w:r>
+        <w:rPr>
+          <w:b/>
+          <w:bCs/>
+        </w:rPr>
+        <w:t xml:space="preserve"> </w:t>
+      </w:r>
+      <w:r>
+        <w:rPr>
+          <w:b/>
+          <w:bCs/>
+        </w:rPr>
+        <w:t xml:space="preserve">consistent, slightly better decisions at the operating threshold, with a</w:t>
+      </w:r>
+      <w:r>
+        <w:rPr>
+          <w:b/>
+          <w:bCs/>
+        </w:rPr>
+        <w:t xml:space="preserve"> </w:t>
+      </w:r>
+      <w:r>
+        <w:rPr>
+          <w:b/>
+          <w:bCs/>
+        </w:rPr>
+        <w:t xml:space="preserve">real but small and noisy ranking-quality advantage”</w:t>
+      </w:r>
+      <w:r>
+        <w:t xml:space="preserve"> </w:t>
+      </w:r>
+      <w:r>
+        <w:t xml:space="preserve">— a materially</w:t>
+      </w:r>
+      <w:r>
+        <w:t xml:space="preserve"> </w:t>
+      </w:r>
+      <w:r>
+        <w:t xml:space="preserve">weaker and more precise claim than Section 10.5.5’s original framing.</w:t>
+      </w:r>
+    </w:p>
+    <w:p>
+      <w:pPr>
+        <w:pStyle w:val="BodyText"/>
+      </w:pPr>
+      <w:r>
+        <w:rPr>
+          <w:i/>
+          <w:iCs/>
+        </w:rPr>
+        <w:t xml:space="preserve">Amplitude aux vs. no aux, spectrogram-dual, linear fusion (Section 10.5.7):</w:t>
+      </w:r>
+    </w:p>
+    <w:tbl>
+      <w:tblPr>
+        <w:tblStyle w:val="Table"/>
+        <w:tblW w:type="pct" w:w="5000"/>
+        <w:tblLayout w:type="fixed"/>
+        <w:tblLook w:firstRow="1" w:lastRow="0" w:firstColumn="0" w:lastColumn="0" w:noHBand="0" w:noVBand="0" w:val="0020"/>
+      </w:tblPr>
+      <w:tblGrid>
+        <w:gridCol w:w="1980"/>
+        <w:gridCol w:w="1980"/>
+        <w:gridCol w:w="1980"/>
+        <w:gridCol w:w="1980"/>
+      </w:tblGrid>
+      <w:tr>
+        <w:trPr>
+          <w:tblHeader w:val="on"/>
+        </w:trPr>
+        <w:tc>
+          <w:tcPr/>
+          <w:p>
+            <w:pPr>
+              <w:pStyle w:val="Compact"/>
+            </w:pPr>
+            <w:r>
+              <w:t xml:space="preserve">Seed</w:t>
+            </w:r>
+          </w:p>
+        </w:tc>
+        <w:tc>
+          <w:tcPr/>
+          <w:p>
+            <w:pPr>
+              <w:pStyle w:val="Compact"/>
+            </w:pPr>
+            <w:r>
+              <w:t xml:space="preserve">No-aux AUC / MCC / Acc</w:t>
+            </w:r>
+          </w:p>
+        </w:tc>
+        <w:tc>
+          <w:tcPr/>
+          <w:p>
+            <w:pPr>
+              <w:pStyle w:val="Compact"/>
+            </w:pPr>
+            <w:r>
+              <w:t xml:space="preserve">Aux AUC / MCC / Acc</w:t>
+            </w:r>
+          </w:p>
+        </w:tc>
+        <w:tc>
+          <w:tcPr/>
+          <w:p>
+            <w:pPr>
+              <w:pStyle w:val="Compact"/>
+            </w:pPr>
+            <w:r>
+              <w:t xml:space="preserve">Aux − No-aux (AUC)</w:t>
+            </w:r>
+          </w:p>
+        </w:tc>
+      </w:tr>
+      <w:tr>
+        <w:tc>
+          <w:tcPr/>
+          <w:p>
+            <w:pPr>
+              <w:pStyle w:val="Compact"/>
+            </w:pPr>
+            <w:r>
+              <w:t xml:space="preserve">42</w:t>
+            </w:r>
+          </w:p>
+        </w:tc>
+        <w:tc>
+          <w:tcPr/>
+          <w:p>
+            <w:pPr>
+              <w:pStyle w:val="Compact"/>
+            </w:pPr>
+            <w:r>
+              <w:t xml:space="preserve">0.9646 / 0.812 / 90.61 %</w:t>
+            </w:r>
+          </w:p>
+        </w:tc>
+        <w:tc>
+          <w:tcPr/>
+          <w:p>
+            <w:pPr>
+              <w:pStyle w:val="Compact"/>
+            </w:pPr>
+            <w:r>
+              <w:t xml:space="preserve">0.9733 / 0.847 / 92.31 %</w:t>
+            </w:r>
+          </w:p>
+        </w:tc>
+        <w:tc>
+          <w:tcPr/>
+          <w:p>
+            <w:pPr>
+              <w:pStyle w:val="Compact"/>
+            </w:pPr>
+            <w:r>
+              <w:t xml:space="preserve">+0.0087</w:t>
+            </w:r>
+          </w:p>
+        </w:tc>
+      </w:tr>
+      <w:tr>
+        <w:tc>
+          <w:tcPr/>
+          <w:p>
+            <w:pPr>
+              <w:pStyle w:val="Compact"/>
+            </w:pPr>
+            <w:r>
+              <w:t xml:space="preserve">1</w:t>
+            </w:r>
+          </w:p>
+        </w:tc>
+        <w:tc>
+          <w:tcPr/>
+          <w:p>
+            <w:pPr>
+              <w:pStyle w:val="Compact"/>
+            </w:pPr>
+            <w:r>
+              <w:t xml:space="preserve">0.9719 / 0.848 / 92.32 %</w:t>
+            </w:r>
+          </w:p>
+        </w:tc>
+        <w:tc>
+          <w:tcPr/>
+          <w:p>
+            <w:pPr>
+              <w:pStyle w:val="Compact"/>
+            </w:pPr>
+            <w:r>
+              <w:t xml:space="preserve">0.9707 / 0.841 / 92.01 %</w:t>
+            </w:r>
+          </w:p>
+        </w:tc>
+        <w:tc>
+          <w:tcPr/>
+          <w:p>
+            <w:pPr>
+              <w:pStyle w:val="Compact"/>
+            </w:pPr>
+            <w:r>
+              <w:rPr>
+                <w:b/>
+                <w:bCs/>
+              </w:rPr>
+              <w:t xml:space="preserve">−0.0012</w:t>
+            </w:r>
+          </w:p>
+        </w:tc>
+      </w:tr>
+      <w:tr>
+        <w:tc>
+          <w:tcPr/>
+          <w:p>
+            <w:pPr>
+              <w:pStyle w:val="Compact"/>
+            </w:pPr>
+            <w:r>
+              <w:t xml:space="preserve">2</w:t>
+            </w:r>
+          </w:p>
+        </w:tc>
+        <w:tc>
+          <w:tcPr/>
+          <w:p>
+            <w:pPr>
+              <w:pStyle w:val="Compact"/>
+            </w:pPr>
+            <w:r>
+              <w:t xml:space="preserve">0.9746 / 0.834 / 91.68 %</w:t>
+            </w:r>
+          </w:p>
+        </w:tc>
+        <w:tc>
+          <w:tcPr/>
+          <w:p>
+            <w:pPr>
+              <w:pStyle w:val="Compact"/>
+            </w:pPr>
+            <w:r>
+              <w:t xml:space="preserve">0.9705 / 0.834 / 91.66 %</w:t>
+            </w:r>
+          </w:p>
+        </w:tc>
+        <w:tc>
+          <w:tcPr/>
+          <w:p>
+            <w:pPr>
+              <w:pStyle w:val="Compact"/>
+            </w:pPr>
+            <w:r>
+              <w:rPr>
+                <w:b/>
+                <w:bCs/>
+              </w:rPr>
+              <w:t xml:space="preserve">−0.0041</w:t>
+            </w:r>
+          </w:p>
+        </w:tc>
+      </w:tr>
+    </w:tbl>
+    <w:p>
+      <w:pPr>
+        <w:pStyle w:val="BodyText"/>
+      </w:pPr>
+      <w:r>
+        <w:t xml:space="preserve">This result does not merely shrink — it reverses and averages out to</w:t>
+      </w:r>
+      <w:r>
+        <w:t xml:space="preserve"> </w:t>
+      </w:r>
+      <w:r>
+        <w:t xml:space="preserve">approximately zero (mean AUC difference +0.0011 across the three seeds).</w:t>
+      </w:r>
+      <w:r>
+        <w:t xml:space="preserve"> </w:t>
+      </w:r>
+      <w:r>
+        <w:rPr>
+          <w:b/>
+          <w:bCs/>
+        </w:rPr>
+        <w:t xml:space="preserve">Section 10.5.7’s claim that the amplitude auxiliary input improves the</w:t>
+      </w:r>
+      <w:r>
+        <w:rPr>
+          <w:b/>
+          <w:bCs/>
+        </w:rPr>
+        <w:t xml:space="preserve"> </w:t>
+      </w:r>
+      <w:r>
+        <w:rPr>
+          <w:b/>
+          <w:bCs/>
+        </w:rPr>
+        <w:t xml:space="preserve">fused linear model does not survive repetition; the original single-seed</w:t>
+      </w:r>
+      <w:r>
+        <w:rPr>
+          <w:b/>
+          <w:bCs/>
+        </w:rPr>
+        <w:t xml:space="preserve"> </w:t>
+      </w:r>
+      <w:r>
+        <w:rPr>
+          <w:b/>
+          <w:bCs/>
+        </w:rPr>
+        <w:t xml:space="preserve">result at seed 42 was not representative.</w:t>
+      </w:r>
+      <w:r>
+        <w:t xml:space="preserve"> </w:t>
+      </w:r>
+      <w:r>
+        <w:t xml:space="preserve">This does not call the</w:t>
+      </w:r>
+      <w:r>
+        <w:t xml:space="preserve"> </w:t>
+      </w:r>
+      <w:r>
+        <w:t xml:space="preserve">amplitude fix into question generally: the much larger effects reported in</w:t>
+      </w:r>
+      <w:r>
+        <w:t xml:space="preserve"> </w:t>
+      </w:r>
+      <w:r>
+        <w:t xml:space="preserve">Section 10.5.3 (RAM CNN alone, +0.087 AUC) and Section 10.5.8 (</w:t>
+      </w:r>
+      <w:r>
+        <w:rPr>
+          <w:rStyle w:val="VerbatimChar"/>
+        </w:rPr>
+        <w:t xml:space="preserve">1d+aux</w:t>
+      </w:r>
+      <w:r>
+        <w:t xml:space="preserve"> </w:t>
+      </w:r>
+      <w:r>
+        <w:t xml:space="preserve">alone, +0.029 AUC) are an order of magnitude larger than the noise band</w:t>
+      </w:r>
+      <w:r>
+        <w:t xml:space="preserve"> </w:t>
+      </w:r>
+      <w:r>
+        <w:t xml:space="preserve">established here (~0.01 AUC) and are far more likely to be genuine, though</w:t>
+      </w:r>
+      <w:r>
+        <w:t xml:space="preserve"> </w:t>
+      </w:r>
+      <w:r>
+        <w:t xml:space="preserve">neither has itself been re-run at additional seeds and both should be</w:t>
+      </w:r>
+      <w:r>
+        <w:t xml:space="preserve"> </w:t>
+      </w:r>
+      <w:r>
+        <w:t xml:space="preserve">treated with appropriately more confidence than this reversed result, not</w:t>
+      </w:r>
+      <w:r>
+        <w:t xml:space="preserve"> </w:t>
+      </w:r>
+      <w:r>
+        <w:t xml:space="preserve">full certainty. What this result specifically corrects is narrower: aux</w:t>
+      </w:r>
+      <w:r>
+        <w:t xml:space="preserve"> </w:t>
+      </w:r>
+      <w:r>
+        <w:t xml:space="preserve">does not reliably help once it is combined with joint linear fusion on an</w:t>
+      </w:r>
+      <w:r>
+        <w:t xml:space="preserve"> </w:t>
+      </w:r>
+      <w:r>
+        <w:t xml:space="preserve">already-strong 2D representation, where Section 10.5.4 already established</w:t>
+      </w:r>
+      <w:r>
+        <w:t xml:space="preserve"> </w:t>
+      </w:r>
+      <w:r>
+        <w:t xml:space="preserve">the 2D branch has little room left for the aux input to add.</w:t>
+      </w:r>
+    </w:p>
+    <w:p>
+      <w:pPr>
+        <w:pStyle w:val="BodyText"/>
+      </w:pPr>
+      <w:r>
+        <w:rPr>
+          <w:b/>
+          <w:bCs/>
+        </w:rPr>
+        <w:t xml:space="preserve">The practical lesson from 10.5.12 is broader than either individual</w:t>
+      </w:r>
+      <w:r>
+        <w:rPr>
+          <w:b/>
+          <w:bCs/>
+        </w:rPr>
+        <w:t xml:space="preserve"> </w:t>
+      </w:r>
+      <w:r>
+        <w:rPr>
+          <w:b/>
+          <w:bCs/>
+        </w:rPr>
+        <w:t xml:space="preserve">correction: none of the close-margin claims elsewhere in Section 10 —</w:t>
+      </w:r>
+      <w:r>
+        <w:rPr>
+          <w:b/>
+          <w:bCs/>
+        </w:rPr>
+        <w:t xml:space="preserve"> </w:t>
+      </w:r>
+      <w:r>
+        <w:rPr>
+          <w:b/>
+          <w:bCs/>
+        </w:rPr>
+        <w:t xml:space="preserve">including the</w:t>
+      </w:r>
+      <w:r>
+        <w:rPr>
+          <w:b/>
+          <w:bCs/>
+        </w:rPr>
+        <w:t xml:space="preserve"> </w:t>
+      </w:r>
+      <w:r>
+        <w:rPr>
+          <w:rStyle w:val="VerbatimChar"/>
+          <w:b/>
+          <w:bCs/>
+        </w:rPr>
+        <w:t xml:space="preserve">1d+aux</w:t>
+      </w:r>
+      <w:r>
+        <w:rPr>
+          <w:b/>
+          <w:bCs/>
+        </w:rPr>
+        <w:t xml:space="preserve"> </w:t>
+      </w:r>
+      <w:r>
+        <w:rPr>
+          <w:b/>
+          <w:bCs/>
+        </w:rPr>
+        <w:t xml:space="preserve">and</w:t>
+      </w:r>
+      <w:r>
+        <w:rPr>
+          <w:b/>
+          <w:bCs/>
+        </w:rPr>
+        <w:t xml:space="preserve"> </w:t>
+      </w:r>
+      <w:r>
+        <w:rPr>
+          <w:rStyle w:val="VerbatimChar"/>
+          <w:b/>
+          <w:bCs/>
+        </w:rPr>
+        <w:t xml:space="preserve">2d+aux</w:t>
+      </w:r>
+      <w:r>
+        <w:rPr>
+          <w:b/>
+          <w:bCs/>
+        </w:rPr>
+        <w:t xml:space="preserve"> </w:t>
+      </w:r>
+      <w:r>
+        <w:rPr>
+          <w:b/>
+          <w:bCs/>
+        </w:rPr>
+        <w:t xml:space="preserve">effects in Sections 10.5.3/10.5.8, and</w:t>
+      </w:r>
+      <w:r>
+        <w:rPr>
+          <w:b/>
+          <w:bCs/>
+        </w:rPr>
+        <w:t xml:space="preserve"> </w:t>
+      </w:r>
+      <w:r>
+        <w:rPr>
+          <w:b/>
+          <w:bCs/>
+        </w:rPr>
+        <w:t xml:space="preserve">the stacking results in Section 10.5.2/10.5.10 — have been checked against</w:t>
+      </w:r>
+      <w:r>
+        <w:rPr>
+          <w:b/>
+          <w:bCs/>
+        </w:rPr>
+        <w:t xml:space="preserve"> </w:t>
+      </w:r>
+      <w:r>
+        <w:rPr>
+          <w:b/>
+          <w:bCs/>
+        </w:rPr>
+        <w:t xml:space="preserve">more than one seed, and this section demonstrates concretely that a</w:t>
+      </w:r>
+      <w:r>
+        <w:rPr>
+          <w:b/>
+          <w:bCs/>
+        </w:rPr>
+        <w:t xml:space="preserve"> </w:t>
+      </w:r>
+      <w:r>
+        <w:rPr>
+          <w:b/>
+          <w:bCs/>
+        </w:rPr>
+        <w:t xml:space="preserve">single-seed result on this dataset can overstate an effect, understate it,</w:t>
+      </w:r>
+      <w:r>
+        <w:rPr>
+          <w:b/>
+          <w:bCs/>
+        </w:rPr>
+        <w:t xml:space="preserve"> </w:t>
+      </w:r>
+      <w:r>
+        <w:rPr>
+          <w:b/>
+          <w:bCs/>
+        </w:rPr>
+        <w:t xml:space="preserve">or report the wrong sign entirely.</w:t>
+      </w:r>
+      <w:r>
+        <w:t xml:space="preserve"> </w:t>
+      </w:r>
+      <w:r>
+        <w:t xml:space="preserve">Only claims with effect sizes well</w:t>
+      </w:r>
+      <w:r>
+        <w:t xml:space="preserve"> </w:t>
+      </w:r>
+      <w:r>
+        <w:t xml:space="preserve">above the ~0.01 AUC / ~0.02 MCC band established here (the amplitude fix on</w:t>
+      </w:r>
+      <w:r>
+        <w:t xml:space="preserve"> </w:t>
+      </w:r>
+      <w:r>
+        <w:t xml:space="preserve">RAM alone, and the standing conclusion that plain</w:t>
+      </w:r>
+      <w:r>
+        <w:t xml:space="preserve"> </w:t>
+      </w:r>
+      <w:r>
+        <w:rPr>
+          <w:rStyle w:val="VerbatimChar"/>
+        </w:rPr>
+        <w:t xml:space="preserve">2d</w:t>
+      </w:r>
+      <w:r>
+        <w:t xml:space="preserve"> </w:t>
+      </w:r>
+      <w:r>
+        <w:t xml:space="preserve">remains the overall</w:t>
+      </w:r>
+      <w:r>
+        <w:t xml:space="preserve"> </w:t>
+      </w:r>
+      <w:r>
+        <w:t xml:space="preserve">best configuration) should be treated as settled without further seeds.</w:t>
+      </w:r>
+    </w:p>
+    <w:p>
+      <w:pPr>
+        <w:pStyle w:val="BodyText"/>
+      </w:pPr>
+      <w:r>
+        <w:rPr>
+          <w:b/>
+          <w:bCs/>
+        </w:rPr>
+        <w:t xml:space="preserve">Considered together with Sections 10.5.1–10.5.12, the single</w:t>
+      </w:r>
+      <w:r>
+        <w:rPr>
+          <w:b/>
+          <w:bCs/>
+        </w:rPr>
+        <w:t xml:space="preserve"> </w:t>
+      </w:r>
+      <w:r>
+        <w:rPr>
+          <w:b/>
+          <w:bCs/>
+        </w:rPr>
+        <w:t xml:space="preserve">best-performing configuration measured in this entire investigation remains</w:t>
+      </w:r>
+      <w:r>
+        <w:rPr>
+          <w:b/>
+          <w:bCs/>
+        </w:rPr>
+        <w:t xml:space="preserve"> </w:t>
+      </w:r>
+      <w:r>
+        <w:rPr>
+          <w:b/>
+          <w:bCs/>
+        </w:rPr>
+        <w:t xml:space="preserve">the plain spectrogram CNN classifier, with no LSTM branch, no auxiliary</w:t>
+      </w:r>
+      <w:r>
+        <w:rPr>
+          <w:b/>
+          <w:bCs/>
+        </w:rPr>
+        <w:t xml:space="preserve"> </w:t>
+      </w:r>
+      <w:r>
+        <w:rPr>
+          <w:b/>
+          <w:bCs/>
+        </w:rPr>
+        <w:t xml:space="preserve">input, and no fusion mechanism (AUC 0.9793).</w:t>
+      </w:r>
+      <w:r>
+        <w:t xml:space="preserve"> </w:t>
+      </w:r>
+      <w:r>
+        <w:t xml:space="preserve">Every structural addition</w:t>
+      </w:r>
+      <w:r>
+        <w:t xml:space="preserve"> </w:t>
+      </w:r>
+      <w:r>
+        <w:t xml:space="preserve">tested — the source paper’s dual-channel architecture, the amplitude</w:t>
+      </w:r>
+      <w:r>
+        <w:t xml:space="preserve"> </w:t>
+      </w:r>
+      <w:r>
+        <w:t xml:space="preserve">auxiliary input, gated fusion, late-fusion stacking, and combinations of</w:t>
+      </w:r>
+      <w:r>
+        <w:t xml:space="preserve"> </w:t>
+      </w:r>
+      <w:r>
+        <w:t xml:space="preserve">these — improved on some other configuration along the way, and each</w:t>
+      </w:r>
+      <w:r>
+        <w:t xml:space="preserve"> </w:t>
+      </w:r>
+      <w:r>
+        <w:t xml:space="preserve">produced a genuine, informative finding about why RAM underperforms and how</w:t>
+      </w:r>
+      <w:r>
+        <w:t xml:space="preserve"> </w:t>
+      </w:r>
+      <w:r>
+        <w:t xml:space="preserve">fusion mechanisms behave, including where those findings needed correcting</w:t>
+      </w:r>
+      <w:r>
+        <w:t xml:space="preserve"> </w:t>
+      </w:r>
+      <w:r>
+        <w:t xml:space="preserve">under repeated measurement (Section 10.5.12). None of them, individually or</w:t>
+      </w:r>
+      <w:r>
+        <w:t xml:space="preserve"> </w:t>
+      </w:r>
+      <w:r>
+        <w:t xml:space="preserve">in combination, has yet exceeded the simplest model in this comparison.</w:t>
       </w:r>
       <w:r>
         <w:t xml:space="preserve"> </w:t>
@@ -17897,43 +19344,110 @@
         </w:numPr>
       </w:pPr>
       <w:r>
-        <w:t xml:space="preserve">Every result in Sections 10.4 and 10.5.5 reflects a single</w:t>
-      </w:r>
-      <w:r>
-        <w:t xml:space="preserve"> </w:t>
-      </w:r>
-      <w:r>
-        <w:t xml:space="preserve">train/validation/test split at one random seed. None of the differences</w:t>
-      </w:r>
-      <w:r>
-        <w:t xml:space="preserve"> </w:t>
-      </w:r>
-      <w:r>
-        <w:t xml:space="preserve">below approximately 1–2 points — including stacked-RAM-dual versus</w:t>
-      </w:r>
-      <w:r>
-        <w:t xml:space="preserve"> </w:t>
-      </w:r>
-      <w:r>
-        <w:t xml:space="preserve">1d-alone, 2d+aux versus the full amplitude-dual model, and gated versus</w:t>
-      </w:r>
-      <w:r>
-        <w:t xml:space="preserve"> </w:t>
-      </w:r>
-      <w:r>
-        <w:t xml:space="preserve">linear fusion on either RAM-dual configuration — should be treated as</w:t>
-      </w:r>
-      <w:r>
-        <w:t xml:space="preserve"> </w:t>
-      </w:r>
-      <w:r>
-        <w:t xml:space="preserve">more than suggestive without repeated measurements across seeds, the same</w:t>
-      </w:r>
-      <w:r>
-        <w:t xml:space="preserve"> </w:t>
-      </w:r>
-      <w:r>
-        <w:t xml:space="preserve">caution already applied to Section 7’s figures in Section 9.</w:t>
+        <w:t xml:space="preserve">Every result in Section 10 reflects a single train/validation/test split</w:t>
+      </w:r>
+      <w:r>
+        <w:t xml:space="preserve"> </w:t>
+      </w:r>
+      <w:r>
+        <w:t xml:space="preserve">at one random seed,</w:t>
+      </w:r>
+      <w:r>
+        <w:t xml:space="preserve"> </w:t>
+      </w:r>
+      <w:r>
+        <w:rPr>
+          <w:b/>
+          <w:bCs/>
+        </w:rPr>
+        <w:t xml:space="preserve">except</w:t>
+      </w:r>
+      <w:r>
+        <w:t xml:space="preserve"> </w:t>
+      </w:r>
+      <w:r>
+        <w:t xml:space="preserve">the two comparisons re-run at three seeds</w:t>
+      </w:r>
+      <w:r>
+        <w:t xml:space="preserve"> </w:t>
+      </w:r>
+      <w:r>
+        <w:t xml:space="preserve">in Section 10.5.12, where repetition changed the reported conclusion for</w:t>
+      </w:r>
+      <w:r>
+        <w:t xml:space="preserve"> </w:t>
+      </w:r>
+      <w:r>
+        <w:t xml:space="preserve">one of them (amplitude aux no longer shown to help the fused linear</w:t>
+      </w:r>
+      <w:r>
+        <w:t xml:space="preserve"> </w:t>
+      </w:r>
+      <w:r>
+        <w:t xml:space="preserve">model) and meaningfully narrowed the other (gated fusion’s AUC edge).</w:t>
+      </w:r>
+      <w:r>
+        <w:t xml:space="preserve"> </w:t>
+      </w:r>
+      <w:r>
+        <w:t xml:space="preserve">Every other close-margin figure in Section 10 — including stacked-RAM-dual</w:t>
+      </w:r>
+      <w:r>
+        <w:t xml:space="preserve"> </w:t>
+      </w:r>
+      <w:r>
+        <w:t xml:space="preserve">versus 1d-alone,</w:t>
+      </w:r>
+      <w:r>
+        <w:t xml:space="preserve"> </w:t>
+      </w:r>
+      <w:r>
+        <w:rPr>
+          <w:rStyle w:val="VerbatimChar"/>
+        </w:rPr>
+        <w:t xml:space="preserve">2d+aux</w:t>
+      </w:r>
+      <w:r>
+        <w:t xml:space="preserve"> </w:t>
+      </w:r>
+      <w:r>
+        <w:t xml:space="preserve">versus the full amplitude-dual model,</w:t>
+      </w:r>
+      <w:r>
+        <w:t xml:space="preserve"> </w:t>
+      </w:r>
+      <w:r>
+        <w:rPr>
+          <w:rStyle w:val="VerbatimChar"/>
+        </w:rPr>
+        <w:t xml:space="preserve">1d+aux</w:t>
+      </w:r>
+      <w:r>
+        <w:t xml:space="preserve">’s</w:t>
+      </w:r>
+      <w:r>
+        <w:t xml:space="preserve"> </w:t>
+      </w:r>
+      <w:r>
+        <w:t xml:space="preserve">effect size (Section 10.5.8), and the stacking results in Sections</w:t>
+      </w:r>
+      <w:r>
+        <w:t xml:space="preserve"> </w:t>
+      </w:r>
+      <w:r>
+        <w:t xml:space="preserve">10.5.2/10.5.10 — remains unverified at additional seeds and should be</w:t>
+      </w:r>
+      <w:r>
+        <w:t xml:space="preserve"> </w:t>
+      </w:r>
+      <w:r>
+        <w:t xml:space="preserve">read with the caution Section 10.5.12 demonstrates is warranted, not</w:t>
+      </w:r>
+      <w:r>
+        <w:t xml:space="preserve"> </w:t>
+      </w:r>
+      <w:r>
+        <w:t xml:space="preserve">assumed settled by a single run.</w:t>
       </w:r>
     </w:p>
     <w:p>
@@ -17951,25 +19465,19 @@
         <w:t xml:space="preserve"> </w:t>
       </w:r>
       <w:r>
-        <w:t xml:space="preserve">model (Section 10.5.7) but has not been combined with stacking</w:t>
-      </w:r>
-      <w:r>
-        <w:t xml:space="preserve"> </w:t>
-      </w:r>
-      <w:r>
-        <w:t xml:space="preserve">(amplitude-augmented branches, frozen, then stacked). This is a natural</w:t>
-      </w:r>
-      <w:r>
-        <w:t xml:space="preserve"> </w:t>
-      </w:r>
-      <w:r>
-        <w:t xml:space="preserve">next experiment and is inexpensive given that the relevant datasets and</w:t>
-      </w:r>
-      <w:r>
-        <w:t xml:space="preserve"> </w:t>
-      </w:r>
-      <w:r>
-        <w:t xml:space="preserve">checkpoints already exist.</w:t>
+        <w:t xml:space="preserve">model (Section 10.5.7) and combined with stacking (Section 10.5.10, a</w:t>
+      </w:r>
+      <w:r>
+        <w:t xml:space="preserve"> </w:t>
+      </w:r>
+      <w:r>
+        <w:t xml:space="preserve">clear win on both datasets) and with gated fusion (Section 10.5.11, a</w:t>
+      </w:r>
+      <w:r>
+        <w:t xml:space="preserve"> </w:t>
+      </w:r>
+      <w:r>
+        <w:t xml:space="preserve">clear loss relative to either intervention alone).</w:t>
       </w:r>
     </w:p>
     <w:p>
@@ -17981,52 +19489,55 @@
         </w:numPr>
       </w:pPr>
       <w:r>
-        <w:t xml:space="preserve">Gated fusion has not been combined with stacking (for example, a gate</w:t>
-      </w:r>
-      <w:r>
-        <w:t xml:space="preserve"> </w:t>
-      </w:r>
-      <w:r>
-        <w:t xml:space="preserve">applied to frozen rather than jointly trained branch features), nor with</w:t>
-      </w:r>
-      <w:r>
-        <w:t xml:space="preserve"> </w:t>
-      </w:r>
-      <w:r>
-        <w:t xml:space="preserve">the amplitude auxiliary input on the spectrogram-dual model specifically</w:t>
-      </w:r>
-      <w:r>
-        <w:t xml:space="preserve"> </w:t>
-      </w:r>
-      <w:r>
-        <w:t xml:space="preserve">(Section 10.5.7 used linear fusion only). Given that gating already</w:t>
-      </w:r>
-      <w:r>
-        <w:t xml:space="preserve"> </w:t>
-      </w:r>
-      <w:r>
-        <w:t xml:space="preserve">matched most of what stacking achieved on spectrogram-dual without aux,</w:t>
-      </w:r>
-      <w:r>
-        <w:t xml:space="preserve"> </w:t>
-      </w:r>
-      <w:r>
-        <w:t xml:space="preserve">whether either combination would move the model past the plain</w:t>
-      </w:r>
-      <w:r>
-        <w:t xml:space="preserve"> </w:t>
-      </w:r>
-      <w:r>
         <w:rPr>
           <w:rStyle w:val="VerbatimChar"/>
         </w:rPr>
-        <w:t xml:space="preserve">2d</w:t>
-      </w:r>
-      <w:r>
-        <w:t xml:space="preserve"> </w:t>
-      </w:r>
-      <w:r>
-        <w:t xml:space="preserve">ceiling (0.9793 AUC) is unresolved.</w:t>
+        <w:t xml:space="preserve">log_snr</w:t>
+      </w:r>
+      <w:r>
+        <w:t xml:space="preserve"> </w:t>
+      </w:r>
+      <w:r>
+        <w:t xml:space="preserve">and</w:t>
+      </w:r>
+      <w:r>
+        <w:t xml:space="preserve"> </w:t>
+      </w:r>
+      <w:r>
+        <w:rPr>
+          <w:rStyle w:val="VerbatimChar"/>
+        </w:rPr>
+        <w:t xml:space="preserve">log_rms</w:t>
+      </w:r>
+      <w:r>
+        <w:t xml:space="preserve"> </w:t>
+      </w:r>
+      <w:r>
+        <w:t xml:space="preserve">are single scalars per window, averaged over</w:t>
+      </w:r>
+      <w:r>
+        <w:t xml:space="preserve"> </w:t>
+      </w:r>
+      <w:r>
+        <w:t xml:space="preserve">Z, N, and E. Per-component auxiliary inputs (six scalars rather than two)</w:t>
+      </w:r>
+      <w:r>
+        <w:t xml:space="preserve"> </w:t>
+      </w:r>
+      <w:r>
+        <w:t xml:space="preserve">were not tested and might retain information the averaging step</w:t>
+      </w:r>
+      <w:r>
+        <w:t xml:space="preserve"> </w:t>
+      </w:r>
+      <w:r>
+        <w:t xml:space="preserve">discards, at the cost of tripling the auxiliary input’s dimensionality</w:t>
+      </w:r>
+      <w:r>
+        <w:t xml:space="preserve"> </w:t>
+      </w:r>
+      <w:r>
+        <w:t xml:space="preserve">relative to what is otherwise an inexpensive correction.</w:t>
       </w:r>
     </w:p>
     <w:p>
@@ -18038,55 +19549,31 @@
         </w:numPr>
       </w:pPr>
       <w:r>
-        <w:rPr>
-          <w:rStyle w:val="VerbatimChar"/>
-        </w:rPr>
-        <w:t xml:space="preserve">log_snr</w:t>
-      </w:r>
-      <w:r>
-        <w:t xml:space="preserve"> </w:t>
-      </w:r>
-      <w:r>
-        <w:t xml:space="preserve">and</w:t>
-      </w:r>
-      <w:r>
-        <w:t xml:space="preserve"> </w:t>
-      </w:r>
-      <w:r>
-        <w:rPr>
-          <w:rStyle w:val="VerbatimChar"/>
-        </w:rPr>
-        <w:t xml:space="preserve">log_rms</w:t>
-      </w:r>
-      <w:r>
-        <w:t xml:space="preserve"> </w:t>
-      </w:r>
-      <w:r>
-        <w:t xml:space="preserve">are single scalars per window, averaged over</w:t>
-      </w:r>
-      <w:r>
-        <w:t xml:space="preserve"> </w:t>
-      </w:r>
-      <w:r>
-        <w:t xml:space="preserve">Z, N, and E. Per-component auxiliary inputs (six scalars rather than two)</w:t>
-      </w:r>
-      <w:r>
-        <w:t xml:space="preserve"> </w:t>
-      </w:r>
-      <w:r>
-        <w:t xml:space="preserve">were not tested and might retain information the averaging step</w:t>
-      </w:r>
-      <w:r>
-        <w:t xml:space="preserve"> </w:t>
-      </w:r>
-      <w:r>
-        <w:t xml:space="preserve">discards, at the cost of tripling the auxiliary input’s dimensionality</w:t>
-      </w:r>
-      <w:r>
-        <w:t xml:space="preserve"> </w:t>
-      </w:r>
-      <w:r>
-        <w:t xml:space="preserve">relative to what is otherwise an inexpensive correction.</w:t>
+        <w:t xml:space="preserve">60 s windows were not re-tested with any of the additions described in</w:t>
+      </w:r>
+      <w:r>
+        <w:t xml:space="preserve"> </w:t>
+      </w:r>
+      <w:r>
+        <w:t xml:space="preserve">this section. The geometric argument in Section 2.3 for why short windows</w:t>
+      </w:r>
+      <w:r>
+        <w:t xml:space="preserve"> </w:t>
+      </w:r>
+      <w:r>
+        <w:t xml:space="preserve">are more difficult applies specifically to the RAM branch, not to the</w:t>
+      </w:r>
+      <w:r>
+        <w:t xml:space="preserve"> </w:t>
+      </w:r>
+      <w:r>
+        <w:t xml:space="preserve">raw-waveform or auxiliary branches, so the balance between branches may</w:t>
+      </w:r>
+      <w:r>
+        <w:t xml:space="preserve"> </w:t>
+      </w:r>
+      <w:r>
+        <w:t xml:space="preserve">shift at longer window lengths.</w:t>
       </w:r>
     </w:p>
     <w:p>
@@ -18098,31 +19585,31 @@
         </w:numPr>
       </w:pPr>
       <w:r>
-        <w:t xml:space="preserve">60 s windows were not re-tested with any of the additions described in</w:t>
-      </w:r>
-      <w:r>
-        <w:t xml:space="preserve"> </w:t>
-      </w:r>
-      <w:r>
-        <w:t xml:space="preserve">this section. The geometric argument in Section 2.3 for why short windows</w:t>
-      </w:r>
-      <w:r>
-        <w:t xml:space="preserve"> </w:t>
-      </w:r>
-      <w:r>
-        <w:t xml:space="preserve">are more difficult applies specifically to the RAM branch, not to the</w:t>
-      </w:r>
-      <w:r>
-        <w:t xml:space="preserve"> </w:t>
-      </w:r>
-      <w:r>
-        <w:t xml:space="preserve">raw-waveform or auxiliary branches, so the balance between branches may</w:t>
-      </w:r>
-      <w:r>
-        <w:t xml:space="preserve"> </w:t>
-      </w:r>
-      <w:r>
-        <w:t xml:space="preserve">shift at longer window lengths.</w:t>
+        <w:t xml:space="preserve">Gated fusion’s mixed result across 2D representations (Section 10.5.5)</w:t>
+      </w:r>
+      <w:r>
+        <w:t xml:space="preserve"> </w:t>
+      </w:r>
+      <w:r>
+        <w:t xml:space="preserve">has not been diagnosed further, though Section 10.5.12 adds one relevant</w:t>
+      </w:r>
+      <w:r>
+        <w:t xml:space="preserve"> </w:t>
+      </w:r>
+      <w:r>
+        <w:t xml:space="preserve">data point: on spectrogram-dual specifically, the effect is real on</w:t>
+      </w:r>
+      <w:r>
+        <w:t xml:space="preserve"> </w:t>
+      </w:r>
+      <w:r>
+        <w:t xml:space="preserve">accuracy/MCC but small and noisy on AUC, which narrows rather than</w:t>
+      </w:r>
+      <w:r>
+        <w:t xml:space="preserve"> </w:t>
+      </w:r>
+      <w:r>
+        <w:t xml:space="preserve">resolves the three explanations originally offered.</w:t>
       </w:r>
     </w:p>
     <w:p>
@@ -18134,30 +19621,6 @@
         </w:numPr>
       </w:pPr>
       <w:r>
-        <w:t xml:space="preserve">Gated fusion’s mixed result (10.5.5) has not been diagnosed further; the</w:t>
-      </w:r>
-      <w:r>
-        <w:t xml:space="preserve"> </w:t>
-      </w:r>
-      <w:r>
-        <w:t xml:space="preserve">three plausible explanations offered are not distinguished by the current</w:t>
-      </w:r>
-      <w:r>
-        <w:t xml:space="preserve"> </w:t>
-      </w:r>
-      <w:r>
-        <w:t xml:space="preserve">evidence and should be treated as open questions rather than findings.</w:t>
-      </w:r>
-    </w:p>
-    <w:p>
-      <w:pPr>
-        <w:pStyle w:val="Compact"/>
-        <w:numPr>
-          <w:ilvl w:val="0"/>
-          <w:numId w:val="1010"/>
-        </w:numPr>
-      </w:pPr>
-      <w:r>
         <w:rPr>
           <w:rStyle w:val="VerbatimChar"/>
         </w:rPr>
@@ -19775,6 +21238,285 @@
           <w:rStyle w:val="NormalTok"/>
         </w:rPr>
         <w:t xml:space="preserve"> trained_model_cnnlstm_classify_2d/best_cnnlstm_classify.pth</w:t>
+      </w:r>
+      <w:r>
+        <w:br/>
+      </w:r>
+      <w:r>
+        <w:br/>
+      </w:r>
+      <w:r>
+        <w:rPr>
+          <w:rStyle w:val="CommentTok"/>
+        </w:rPr>
+        <w:t xml:space="preserve"># Late-fusion stacking on amplitude-augmented checkpoints (Section 10.5.10)</w:t>
+      </w:r>
+      <w:r>
+        <w:br/>
+      </w:r>
+      <w:r>
+        <w:rPr>
+          <w:rStyle w:val="ExtensionTok"/>
+        </w:rPr>
+        <w:t xml:space="preserve">python</w:t>
+      </w:r>
+      <w:r>
+        <w:rPr>
+          <w:rStyle w:val="NormalTok"/>
+        </w:rPr>
+        <w:t xml:space="preserve"> cnn_lstm_stack_aux.py </w:t>
+      </w:r>
+      <w:r>
+        <w:rPr>
+          <w:rStyle w:val="AttributeTok"/>
+        </w:rPr>
+        <w:t xml:space="preserve">--dataset-dir</w:t>
+      </w:r>
+      <w:r>
+        <w:rPr>
+          <w:rStyle w:val="NormalTok"/>
+        </w:rPr>
+        <w:t xml:space="preserve"> ../../data_downloader/dataset_specdualaux_6s </w:t>
+      </w:r>
+      <w:r>
+        <w:rPr>
+          <w:rStyle w:val="DataTypeTok"/>
+        </w:rPr>
+        <w:t xml:space="preserve">\</w:t>
+      </w:r>
+      <w:r>
+        <w:br/>
+      </w:r>
+      <w:r>
+        <w:rPr>
+          <w:rStyle w:val="NormalTok"/>
+        </w:rPr>
+        <w:t xml:space="preserve">    </w:t>
+      </w:r>
+      <w:r>
+        <w:rPr>
+          <w:rStyle w:val="AttributeTok"/>
+        </w:rPr>
+        <w:t xml:space="preserve">--ckpt-1d</w:t>
+      </w:r>
+      <w:r>
+        <w:rPr>
+          <w:rStyle w:val="NormalTok"/>
+        </w:rPr>
+        <w:t xml:space="preserve"> trained_model_cnnlstm_aux_1daux/best_cnnlstm_aux.pth </w:t>
+      </w:r>
+      <w:r>
+        <w:rPr>
+          <w:rStyle w:val="DataTypeTok"/>
+        </w:rPr>
+        <w:t xml:space="preserve">\</w:t>
+      </w:r>
+      <w:r>
+        <w:br/>
+      </w:r>
+      <w:r>
+        <w:rPr>
+          <w:rStyle w:val="NormalTok"/>
+        </w:rPr>
+        <w:t xml:space="preserve">    </w:t>
+      </w:r>
+      <w:r>
+        <w:rPr>
+          <w:rStyle w:val="AttributeTok"/>
+        </w:rPr>
+        <w:t xml:space="preserve">--ckpt-2d</w:t>
+      </w:r>
+      <w:r>
+        <w:rPr>
+          <w:rStyle w:val="NormalTok"/>
+        </w:rPr>
+        <w:t xml:space="preserve"> trained_model_cnnlstm_aux_2daux/best_cnnlstm_aux.pth</w:t>
+      </w:r>
+      <w:r>
+        <w:br/>
+      </w:r>
+      <w:r>
+        <w:br/>
+      </w:r>
+      <w:r>
+        <w:rPr>
+          <w:rStyle w:val="CommentTok"/>
+        </w:rPr>
+        <w:t xml:space="preserve"># Gated fusion + amplitude aux combined (Section 10.5.11)</w:t>
+      </w:r>
+      <w:r>
+        <w:br/>
+      </w:r>
+      <w:r>
+        <w:rPr>
+          <w:rStyle w:val="ExtensionTok"/>
+        </w:rPr>
+        <w:t xml:space="preserve">python</w:t>
+      </w:r>
+      <w:r>
+        <w:rPr>
+          <w:rStyle w:val="NormalTok"/>
+        </w:rPr>
+        <w:t xml:space="preserve"> cnn_lstm_classify_aux.py </w:t>
+      </w:r>
+      <w:r>
+        <w:rPr>
+          <w:rStyle w:val="AttributeTok"/>
+        </w:rPr>
+        <w:t xml:space="preserve">--dataset-dir</w:t>
+      </w:r>
+      <w:r>
+        <w:rPr>
+          <w:rStyle w:val="NormalTok"/>
+        </w:rPr>
+        <w:t xml:space="preserve"> ../../data_downloader/dataset_specdualaux_6s </w:t>
+      </w:r>
+      <w:r>
+        <w:rPr>
+          <w:rStyle w:val="DataTypeTok"/>
+        </w:rPr>
+        <w:t xml:space="preserve">\</w:t>
+      </w:r>
+      <w:r>
+        <w:br/>
+      </w:r>
+      <w:r>
+        <w:rPr>
+          <w:rStyle w:val="NormalTok"/>
+        </w:rPr>
+        <w:t xml:space="preserve">    </w:t>
+      </w:r>
+      <w:r>
+        <w:rPr>
+          <w:rStyle w:val="AttributeTok"/>
+        </w:rPr>
+        <w:t xml:space="preserve">--channels</w:t>
+      </w:r>
+      <w:r>
+        <w:rPr>
+          <w:rStyle w:val="NormalTok"/>
+        </w:rPr>
+        <w:t xml:space="preserve"> all </w:t>
+      </w:r>
+      <w:r>
+        <w:rPr>
+          <w:rStyle w:val="AttributeTok"/>
+        </w:rPr>
+        <w:t xml:space="preserve">--fusion</w:t>
+      </w:r>
+      <w:r>
+        <w:rPr>
+          <w:rStyle w:val="NormalTok"/>
+        </w:rPr>
+        <w:t xml:space="preserve"> gate </w:t>
+      </w:r>
+      <w:r>
+        <w:rPr>
+          <w:rStyle w:val="AttributeTok"/>
+        </w:rPr>
+        <w:t xml:space="preserve">--batch-size</w:t>
+      </w:r>
+      <w:r>
+        <w:rPr>
+          <w:rStyle w:val="NormalTok"/>
+        </w:rPr>
+        <w:t xml:space="preserve"> 32</w:t>
+      </w:r>
+      <w:r>
+        <w:br/>
+      </w:r>
+      <w:r>
+        <w:br/>
+      </w:r>
+      <w:r>
+        <w:rPr>
+          <w:rStyle w:val="CommentTok"/>
+        </w:rPr>
+        <w:t xml:space="preserve"># Seed-repeated verification (Section 10.5.12) -- rerun any of the above with --seed 1 / --seed 2</w:t>
+      </w:r>
+      <w:r>
+        <w:br/>
+      </w:r>
+      <w:r>
+        <w:rPr>
+          <w:rStyle w:val="ExtensionTok"/>
+        </w:rPr>
+        <w:t xml:space="preserve">python</w:t>
+      </w:r>
+      <w:r>
+        <w:rPr>
+          <w:rStyle w:val="NormalTok"/>
+        </w:rPr>
+        <w:t xml:space="preserve"> cnn_lstm_classify.py </w:t>
+      </w:r>
+      <w:r>
+        <w:rPr>
+          <w:rStyle w:val="AttributeTok"/>
+        </w:rPr>
+        <w:t xml:space="preserve">--dataset-dir</w:t>
+      </w:r>
+      <w:r>
+        <w:rPr>
+          <w:rStyle w:val="NormalTok"/>
+        </w:rPr>
+        <w:t xml:space="preserve"> ../../data_downloader/dataset_specdual_6s </w:t>
+      </w:r>
+      <w:r>
+        <w:rPr>
+          <w:rStyle w:val="DataTypeTok"/>
+        </w:rPr>
+        <w:t xml:space="preserve">\</w:t>
+      </w:r>
+      <w:r>
+        <w:br/>
+      </w:r>
+      <w:r>
+        <w:rPr>
+          <w:rStyle w:val="NormalTok"/>
+        </w:rPr>
+        <w:t xml:space="preserve">    </w:t>
+      </w:r>
+      <w:r>
+        <w:rPr>
+          <w:rStyle w:val="AttributeTok"/>
+        </w:rPr>
+        <w:t xml:space="preserve">--channels</w:t>
+      </w:r>
+      <w:r>
+        <w:rPr>
+          <w:rStyle w:val="NormalTok"/>
+        </w:rPr>
+        <w:t xml:space="preserve"> all </w:t>
+      </w:r>
+      <w:r>
+        <w:rPr>
+          <w:rStyle w:val="AttributeTok"/>
+        </w:rPr>
+        <w:t xml:space="preserve">--seed</w:t>
+      </w:r>
+      <w:r>
+        <w:rPr>
+          <w:rStyle w:val="NormalTok"/>
+        </w:rPr>
+        <w:t xml:space="preserve"> 1 </w:t>
+      </w:r>
+      <w:r>
+        <w:rPr>
+          <w:rStyle w:val="AttributeTok"/>
+        </w:rPr>
+        <w:t xml:space="preserve">--batch-size</w:t>
+      </w:r>
+      <w:r>
+        <w:rPr>
+          <w:rStyle w:val="NormalTok"/>
+        </w:rPr>
+        <w:t xml:space="preserve"> 32               </w:t>
+      </w:r>
+      <w:r>
+        <w:rPr>
+          <w:rStyle w:val="CommentTok"/>
+        </w:rPr>
+        <w:t xml:space="preserve"># repeat for --fusion gate, and --seed 2</w:t>
       </w:r>
     </w:p>
     <w:bookmarkEnd w:id="43"/>

</xml_diff>

<commit_message>
Close out the dual-channel investigation (10.7): status and next steps
Adds a closing status section summarizing what Section 10 established,
what was implemented but left unevaluated (per-component aux, 60s
windows), and points explicitly to the existing but never-run
catalog-forecasting code (catalog.py, DualChannelRiskNet in
cnn_lstm_loeo.py) as the next phase -- the project's original scope of
forecasting event onset time and class from catalog data.
</commit_message>
<xml_diff>
--- a/report.docx
+++ b/report.docx
@@ -28,7 +28,7 @@
         </w:p>
       </w:sdtContent>
     </w:sdt>
-    <w:bookmarkStart w:id="45" w:name="Xe2c26e12d4c614db72ff898802f1fb5ece233e3"/>
+    <w:bookmarkStart w:id="46" w:name="Xe2c26e12d4c614db72ff898802f1fb5ece233e3"/>
     <w:p>
       <w:pPr>
         <w:pStyle w:val="Heading1"/>
@@ -10346,7 +10346,7 @@
       </w:r>
     </w:p>
     <w:bookmarkEnd w:id="35"/>
-    <w:bookmarkStart w:id="42" w:name="Xfd93c1ce4657f0867d8394b845d9fba0753fafe"/>
+    <w:bookmarkStart w:id="43" w:name="Xfd93c1ce4657f0867d8394b845d9fba0753fafe"/>
     <w:p>
       <w:pPr>
         <w:pStyle w:val="Heading2"/>
@@ -19519,25 +19519,40 @@
         <w:t xml:space="preserve"> </w:t>
       </w:r>
       <w:r>
-        <w:t xml:space="preserve">Z, N, and E. Per-component auxiliary inputs (six scalars rather than two)</w:t>
-      </w:r>
-      <w:r>
-        <w:t xml:space="preserve"> </w:t>
-      </w:r>
-      <w:r>
-        <w:t xml:space="preserve">were not tested and might retain information the averaging step</w:t>
-      </w:r>
-      <w:r>
-        <w:t xml:space="preserve"> </w:t>
-      </w:r>
-      <w:r>
-        <w:t xml:space="preserve">discards, at the cost of tripling the auxiliary input’s dimensionality</w:t>
-      </w:r>
-      <w:r>
-        <w:t xml:space="preserve"> </w:t>
-      </w:r>
-      <w:r>
-        <w:t xml:space="preserve">relative to what is otherwise an inexpensive correction.</w:t>
+        <w:t xml:space="preserve">Z, N, and E. A per-component variant (six scalars rather than two,</w:t>
+      </w:r>
+      <w:r>
+        <w:t xml:space="preserve"> </w:t>
+      </w:r>
+      <w:r>
+        <w:rPr>
+          <w:rStyle w:val="VerbatimChar"/>
+        </w:rPr>
+        <w:t xml:space="preserve">--per-component-aux</w:t>
+      </w:r>
+      <w:r>
+        <w:t xml:space="preserve"> </w:t>
+      </w:r>
+      <w:r>
+        <w:t xml:space="preserve">in</w:t>
+      </w:r>
+      <w:r>
+        <w:t xml:space="preserve"> </w:t>
+      </w:r>
+      <w:r>
+        <w:rPr>
+          <w:rStyle w:val="VerbatimChar"/>
+        </w:rPr>
+        <w:t xml:space="preserve">data_downloader</w:t>
+      </w:r>
+      <w:r>
+        <w:t xml:space="preserve">) has been implemented and</w:t>
+      </w:r>
+      <w:r>
+        <w:t xml:space="preserve"> </w:t>
+      </w:r>
+      <w:r>
+        <w:t xml:space="preserve">smoke-tested but not evaluated — see Section 10.7.</w:t>
       </w:r>
     </w:p>
     <w:p>
@@ -19657,6 +19672,528 @@
         <w:t xml:space="preserve">representation rather than architecture search on either existing branch.</w:t>
       </w:r>
     </w:p>
+    <w:bookmarkEnd w:id="41"/>
+    <w:bookmarkStart w:id="42" w:name="investigation-status-and-next-steps"/>
+    <w:p>
+      <w:pPr>
+        <w:pStyle w:val="Heading3"/>
+      </w:pPr>
+      <w:r>
+        <w:t xml:space="preserve">10.7 Investigation Status and Next Steps</w:t>
+      </w:r>
+    </w:p>
+    <w:p>
+      <w:pPr>
+        <w:pStyle w:val="FirstParagraph"/>
+      </w:pPr>
+      <w:r>
+        <w:t xml:space="preserve">This closes the dual-channel waveform-classification investigation (Section</w:t>
+      </w:r>
+      <w:r>
+        <w:t xml:space="preserve"> </w:t>
+      </w:r>
+      <w:r>
+        <w:t xml:space="preserve">10) as an active line of work. It is not concluded because a dead end was</w:t>
+      </w:r>
+      <w:r>
+        <w:t xml:space="preserve"> </w:t>
+      </w:r>
+      <w:r>
+        <w:t xml:space="preserve">reached; it is being set aside deliberately because it was itself an</w:t>
+      </w:r>
+      <w:r>
+        <w:t xml:space="preserve"> </w:t>
+      </w:r>
+      <w:r>
+        <w:t xml:space="preserve">extension of the project’s original scope, and continuing to refine it</w:t>
+      </w:r>
+      <w:r>
+        <w:t xml:space="preserve"> </w:t>
+      </w:r>
+      <w:r>
+        <w:t xml:space="preserve">further would be digging the same hole deeper rather than returning to that</w:t>
+      </w:r>
+      <w:r>
+        <w:t xml:space="preserve"> </w:t>
+      </w:r>
+      <w:r>
+        <w:t xml:space="preserve">scope.</w:t>
+      </w:r>
+    </w:p>
+    <w:p>
+      <w:pPr>
+        <w:pStyle w:val="BodyText"/>
+      </w:pPr>
+      <w:r>
+        <w:rPr>
+          <w:b/>
+          <w:bCs/>
+        </w:rPr>
+        <w:t xml:space="preserve">What this phase established.</w:t>
+      </w:r>
+      <w:r>
+        <w:t xml:space="preserve"> </w:t>
+      </w:r>
+      <w:r>
+        <w:t xml:space="preserve">Across all configurations tested,</w:t>
+      </w:r>
+      <w:r>
+        <w:t xml:space="preserve"> </w:t>
+      </w:r>
+      <w:r>
+        <w:rPr>
+          <w:rStyle w:val="VerbatimChar"/>
+        </w:rPr>
+        <w:t xml:space="preserve">2d</w:t>
+      </w:r>
+      <w:r>
+        <w:t xml:space="preserve">-alone with no auxiliary input remains the single best-performing</w:t>
+      </w:r>
+      <w:r>
+        <w:t xml:space="preserve"> </w:t>
+      </w:r>
+      <w:r>
+        <w:t xml:space="preserve">configuration in the entire investigation (test AUC 0.9793, Section 7.2).</w:t>
+      </w:r>
+      <w:r>
+        <w:t xml:space="preserve"> </w:t>
+      </w:r>
+      <w:r>
+        <w:t xml:space="preserve">Relative to that ceiling: gated fusion gives a real but small and noisy AUC</w:t>
+      </w:r>
+      <w:r>
+        <w:t xml:space="preserve"> </w:t>
+      </w:r>
+      <w:r>
+        <w:t xml:space="preserve">edge over linear fusion, alongside a more robust, low-variance win on</w:t>
+      </w:r>
+      <w:r>
+        <w:t xml:space="preserve"> </w:t>
+      </w:r>
+      <w:r>
+        <w:t xml:space="preserve">accuracy and MCC (Section 10.5.12); the amplitude-scalar correction produces</w:t>
+      </w:r>
+      <w:r>
+        <w:t xml:space="preserve"> </w:t>
+      </w:r>
+      <w:r>
+        <w:t xml:space="preserve">a large, seed-independent improvement on the RAM-only and RAM-dual models</w:t>
+      </w:r>
+      <w:r>
+        <w:t xml:space="preserve"> </w:t>
+      </w:r>
+      <w:r>
+        <w:t xml:space="preserve">(Sections 8.2, 10.5.3, 10.5.8) but a much smaller, seed-fragile one on the</w:t>
+      </w:r>
+      <w:r>
+        <w:t xml:space="preserve"> </w:t>
+      </w:r>
+      <w:r>
+        <w:t xml:space="preserve">spectrogram-dual model (Section 10.5.12); late-fusion stacking of frozen</w:t>
+      </w:r>
+      <w:r>
+        <w:t xml:space="preserve"> </w:t>
+      </w:r>
+      <w:r>
+        <w:t xml:space="preserve">aux-augmented branches beats both linear and gated joint fusion on both</w:t>
+      </w:r>
+      <w:r>
+        <w:t xml:space="preserve"> </w:t>
+      </w:r>
+      <w:r>
+        <w:t xml:space="preserve">datasets (Section 10.5.10); and gated fusion combined with amplitude aux</w:t>
+      </w:r>
+      <w:r>
+        <w:t xml:space="preserve"> </w:t>
+      </w:r>
+      <w:r>
+        <w:t xml:space="preserve">performs worse than either intervention alone — an explicit case of two</w:t>
+      </w:r>
+      <w:r>
+        <w:t xml:space="preserve"> </w:t>
+      </w:r>
+      <w:r>
+        <w:t xml:space="preserve">independently-validated improvements failing to compose (Section 10.5.11).</w:t>
+      </w:r>
+      <w:r>
+        <w:t xml:space="preserve"> </w:t>
+      </w:r>
+      <w:r>
+        <w:t xml:space="preserve">Section 10.5.12’s seed-repeat check is the standing methodological caution</w:t>
+      </w:r>
+      <w:r>
+        <w:t xml:space="preserve"> </w:t>
+      </w:r>
+      <w:r>
+        <w:t xml:space="preserve">for the whole section: single-seed margins under roughly 0.01–0.02 AUC have</w:t>
+      </w:r>
+      <w:r>
+        <w:t xml:space="preserve"> </w:t>
+      </w:r>
+      <w:r>
+        <w:t xml:space="preserve">been shown concretely, on this dataset, to overstate an effect, understate</w:t>
+      </w:r>
+      <w:r>
+        <w:t xml:space="preserve"> </w:t>
+      </w:r>
+      <w:r>
+        <w:t xml:space="preserve">it, or report the wrong sign.</w:t>
+      </w:r>
+    </w:p>
+    <w:p>
+      <w:pPr>
+        <w:pStyle w:val="BodyText"/>
+      </w:pPr>
+      <w:r>
+        <w:rPr>
+          <w:b/>
+          <w:bCs/>
+        </w:rPr>
+        <w:t xml:space="preserve">What was started but not finished.</w:t>
+      </w:r>
+      <w:r>
+        <w:t xml:space="preserve"> </w:t>
+      </w:r>
+      <w:r>
+        <w:t xml:space="preserve">Per-component auxiliary scalars</w:t>
+      </w:r>
+      <w:r>
+        <w:t xml:space="preserve"> </w:t>
+      </w:r>
+      <w:r>
+        <w:t xml:space="preserve">(</w:t>
+      </w:r>
+      <w:r>
+        <w:rPr>
+          <w:rStyle w:val="VerbatimChar"/>
+        </w:rPr>
+        <w:t xml:space="preserve">--per-component-aux</w:t>
+      </w:r>
+      <w:r>
+        <w:t xml:space="preserve">, adding</w:t>
+      </w:r>
+      <w:r>
+        <w:t xml:space="preserve"> </w:t>
+      </w:r>
+      <w:r>
+        <w:rPr>
+          <w:rStyle w:val="VerbatimChar"/>
+        </w:rPr>
+        <w:t xml:space="preserve">RamAuxEncoderV2</w:t>
+      </w:r>
+      <w:r>
+        <w:t xml:space="preserve">,</w:t>
+      </w:r>
+      <w:r>
+        <w:t xml:space="preserve"> </w:t>
+      </w:r>
+      <w:r>
+        <w:rPr>
+          <w:rStyle w:val="VerbatimChar"/>
+        </w:rPr>
+        <w:t xml:space="preserve">RamDualAuxEncoderV2</w:t>
+      </w:r>
+      <w:r>
+        <w:t xml:space="preserve">, and</w:t>
+      </w:r>
+      <w:r>
+        <w:t xml:space="preserve"> </w:t>
+      </w:r>
+      <w:r>
+        <w:rPr>
+          <w:rStyle w:val="VerbatimChar"/>
+        </w:rPr>
+        <w:t xml:space="preserve">SpectrogramDualAuxEncoderV2</w:t>
+      </w:r>
+      <w:r>
+        <w:t xml:space="preserve"> </w:t>
+      </w:r>
+      <w:r>
+        <w:t xml:space="preserve">to</w:t>
+      </w:r>
+      <w:r>
+        <w:t xml:space="preserve"> </w:t>
+      </w:r>
+      <w:r>
+        <w:rPr>
+          <w:rStyle w:val="VerbatimChar"/>
+        </w:rPr>
+        <w:t xml:space="preserve">data_downloader/seismic_cli</w:t>
+      </w:r>
+      <w:r>
+        <w:t xml:space="preserve">, commit</w:t>
+      </w:r>
+      <w:r>
+        <w:t xml:space="preserve"> </w:t>
+      </w:r>
+      <w:r>
+        <w:rPr>
+          <w:rStyle w:val="VerbatimChar"/>
+        </w:rPr>
+        <w:t xml:space="preserve">8485ffc</w:t>
+      </w:r>
+      <w:r>
+        <w:t xml:space="preserve">) are implemented, produce the expected</w:t>
+      </w:r>
+      <w:r>
+        <w:t xml:space="preserve"> </w:t>
+      </w:r>
+      <w:r>
+        <w:rPr>
+          <w:rStyle w:val="VerbatimChar"/>
+        </w:rPr>
+        <w:t xml:space="preserve">(6,)</w:t>
+      </w:r>
+      <w:r>
+        <w:t xml:space="preserve">-shaped tensor, and</w:t>
+      </w:r>
+      <w:r>
+        <w:t xml:space="preserve"> </w:t>
+      </w:r>
+      <w:r>
+        <w:t xml:space="preserve">required no model-side changes since</w:t>
+      </w:r>
+      <w:r>
+        <w:t xml:space="preserve"> </w:t>
+      </w:r>
+      <w:r>
+        <w:rPr>
+          <w:rStyle w:val="VerbatimChar"/>
+        </w:rPr>
+        <w:t xml:space="preserve">aux_dim</w:t>
+      </w:r>
+      <w:r>
+        <w:t xml:space="preserve"> </w:t>
+      </w:r>
+      <w:r>
+        <w:t xml:space="preserve">is read from the tensor shape</w:t>
+      </w:r>
+      <w:r>
+        <w:t xml:space="preserve"> </w:t>
+      </w:r>
+      <w:r>
+        <w:t xml:space="preserve">at load time. No dataset was regenerated at full scale and no model was</w:t>
+      </w:r>
+      <w:r>
+        <w:t xml:space="preserve"> </w:t>
+      </w:r>
+      <w:r>
+        <w:t xml:space="preserve">retrained against it — this is left as unevaluated, not abandoned. 60 s</w:t>
+      </w:r>
+      <w:r>
+        <w:t xml:space="preserve"> </w:t>
+      </w:r>
+      <w:r>
+        <w:t xml:space="preserve">windows with the LSTM+attention branch (Section 10.6) were never started.</w:t>
+      </w:r>
+      <w:r>
+        <w:t xml:space="preserve"> </w:t>
+      </w:r>
+      <w:r>
+        <w:t xml:space="preserve">Neither should be treated as a loose end requiring closure; either could be</w:t>
+      </w:r>
+      <w:r>
+        <w:t xml:space="preserve"> </w:t>
+      </w:r>
+      <w:r>
+        <w:t xml:space="preserve">picked back up later if the amplitude-correction or window-length questions</w:t>
+      </w:r>
+      <w:r>
+        <w:t xml:space="preserve"> </w:t>
+      </w:r>
+      <w:r>
+        <w:t xml:space="preserve">become relevant again.</w:t>
+      </w:r>
+    </w:p>
+    <w:p>
+      <w:pPr>
+        <w:pStyle w:val="BodyText"/>
+      </w:pPr>
+      <w:r>
+        <w:rPr>
+          <w:b/>
+          <w:bCs/>
+        </w:rPr>
+        <w:t xml:space="preserve">Where the project goes next.</w:t>
+      </w:r>
+      <w:r>
+        <w:t xml:space="preserve"> </w:t>
+      </w:r>
+      <w:r>
+        <w:t xml:space="preserve">The original objective was forecasting</w:t>
+      </w:r>
+      <w:r>
+        <w:t xml:space="preserve"> </w:t>
+      </w:r>
+      <w:r>
+        <w:t xml:space="preserve">event onset time and event class from earthquake catalog data — not</w:t>
+      </w:r>
+      <w:r>
+        <w:t xml:space="preserve"> </w:t>
+      </w:r>
+      <w:r>
+        <w:t xml:space="preserve">waveform classification. That work already has a dormant implementation</w:t>
+      </w:r>
+      <w:r>
+        <w:t xml:space="preserve"> </w:t>
+      </w:r>
+      <w:r>
+        <w:t xml:space="preserve">that predates this section and has never been run or reported on:</w:t>
+      </w:r>
+      <w:r>
+        <w:t xml:space="preserve"> </w:t>
+      </w:r>
+      <w:r>
+        <w:rPr>
+          <w:rStyle w:val="VerbatimChar"/>
+        </w:rPr>
+        <w:t xml:space="preserve">data_downloader/seismic_cli/catalog.py</w:t>
+      </w:r>
+      <w:r>
+        <w:t xml:space="preserve"> </w:t>
+      </w:r>
+      <w:r>
+        <w:t xml:space="preserve">builds chronologically-split,</w:t>
+      </w:r>
+      <w:r>
+        <w:t xml:space="preserve"> </w:t>
+      </w:r>
+      <w:r>
+        <w:t xml:space="preserve">embargoed sliding-window datasets from a catalog (feature channels in</w:t>
+      </w:r>
+      <w:r>
+        <w:t xml:space="preserve"> </w:t>
+      </w:r>
+      <w:r>
+        <w:rPr>
+          <w:rStyle w:val="VerbatimChar"/>
+        </w:rPr>
+        <w:t xml:space="preserve">SEQ_FEATURES</w:t>
+      </w:r>
+      <w:r>
+        <w:t xml:space="preserve">/</w:t>
+      </w:r>
+      <w:r>
+        <w:rPr>
+          <w:rStyle w:val="VerbatimChar"/>
+        </w:rPr>
+        <w:t xml:space="preserve">IMAGE_FEATURES</w:t>
+      </w:r>
+      <w:r>
+        <w:t xml:space="preserve">/</w:t>
+      </w:r>
+      <w:r>
+        <w:rPr>
+          <w:rStyle w:val="VerbatimChar"/>
+        </w:rPr>
+        <w:t xml:space="preserve">AUX_FEATURES</w:t>
+      </w:r>
+      <w:r>
+        <w:t xml:space="preserve">, three-class time-to-next-event</w:t>
+      </w:r>
+      <w:r>
+        <w:t xml:space="preserve"> </w:t>
+      </w:r>
+      <w:r>
+        <w:t xml:space="preserve">labels in</w:t>
+      </w:r>
+      <w:r>
+        <w:t xml:space="preserve"> </w:t>
+      </w:r>
+      <w:r>
+        <w:rPr>
+          <w:rStyle w:val="VerbatimChar"/>
+        </w:rPr>
+        <w:t xml:space="preserve">RISK_CLASSES = [lt_1y, 1_5y, gt_5y]</w:t>
+      </w:r>
+      <w:r>
+        <w:t xml:space="preserve">), reachable via the</w:t>
+      </w:r>
+      <w:r>
+        <w:t xml:space="preserve"> </w:t>
+      </w:r>
+      <w:r>
+        <w:rPr>
+          <w:rStyle w:val="VerbatimChar"/>
+        </w:rPr>
+        <w:t xml:space="preserve">generate-catalog-dataset</w:t>
+      </w:r>
+      <w:r>
+        <w:t xml:space="preserve"> </w:t>
+      </w:r>
+      <w:r>
+        <w:t xml:space="preserve">CLI command;</w:t>
+      </w:r>
+      <w:r>
+        <w:t xml:space="preserve"> </w:t>
+      </w:r>
+      <w:r>
+        <w:rPr>
+          <w:rStyle w:val="VerbatimChar"/>
+        </w:rPr>
+        <w:t xml:space="preserve">cnn_earthquake/src/cnn_lstm_loeo.py</w:t>
+      </w:r>
+      <w:r>
+        <w:t xml:space="preserve"> </w:t>
+      </w:r>
+      <w:r>
+        <w:t xml:space="preserve">implements</w:t>
+      </w:r>
+      <w:r>
+        <w:t xml:space="preserve"> </w:t>
+      </w:r>
+      <w:r>
+        <w:rPr>
+          <w:rStyle w:val="VerbatimChar"/>
+        </w:rPr>
+        <w:t xml:space="preserve">DualChannelRiskNet</w:t>
+      </w:r>
+      <w:r>
+        <w:t xml:space="preserve">, the corresponding model. Both were built</w:t>
+      </w:r>
+      <w:r>
+        <w:t xml:space="preserve"> </w:t>
+      </w:r>
+      <w:r>
+        <w:t xml:space="preserve">using the same dual-channel {seq, img, aux} pattern documented in Section</w:t>
+      </w:r>
+      <w:r>
+        <w:t xml:space="preserve"> </w:t>
+      </w:r>
+      <w:r>
+        <w:t xml:space="preserve">10.2–10.3, so the architecture work in this section is not wasted even</w:t>
+      </w:r>
+      <w:r>
+        <w:t xml:space="preserve"> </w:t>
+      </w:r>
+      <w:r>
+        <w:t xml:space="preserve">though its focus was elsewhere — but neither the dataset generation nor the</w:t>
+      </w:r>
+      <w:r>
+        <w:t xml:space="preserve"> </w:t>
+      </w:r>
+      <w:r>
+        <w:t xml:space="preserve">model has been exercised end-to-end, so the next phase starts from</w:t>
+      </w:r>
+      <w:r>
+        <w:t xml:space="preserve"> </w:t>
+      </w:r>
+      <w:r>
+        <w:t xml:space="preserve">“does this run at all and what does a first result look like,”</w:t>
+      </w:r>
+      <w:r>
+        <w:t xml:space="preserve"> </w:t>
+      </w:r>
+      <w:r>
+        <w:t xml:space="preserve">not from a</w:t>
+      </w:r>
+      <w:r>
+        <w:t xml:space="preserve"> </w:t>
+      </w:r>
+      <w:r>
+        <w:t xml:space="preserve">refinement question.</w:t>
+      </w:r>
+    </w:p>
     <w:p>
       <w:r>
         <w:pict>
@@ -19664,9 +20201,9 @@
         </w:pict>
       </w:r>
     </w:p>
-    <w:bookmarkEnd w:id="41"/>
     <w:bookmarkEnd w:id="42"/>
-    <w:bookmarkStart w:id="43" w:name="X49a4b53c06c50200584148b08dcaa79ca63e991"/>
+    <w:bookmarkEnd w:id="43"/>
+    <w:bookmarkStart w:id="44" w:name="X49a4b53c06c50200584148b08dcaa79ca63e991"/>
     <w:p>
       <w:pPr>
         <w:pStyle w:val="Heading2"/>
@@ -21519,8 +22056,8 @@
         <w:t xml:space="preserve"># repeat for --fusion gate, and --seed 2</w:t>
       </w:r>
     </w:p>
-    <w:bookmarkEnd w:id="43"/>
-    <w:bookmarkStart w:id="44" w:name="X1355b32d8fddb10b2853f723c19e7c74b70e883"/>
+    <w:bookmarkEnd w:id="44"/>
+    <w:bookmarkStart w:id="45" w:name="X1355b32d8fddb10b2853f723c19e7c74b70e883"/>
     <w:p>
       <w:pPr>
         <w:pStyle w:val="Heading2"/>
@@ -21995,8 +22532,8 @@
         <w:t xml:space="preserve">.</w:t>
       </w:r>
     </w:p>
-    <w:bookmarkEnd w:id="44"/>
     <w:bookmarkEnd w:id="45"/>
+    <w:bookmarkEnd w:id="46"/>
     <w:sectPr>
       <w:footnotePr>
         <w:numRestart w:val="eachSect"/>

</xml_diff>